<commit_message>
feat: initialize project layout, responsive dock navbar, and profile data configuration
</commit_message>
<xml_diff>
--- a/public/aviResume.docx
+++ b/public/aviResume.docx
@@ -1,8 +1,8 @@
 
 <file path=word/document.xml><?xml version="1.0" encoding="utf-8"?>
-<w:document xmlns:wp14="http://schemas.microsoft.com/office/word/2010/wordprocessingDrawing" xmlns:mc="http://schemas.openxmlformats.org/markup-compatibility/2006" xmlns:ve="http://schemas.openxmlformats.org/markup-compatibility/2006" xmlns:o="urn:schemas-microsoft-com:office:office" xmlns:r="http://schemas.openxmlformats.org/officeDocument/2006/relationships" xmlns:m="http://schemas.openxmlformats.org/officeDocument/2006/math" xmlns:v="urn:schemas-microsoft-com:vml" xmlns:wp="http://schemas.openxmlformats.org/drawingml/2006/wordprocessingDrawing" xmlns:w10="urn:schemas-microsoft-com:office:word" xmlns:w="http://schemas.openxmlformats.org/wordprocessingml/2006/main" xmlns:wne="http://schemas.microsoft.com/office/word/2006/wordml" xmlns:a="http://schemas.openxmlformats.org/drawingml/2006/main" xmlns:pic="http://schemas.openxmlformats.org/drawingml/2006/picture" xmlns:wpg="http://schemas.microsoft.com/office/word/2010/wordprocessingGroup" xmlns:wps="http://schemas.microsoft.com/office/word/2010/wordprocessingShape" xmlns:w14="http://schemas.microsoft.com/office/word/2010/wordml" mc:Ignorable="w14 wp14" xml:space="preserve">
+<w:document xmlns:wpc="http://schemas.microsoft.com/office/word/2010/wordprocessingCanvas" xmlns:cx="http://schemas.microsoft.com/office/drawing/2014/chartex" xmlns:cx1="http://schemas.microsoft.com/office/drawing/2015/9/8/chartex" xmlns:cx2="http://schemas.microsoft.com/office/drawing/2015/10/21/chartex" xmlns:cx3="http://schemas.microsoft.com/office/drawing/2016/5/9/chartex" xmlns:cx4="http://schemas.microsoft.com/office/drawing/2016/5/10/chartex" xmlns:cx5="http://schemas.microsoft.com/office/drawing/2016/5/11/chartex" xmlns:cx6="http://schemas.microsoft.com/office/drawing/2016/5/12/chartex" xmlns:cx7="http://schemas.microsoft.com/office/drawing/2016/5/13/chartex" xmlns:cx8="http://schemas.microsoft.com/office/drawing/2016/5/14/chartex" xmlns:mc="http://schemas.openxmlformats.org/markup-compatibility/2006" xmlns:aink="http://schemas.microsoft.com/office/drawing/2016/ink" xmlns:am3d="http://schemas.microsoft.com/office/drawing/2017/model3d" xmlns:o="urn:schemas-microsoft-com:office:office" xmlns:oel="http://schemas.microsoft.com/office/2019/extlst" xmlns:r="http://schemas.openxmlformats.org/officeDocument/2006/relationships" xmlns:m="http://schemas.openxmlformats.org/officeDocument/2006/math" xmlns:v="urn:schemas-microsoft-com:vml" xmlns:wp14="http://schemas.microsoft.com/office/word/2010/wordprocessingDrawing" xmlns:wp="http://schemas.openxmlformats.org/drawingml/2006/wordprocessingDrawing" xmlns:w10="urn:schemas-microsoft-com:office:word" xmlns:w="http://schemas.openxmlformats.org/wordprocessingml/2006/main" xmlns:w14="http://schemas.microsoft.com/office/word/2010/wordml" xmlns:w15="http://schemas.microsoft.com/office/word/2012/wordml" xmlns:w16cex="http://schemas.microsoft.com/office/word/2018/wordml/cex" xmlns:w16cid="http://schemas.microsoft.com/office/word/2016/wordml/cid" xmlns:w16="http://schemas.microsoft.com/office/word/2018/wordml" xmlns:w16du="http://schemas.microsoft.com/office/word/2023/wordml/word16du" xmlns:w16sdtdh="http://schemas.microsoft.com/office/word/2020/wordml/sdtdatahash" xmlns:w16sdtfl="http://schemas.microsoft.com/office/word/2024/wordml/sdtformatlock" xmlns:w16se="http://schemas.microsoft.com/office/word/2015/wordml/symex" xmlns:wpg="http://schemas.microsoft.com/office/word/2010/wordprocessingGroup" xmlns:wpi="http://schemas.microsoft.com/office/word/2010/wordprocessingInk" xmlns:wne="http://schemas.microsoft.com/office/word/2006/wordml" xmlns:wps="http://schemas.microsoft.com/office/word/2010/wordprocessingShape" mc:Ignorable="w14 w15 w16se w16cid w16 w16cex w16sdtdh w16sdtfl w16du wp14">
   <w:body>
-    <w:p xmlns:wp14="http://schemas.microsoft.com/office/word/2010/wordml" wp14:textId="77777777">
+    <w:p>
       <w:pPr>
         <w:pStyle w:val="Title"/>
       </w:pPr>
@@ -17,7 +17,7 @@
           <w:color w:val="1B033C"/>
           <w:spacing w:val="-16"/>
         </w:rPr>
-        <w:t> </w:t>
+        <w:t xml:space="preserve"> </w:t>
       </w:r>
       <w:r>
         <w:rPr>
@@ -27,7 +27,7 @@
         <w:t>Kumar</w:t>
       </w:r>
     </w:p>
-    <w:p xmlns:wp14="http://schemas.microsoft.com/office/word/2010/wordml" wp14:textId="77777777">
+    <w:p>
       <w:pPr>
         <w:pStyle w:val="BodyText"/>
         <w:spacing w:before="49"/>
@@ -49,7 +49,7 @@
         </w:rPr>
         <w:t xml:space="preserve"> </w:t>
       </w:r>
-      <w:hyperlink r:id="R4875c39cd93f4e05">
+      <w:hyperlink r:id="rId5">
         <w:r>
           <w:rPr>
             <w:color w:val="110123"/>
@@ -115,6 +115,12 @@
       </w:r>
       <w:r>
         <w:rPr>
+          <w:color w:val="110123"/>
+        </w:rPr>
+        <w:t xml:space="preserve"> </w:t>
+      </w:r>
+      <w:r>
+        <w:rPr>
           <w:rFonts w:ascii="Cambria"/>
         </w:rPr>
         <w:t>|</w:t>
@@ -141,32 +147,25 @@
         </w:rPr>
         <w:t xml:space="preserve"> </w:t>
       </w:r>
-      <w:r>
-        <w:fldChar w:fldCharType="begin"/>
-      </w:r>
-      <w:r>
-        <w:instrText xml:space="preserve">HYPERLINK "https://byavi.in/"</w:instrText>
-      </w:r>
-      <w:r>
-        <w:fldChar w:fldCharType="separate"/>
-      </w:r>
-      <w:r>
-        <w:rPr>
-          <w:color w:val="110123"/>
-          <w:spacing w:val="-2"/>
-        </w:rPr>
-        <w:t>byavi.in</w:t>
-      </w:r>
-      <w:r>
-        <w:fldChar w:fldCharType="end"/>
-      </w:r>
+      <w:hyperlink r:id="rId6" w:history="1">
+        <w:r>
+          <w:rPr>
+            <w:color w:val="110123"/>
+            <w:spacing w:val="-2"/>
+          </w:rPr>
+          <w:t>byavi.in</w:t>
+        </w:r>
+      </w:hyperlink>
     </w:p>
-    <w:p xmlns:wp14="http://schemas.microsoft.com/office/word/2010/wordml" wp14:textId="6D573040">
+    <w:p>
       <w:pPr>
         <w:pStyle w:val="BodyText"/>
         <w:spacing w:before="22"/>
         <w:ind w:left="61" w:right="73"/>
         <w:jc w:val="center"/>
+        <w:rPr>
+          <w:rStyle w:val="Hyperlink"/>
+        </w:rPr>
       </w:pPr>
       <w:r>
         <w:rPr>
@@ -175,7 +174,7 @@
         </w:rPr>
         <w:t xml:space="preserve">GitHub </w:t>
       </w:r>
-      <w:hyperlink r:id="Rfc70cf49587a40b4">
+      <w:hyperlink r:id="rId7">
         <w:r>
           <w:rPr>
             <w:color w:val="110123"/>
@@ -203,26 +202,29 @@
         </w:rPr>
         <w:t xml:space="preserve">LINKEDIN </w:t>
       </w:r>
-      <w:hyperlink r:id="Rb3fc7332a9d24f4e">
-        <w:r>
-          <w:rPr>
-            <w:rStyle w:val="Hyperlink"/>
-          </w:rPr>
-          <w:t>Avinash</w:t>
-        </w:r>
-        <w:r>
-          <w:rPr>
-            <w:rStyle w:val="Hyperlink"/>
-          </w:rPr>
-          <w:t xml:space="preserve"> </w:t>
-        </w:r>
-        <w:r>
-          <w:rPr>
-            <w:rStyle w:val="Hyperlink"/>
-          </w:rPr>
-          <w:t>kumar</w:t>
-        </w:r>
-      </w:hyperlink>
+      <w:r>
+        <w:fldChar w:fldCharType="begin"/>
+      </w:r>
+      <w:r>
+        <w:instrText>HYPERLINK "https://www.linkedin.com/in/avinash10x/"</w:instrText>
+      </w:r>
+      <w:r>
+        <w:fldChar w:fldCharType="separate"/>
+      </w:r>
+      <w:r>
+        <w:rPr>
+          <w:rStyle w:val="Hyperlink"/>
+        </w:rPr>
+        <w:t xml:space="preserve">Avinash </w:t>
+      </w:r>
+      <w:proofErr w:type="spellStart"/>
+      <w:r>
+        <w:rPr>
+          <w:rStyle w:val="Hyperlink"/>
+        </w:rPr>
+        <w:t>kumar</w:t>
+      </w:r>
+      <w:proofErr w:type="spellEnd"/>
     </w:p>
     <w:p>
       <w:pPr>
@@ -234,12 +236,15 @@
           <w:color w:val="110123"/>
         </w:rPr>
       </w:pPr>
+      <w:r>
+        <w:fldChar w:fldCharType="end"/>
+      </w:r>
     </w:p>
-    <w:p xmlns:wp14="http://schemas.microsoft.com/office/word/2010/wordml" wp14:textId="77777777">
+    <w:p>
       <w:pPr>
         <w:pStyle w:val="BodyText"/>
         <w:spacing w:before="22"/>
-        <w:ind w:left="0" w:right="73"/>
+        <w:ind w:right="73"/>
         <w:jc w:val="center"/>
         <w:rPr>
           <w:rFonts w:ascii="Calibri"/>
@@ -247,9 +252,11 @@
         </w:rPr>
       </w:pPr>
       <w:r>
-        <w:rPr/>
+        <w:rPr>
+          <w:noProof/>
+        </w:rPr>
         <w:drawing>
-          <wp:anchor xmlns:wp14="http://schemas.microsoft.com/office/word/2010/wordprocessingDrawing" distT="0" distB="0" distL="0" distR="0" simplePos="0" relativeHeight="487587840" behindDoc="1" locked="0" layoutInCell="1" allowOverlap="1" wp14:anchorId="21AA6501" wp14:editId="7777777">
+          <wp:anchor distT="0" distB="0" distL="0" distR="0" simplePos="0" relativeHeight="487587840" behindDoc="1" locked="0" layoutInCell="1" allowOverlap="1" wp14:anchorId="21AA6501" wp14:editId="07777777">
             <wp:simplePos x="0" y="0"/>
             <wp:positionH relativeFrom="page">
               <wp:posOffset>396875</wp:posOffset>
@@ -262,17 +269,17 @@
             <wp:wrapTopAndBottom/>
             <wp:docPr id="1" name="Image 1"/>
             <wp:cNvGraphicFramePr>
-              <a:graphicFrameLocks/>
+              <a:graphicFrameLocks xmlns:a="http://schemas.openxmlformats.org/drawingml/2006/main"/>
             </wp:cNvGraphicFramePr>
-            <a:graphic>
+            <a:graphic xmlns:a="http://schemas.openxmlformats.org/drawingml/2006/main">
               <a:graphicData uri="http://schemas.openxmlformats.org/drawingml/2006/picture">
-                <pic:pic>
+                <pic:pic xmlns:pic="http://schemas.openxmlformats.org/drawingml/2006/picture">
                   <pic:nvPicPr>
                     <pic:cNvPr id="1" name="Image 1"/>
                     <pic:cNvPicPr/>
                   </pic:nvPicPr>
                   <pic:blipFill>
-                    <a:blip r:embed="rId7" cstate="print"/>
+                    <a:blip r:embed="rId8" cstate="print"/>
                     <a:stretch>
                       <a:fillRect/>
                     </a:stretch>
@@ -293,11 +300,10 @@
         </w:drawing>
       </w:r>
     </w:p>
-    <w:p xmlns:wp14="http://schemas.microsoft.com/office/word/2010/wordml" wp14:textId="77777777">
+    <w:p>
       <w:pPr>
         <w:spacing w:before="120"/>
-        <w:ind w:left="28" w:right="0" w:firstLine="0"/>
-        <w:jc w:val="left"/>
+        <w:ind w:left="28"/>
         <w:rPr>
           <w:sz w:val="20"/>
         </w:rPr>
@@ -319,7 +325,7 @@
           <w:spacing w:val="-9"/>
           <w:sz w:val="20"/>
         </w:rPr>
-        <w:t> </w:t>
+        <w:t xml:space="preserve"> </w:t>
       </w:r>
       <w:r>
         <w:rPr>
@@ -334,7 +340,7 @@
           <w:spacing w:val="-9"/>
           <w:sz w:val="20"/>
         </w:rPr>
-        <w:t> </w:t>
+        <w:t xml:space="preserve"> </w:t>
       </w:r>
       <w:r>
         <w:rPr>
@@ -349,7 +355,7 @@
           <w:spacing w:val="-9"/>
           <w:sz w:val="20"/>
         </w:rPr>
-        <w:t> </w:t>
+        <w:t xml:space="preserve"> </w:t>
       </w:r>
       <w:r>
         <w:rPr>
@@ -364,7 +370,7 @@
           <w:spacing w:val="-8"/>
           <w:sz w:val="20"/>
         </w:rPr>
-        <w:t> </w:t>
+        <w:t xml:space="preserve"> </w:t>
       </w:r>
       <w:r>
         <w:rPr>
@@ -373,192 +379,158 @@
           <w:sz w:val="20"/>
         </w:rPr>
         <w:t>TypeScript</w:t>
-      </w:r>
-    </w:p>
-    <w:p xmlns:wp14="http://schemas.microsoft.com/office/word/2010/wordml" wp14:textId="56915EEE">
-      <w:pPr>
-        <w:spacing w:before="93"/>
-        <w:ind w:left="28" w:right="0" w:firstLine="0"/>
-        <w:jc w:val="left"/>
-        <w:rPr>
-          <w:sz w:val="20"/>
-          <w:szCs w:val="20"/>
-        </w:rPr>
-      </w:pPr>
-      <w:r>
-        <w:rPr>
-          <w:rFonts w:ascii="Arial"/>
-          <w:b w:val="1"/>
-          <w:bCs w:val="1"/>
-          <w:color w:val="1B033C"/>
-          <w:sz w:val="20"/>
-          <w:szCs w:val="20"/>
-        </w:rPr>
-        <w:t>Database</w:t>
-      </w:r>
-      <w:r>
-        <w:rPr>
-          <w:rFonts w:ascii="Arial"/>
-          <w:b w:val="1"/>
-          <w:bCs w:val="1"/>
-          <w:color w:val="1B033C"/>
-          <w:sz w:val="20"/>
-          <w:szCs w:val="20"/>
-        </w:rPr>
-        <w:t xml:space="preserve"> &amp; Stacks </w:t>
-      </w:r>
-      <w:r>
-        <w:rPr>
-          <w:rFonts w:ascii="Arial"/>
-          <w:b w:val="1"/>
-          <w:bCs w:val="1"/>
-          <w:color w:val="1B033C"/>
-          <w:sz w:val="20"/>
-          <w:szCs w:val="20"/>
-        </w:rPr>
-        <w:t>:</w:t>
-      </w:r>
-      <w:r>
-        <w:rPr>
-          <w:rFonts w:ascii="Arial"/>
-          <w:b w:val="1"/>
-          <w:bCs w:val="1"/>
-          <w:color w:val="1B033C"/>
-          <w:spacing w:val="-9"/>
-          <w:sz w:val="20"/>
-          <w:szCs w:val="20"/>
-        </w:rPr>
-        <w:t xml:space="preserve"> </w:t>
-      </w:r>
-      <w:r>
-        <w:rPr>
-          <w:color w:val="1B033C"/>
-          <w:sz w:val="20"/>
-          <w:szCs w:val="20"/>
-        </w:rPr>
-        <w:t>MySQ</w:t>
-      </w:r>
-      <w:r>
-        <w:rPr>
-          <w:color w:val="1B033C"/>
-          <w:sz w:val="20"/>
-          <w:szCs w:val="20"/>
-        </w:rPr>
-        <w:t>L,</w:t>
-      </w:r>
-      <w:r>
-        <w:rPr>
-          <w:color w:val="1B033C"/>
-          <w:spacing w:val="-8"/>
-          <w:sz w:val="20"/>
-          <w:szCs w:val="20"/>
-        </w:rPr>
-        <w:t xml:space="preserve"> </w:t>
-      </w:r>
-      <w:r>
-        <w:rPr>
-          <w:color w:val="1B033C"/>
-          <w:sz w:val="20"/>
-          <w:szCs w:val="20"/>
-        </w:rPr>
-        <w:t>MongoDB</w:t>
-      </w:r>
-      <w:r>
-        <w:rPr>
-          <w:color w:val="1B033C"/>
-          <w:spacing w:val="-9"/>
-          <w:sz w:val="20"/>
-          <w:szCs w:val="20"/>
-        </w:rPr>
-        <w:t xml:space="preserve"> </w:t>
-      </w:r>
-      <w:r>
-        <w:rPr>
-          <w:color w:val="1B033C"/>
-          <w:sz w:val="20"/>
-          <w:szCs w:val="20"/>
-        </w:rPr>
-        <w:t>,</w:t>
-      </w:r>
-      <w:r>
-        <w:rPr>
-          <w:color w:val="1B033C"/>
-          <w:sz w:val="20"/>
-          <w:szCs w:val="20"/>
-        </w:rPr>
-        <w:t>Re</w:t>
-      </w:r>
-      <w:r>
-        <w:rPr>
-          <w:color w:val="1B033C"/>
-          <w:sz w:val="20"/>
-          <w:szCs w:val="20"/>
-        </w:rPr>
-        <w:t>dux</w:t>
-      </w:r>
-      <w:r>
-        <w:rPr>
-          <w:color w:val="1B033C"/>
-          <w:sz w:val="20"/>
-          <w:szCs w:val="20"/>
-        </w:rPr>
-        <w:t>,</w:t>
-      </w:r>
-      <w:r>
-        <w:rPr>
-          <w:color w:val="1B033C"/>
-          <w:spacing w:val="-9"/>
-          <w:sz w:val="20"/>
-          <w:szCs w:val="20"/>
-        </w:rPr>
-        <w:t xml:space="preserve"> </w:t>
-      </w:r>
-      <w:r>
-        <w:rPr>
-          <w:color w:val="1B033C"/>
-          <w:sz w:val="20"/>
-          <w:szCs w:val="20"/>
-        </w:rPr>
-        <w:t>Tailwind,</w:t>
-      </w:r>
-      <w:r>
-        <w:rPr>
-          <w:color w:val="1B033C"/>
-          <w:spacing w:val="-8"/>
-          <w:sz w:val="20"/>
-          <w:szCs w:val="20"/>
-        </w:rPr>
-        <w:t xml:space="preserve"> </w:t>
-      </w:r>
-      <w:r>
-        <w:rPr>
-          <w:color w:val="1B033C"/>
-          <w:spacing w:val="-2"/>
-          <w:sz w:val="20"/>
-          <w:szCs w:val="20"/>
-        </w:rPr>
-        <w:t>Express, Radish</w:t>
       </w:r>
     </w:p>
     <w:p>
       <w:pPr>
         <w:spacing w:before="93"/>
-        <w:ind w:left="28" w:right="0" w:firstLine="0"/>
-        <w:jc w:val="left"/>
-        <w:rPr>
-          <w:color w:val="1B033C"/>
+        <w:ind w:left="28"/>
+        <w:rPr>
           <w:sz w:val="20"/>
           <w:szCs w:val="20"/>
         </w:rPr>
       </w:pPr>
       <w:r>
         <w:rPr>
-          <w:b w:val="1"/>
-          <w:bCs w:val="1"/>
+          <w:rFonts w:ascii="Arial"/>
+          <w:b/>
+          <w:bCs/>
           <w:color w:val="1B033C"/>
           <w:sz w:val="20"/>
           <w:szCs w:val="20"/>
         </w:rPr>
+        <w:t>Database</w:t>
+      </w:r>
+      <w:r>
+        <w:rPr>
+          <w:rFonts w:ascii="Arial"/>
+          <w:b/>
+          <w:bCs/>
+          <w:color w:val="1B033C"/>
+          <w:sz w:val="20"/>
+          <w:szCs w:val="20"/>
+        </w:rPr>
+        <w:t xml:space="preserve"> &amp; Stacks </w:t>
+      </w:r>
+      <w:r>
+        <w:rPr>
+          <w:rFonts w:ascii="Arial"/>
+          <w:b/>
+          <w:bCs/>
+          <w:color w:val="1B033C"/>
+          <w:sz w:val="20"/>
+          <w:szCs w:val="20"/>
+        </w:rPr>
+        <w:t>:</w:t>
+      </w:r>
+      <w:r>
+        <w:rPr>
+          <w:rFonts w:ascii="Arial"/>
+          <w:b/>
+          <w:bCs/>
+          <w:color w:val="1B033C"/>
+          <w:spacing w:val="-9"/>
+          <w:sz w:val="20"/>
+          <w:szCs w:val="20"/>
+        </w:rPr>
+        <w:t xml:space="preserve"> </w:t>
+      </w:r>
+      <w:r>
+        <w:rPr>
+          <w:color w:val="1B033C"/>
+          <w:sz w:val="20"/>
+          <w:szCs w:val="20"/>
+        </w:rPr>
+        <w:t>MySQL,</w:t>
+      </w:r>
+      <w:r>
+        <w:rPr>
+          <w:color w:val="1B033C"/>
+          <w:spacing w:val="-8"/>
+          <w:sz w:val="20"/>
+          <w:szCs w:val="20"/>
+        </w:rPr>
+        <w:t xml:space="preserve"> </w:t>
+      </w:r>
+      <w:r>
+        <w:rPr>
+          <w:color w:val="1B033C"/>
+          <w:sz w:val="20"/>
+          <w:szCs w:val="20"/>
+        </w:rPr>
+        <w:t>MongoDB</w:t>
+      </w:r>
+      <w:r>
+        <w:rPr>
+          <w:color w:val="1B033C"/>
+          <w:spacing w:val="-9"/>
+          <w:sz w:val="20"/>
+          <w:szCs w:val="20"/>
+        </w:rPr>
+        <w:t xml:space="preserve"> </w:t>
+      </w:r>
+      <w:r>
+        <w:rPr>
+          <w:color w:val="1B033C"/>
+          <w:sz w:val="20"/>
+          <w:szCs w:val="20"/>
+        </w:rPr>
+        <w:t>,Redux,</w:t>
+      </w:r>
+      <w:r>
+        <w:rPr>
+          <w:color w:val="1B033C"/>
+          <w:spacing w:val="-9"/>
+          <w:sz w:val="20"/>
+          <w:szCs w:val="20"/>
+        </w:rPr>
+        <w:t xml:space="preserve"> </w:t>
+      </w:r>
+      <w:r>
+        <w:rPr>
+          <w:color w:val="1B033C"/>
+          <w:sz w:val="20"/>
+          <w:szCs w:val="20"/>
+        </w:rPr>
+        <w:t>Tailwind,</w:t>
+      </w:r>
+      <w:r>
+        <w:rPr>
+          <w:color w:val="1B033C"/>
+          <w:spacing w:val="-8"/>
+          <w:sz w:val="20"/>
+          <w:szCs w:val="20"/>
+        </w:rPr>
+        <w:t xml:space="preserve"> </w:t>
+      </w:r>
+      <w:r>
+        <w:rPr>
+          <w:color w:val="1B033C"/>
+          <w:spacing w:val="-2"/>
+          <w:sz w:val="20"/>
+          <w:szCs w:val="20"/>
+        </w:rPr>
+        <w:t>Express, Radish</w:t>
+      </w:r>
+    </w:p>
+    <w:p>
+      <w:pPr>
+        <w:spacing w:before="93"/>
+        <w:ind w:left="28"/>
+        <w:rPr>
+          <w:color w:val="1B033C"/>
+          <w:sz w:val="20"/>
+          <w:szCs w:val="20"/>
+        </w:rPr>
+      </w:pPr>
+      <w:r>
+        <w:rPr>
+          <w:b/>
+          <w:bCs/>
+          <w:color w:val="1B033C"/>
+          <w:sz w:val="20"/>
+          <w:szCs w:val="20"/>
+        </w:rPr>
         <w:t>Frameworks</w:t>
       </w:r>
       <w:r>
@@ -569,6 +541,7 @@
         </w:rPr>
         <w:t xml:space="preserve">: </w:t>
       </w:r>
+      <w:proofErr w:type="spellStart"/>
       <w:r>
         <w:rPr>
           <w:color w:val="1B033C"/>
@@ -577,6 +550,7 @@
         </w:rPr>
         <w:t>Nextjs</w:t>
       </w:r>
+      <w:proofErr w:type="spellEnd"/>
       <w:r>
         <w:rPr>
           <w:color w:val="1B033C"/>
@@ -585,6 +559,7 @@
         </w:rPr>
         <w:t xml:space="preserve">, </w:t>
       </w:r>
+      <w:proofErr w:type="spellStart"/>
       <w:r>
         <w:rPr>
           <w:color w:val="1B033C"/>
@@ -593,6 +568,7 @@
         </w:rPr>
         <w:t>Reactjs</w:t>
       </w:r>
+      <w:proofErr w:type="spellEnd"/>
       <w:r>
         <w:rPr>
           <w:color w:val="1B033C"/>
@@ -602,16 +578,13 @@
         <w:t>, Express, React Native</w:t>
       </w:r>
     </w:p>
-    <w:p xmlns:wp14="http://schemas.microsoft.com/office/word/2010/wordml" wp14:textId="77777777">
+    <w:p>
       <w:pPr>
         <w:pStyle w:val="Heading1"/>
         <w:spacing w:before="94"/>
       </w:pPr>
-      <w:bookmarkStart w:name="Work Experience " w:id="1"/>
-      <w:bookmarkEnd w:id="1"/>
-      <w:r>
-        <w:rPr/>
-      </w:r>
+      <w:bookmarkStart w:id="0" w:name="Work_Experience_"/>
+      <w:bookmarkEnd w:id="0"/>
       <w:r>
         <w:rPr>
           <w:color w:val="1B033C"/>
@@ -623,7 +596,7 @@
           <w:color w:val="1B033C"/>
           <w:spacing w:val="-9"/>
         </w:rPr>
-        <w:t> </w:t>
+        <w:t xml:space="preserve"> </w:t>
       </w:r>
       <w:r>
         <w:rPr>
@@ -633,7 +606,7 @@
         <w:t>Experience</w:t>
       </w:r>
     </w:p>
-    <w:p xmlns:wp14="http://schemas.microsoft.com/office/word/2010/wordml" wp14:textId="77777777">
+    <w:p>
       <w:pPr>
         <w:pStyle w:val="BodyText"/>
         <w:rPr>
@@ -642,10 +615,11 @@
       </w:pPr>
       <w:r>
         <w:rPr>
+          <w:noProof/>
           <w:sz w:val="17"/>
         </w:rPr>
         <w:drawing>
-          <wp:anchor xmlns:wp14="http://schemas.microsoft.com/office/word/2010/wordprocessingDrawing" distT="0" distB="0" distL="0" distR="0" simplePos="0" relativeHeight="487588352" behindDoc="1" locked="0" layoutInCell="1" allowOverlap="1" wp14:anchorId="51D25958" wp14:editId="7777777">
+          <wp:anchor distT="0" distB="0" distL="0" distR="0" simplePos="0" relativeHeight="487588352" behindDoc="1" locked="0" layoutInCell="1" allowOverlap="1" wp14:anchorId="51D25958" wp14:editId="07777777">
             <wp:simplePos x="0" y="0"/>
             <wp:positionH relativeFrom="page">
               <wp:posOffset>406400</wp:posOffset>
@@ -658,17 +632,17 @@
             <wp:wrapTopAndBottom/>
             <wp:docPr id="2" name="Image 2"/>
             <wp:cNvGraphicFramePr>
-              <a:graphicFrameLocks/>
+              <a:graphicFrameLocks xmlns:a="http://schemas.openxmlformats.org/drawingml/2006/main"/>
             </wp:cNvGraphicFramePr>
-            <a:graphic>
+            <a:graphic xmlns:a="http://schemas.openxmlformats.org/drawingml/2006/main">
               <a:graphicData uri="http://schemas.openxmlformats.org/drawingml/2006/picture">
-                <pic:pic>
+                <pic:pic xmlns:pic="http://schemas.openxmlformats.org/drawingml/2006/picture">
                   <pic:nvPicPr>
                     <pic:cNvPr id="2" name="Image 2"/>
                     <pic:cNvPicPr/>
                   </pic:nvPicPr>
                   <pic:blipFill>
-                    <a:blip r:embed="rId10" cstate="print"/>
+                    <a:blip r:embed="rId9" cstate="print"/>
                     <a:stretch>
                       <a:fillRect/>
                     </a:stretch>
@@ -689,14 +663,13 @@
         </w:drawing>
       </w:r>
     </w:p>
-    <w:p xmlns:wp14="http://schemas.microsoft.com/office/word/2010/wordml" wp14:textId="77777777">
+    <w:p>
       <w:pPr>
         <w:tabs>
-          <w:tab w:val="left" w:leader="none" w:pos="8971"/>
+          <w:tab w:val="left" w:pos="8971"/>
         </w:tabs>
         <w:spacing w:before="142"/>
-        <w:ind w:left="28" w:right="0" w:firstLine="0"/>
-        <w:jc w:val="left"/>
+        <w:ind w:left="28"/>
         <w:rPr>
           <w:sz w:val="20"/>
         </w:rPr>
@@ -718,7 +691,7 @@
           <w:spacing w:val="-5"/>
           <w:sz w:val="20"/>
         </w:rPr>
-        <w:t> </w:t>
+        <w:t xml:space="preserve"> </w:t>
       </w:r>
       <w:r>
         <w:rPr>
@@ -737,7 +710,7 @@
           <w:spacing w:val="-4"/>
           <w:sz w:val="20"/>
         </w:rPr>
-        <w:t> </w:t>
+        <w:t xml:space="preserve"> </w:t>
       </w:r>
       <w:r>
         <w:rPr>
@@ -756,7 +729,7 @@
           <w:spacing w:val="-4"/>
           <w:sz w:val="20"/>
         </w:rPr>
-        <w:t> </w:t>
+        <w:t xml:space="preserve"> </w:t>
       </w:r>
       <w:r>
         <w:rPr>
@@ -775,7 +748,7 @@
           <w:spacing w:val="-4"/>
           <w:sz w:val="20"/>
         </w:rPr>
-        <w:t> </w:t>
+        <w:t xml:space="preserve"> </w:t>
       </w:r>
       <w:r>
         <w:rPr>
@@ -794,7 +767,7 @@
           <w:spacing w:val="-4"/>
           <w:sz w:val="20"/>
         </w:rPr>
-        <w:t> </w:t>
+        <w:t xml:space="preserve"> </w:t>
       </w:r>
       <w:r>
         <w:rPr>
@@ -828,7 +801,7 @@
           <w:spacing w:val="-4"/>
           <w:sz w:val="20"/>
         </w:rPr>
-        <w:t> </w:t>
+        <w:t xml:space="preserve"> </w:t>
       </w:r>
       <w:r>
         <w:rPr>
@@ -843,7 +816,7 @@
           <w:spacing w:val="-3"/>
           <w:sz w:val="20"/>
         </w:rPr>
-        <w:t> </w:t>
+        <w:t xml:space="preserve"> </w:t>
       </w:r>
       <w:r>
         <w:rPr>
@@ -858,7 +831,7 @@
           <w:spacing w:val="-3"/>
           <w:sz w:val="20"/>
         </w:rPr>
-        <w:t> </w:t>
+        <w:t xml:space="preserve"> </w:t>
       </w:r>
       <w:r>
         <w:rPr>
@@ -873,7 +846,7 @@
           <w:spacing w:val="-3"/>
           <w:sz w:val="20"/>
         </w:rPr>
-        <w:t> </w:t>
+        <w:t xml:space="preserve"> </w:t>
       </w:r>
       <w:r>
         <w:rPr>
@@ -884,11 +857,10 @@
         <w:t>31</w:t>
       </w:r>
     </w:p>
-    <w:p xmlns:wp14="http://schemas.microsoft.com/office/word/2010/wordml" wp14:textId="77777777">
+    <w:p>
       <w:pPr>
         <w:spacing w:before="96"/>
-        <w:ind w:left="28" w:right="0" w:firstLine="0"/>
-        <w:jc w:val="left"/>
+        <w:ind w:left="28"/>
         <w:rPr>
           <w:rFonts w:ascii="Arial"/>
           <w:b/>
@@ -915,7 +887,7 @@
           <w:spacing w:val="-10"/>
           <w:sz w:val="20"/>
         </w:rPr>
-        <w:t> </w:t>
+        <w:t xml:space="preserve"> </w:t>
       </w:r>
       <w:r>
         <w:rPr>
@@ -929,7 +901,7 @@
         <w:t>Development</w:t>
       </w:r>
     </w:p>
-    <w:p xmlns:wp14="http://schemas.microsoft.com/office/word/2010/wordml" wp14:textId="77777777">
+    <w:p>
       <w:pPr>
         <w:pStyle w:val="ListParagraph"/>
         <w:numPr>
@@ -937,10 +909,10 @@
           <w:numId w:val="1"/>
         </w:numPr>
         <w:tabs>
-          <w:tab w:val="left" w:leader="none" w:pos="419"/>
+          <w:tab w:val="left" w:pos="419"/>
         </w:tabs>
-        <w:spacing w:before="127" w:after="0" w:line="254" w:lineRule="auto"/>
-        <w:ind w:left="419" w:right="47" w:hanging="180"/>
+        <w:spacing w:before="127" w:line="254" w:lineRule="auto"/>
+        <w:ind w:right="47"/>
         <w:jc w:val="both"/>
         <w:rPr>
           <w:sz w:val="20"/>
@@ -959,7 +931,7 @@
           <w:spacing w:val="80"/>
           <w:sz w:val="20"/>
         </w:rPr>
-        <w:t> </w:t>
+        <w:t xml:space="preserve"> </w:t>
       </w:r>
       <w:r>
         <w:rPr>
@@ -974,7 +946,7 @@
           <w:spacing w:val="80"/>
           <w:sz w:val="20"/>
         </w:rPr>
-        <w:t> </w:t>
+        <w:t xml:space="preserve"> </w:t>
       </w:r>
       <w:r>
         <w:rPr>
@@ -989,7 +961,7 @@
           <w:spacing w:val="80"/>
           <w:sz w:val="20"/>
         </w:rPr>
-        <w:t> </w:t>
+        <w:t xml:space="preserve"> </w:t>
       </w:r>
       <w:r>
         <w:rPr>
@@ -1004,7 +976,7 @@
           <w:spacing w:val="80"/>
           <w:sz w:val="20"/>
         </w:rPr>
-        <w:t> </w:t>
+        <w:t xml:space="preserve"> </w:t>
       </w:r>
       <w:r>
         <w:rPr>
@@ -1019,7 +991,7 @@
           <w:spacing w:val="80"/>
           <w:sz w:val="20"/>
         </w:rPr>
-        <w:t> </w:t>
+        <w:t xml:space="preserve"> </w:t>
       </w:r>
       <w:r>
         <w:rPr>
@@ -1034,7 +1006,7 @@
           <w:spacing w:val="80"/>
           <w:sz w:val="20"/>
         </w:rPr>
-        <w:t> </w:t>
+        <w:t xml:space="preserve"> </w:t>
       </w:r>
       <w:r>
         <w:rPr>
@@ -1049,7 +1021,7 @@
           <w:spacing w:val="80"/>
           <w:sz w:val="20"/>
         </w:rPr>
-        <w:t> </w:t>
+        <w:t xml:space="preserve"> </w:t>
       </w:r>
       <w:r>
         <w:rPr>
@@ -1064,7 +1036,7 @@
           <w:spacing w:val="80"/>
           <w:sz w:val="20"/>
         </w:rPr>
-        <w:t> </w:t>
+        <w:t xml:space="preserve"> </w:t>
       </w:r>
       <w:r>
         <w:rPr>
@@ -1079,7 +1051,7 @@
           <w:spacing w:val="80"/>
           <w:sz w:val="20"/>
         </w:rPr>
-        <w:t> </w:t>
+        <w:t xml:space="preserve"> </w:t>
       </w:r>
       <w:r>
         <w:rPr>
@@ -1094,7 +1066,7 @@
           <w:spacing w:val="80"/>
           <w:sz w:val="20"/>
         </w:rPr>
-        <w:t> </w:t>
+        <w:t xml:space="preserve"> </w:t>
       </w:r>
       <w:r>
         <w:rPr>
@@ -1109,7 +1081,7 @@
           <w:spacing w:val="80"/>
           <w:sz w:val="20"/>
         </w:rPr>
-        <w:t> </w:t>
+        <w:t xml:space="preserve"> </w:t>
       </w:r>
       <w:r>
         <w:rPr>
@@ -1124,7 +1096,7 @@
           <w:spacing w:val="40"/>
           <w:sz w:val="20"/>
         </w:rPr>
-        <w:t> </w:t>
+        <w:t xml:space="preserve"> </w:t>
       </w:r>
       <w:r>
         <w:rPr>
@@ -1139,7 +1111,7 @@
           <w:spacing w:val="-3"/>
           <w:sz w:val="20"/>
         </w:rPr>
-        <w:t> </w:t>
+        <w:t xml:space="preserve"> </w:t>
       </w:r>
       <w:r>
         <w:rPr>
@@ -1158,7 +1130,7 @@
           <w:spacing w:val="-3"/>
           <w:sz w:val="20"/>
         </w:rPr>
-        <w:t> </w:t>
+        <w:t xml:space="preserve"> </w:t>
       </w:r>
       <w:r>
         <w:rPr>
@@ -1173,7 +1145,7 @@
           <w:spacing w:val="-3"/>
           <w:sz w:val="20"/>
         </w:rPr>
-        <w:t> </w:t>
+        <w:t xml:space="preserve"> </w:t>
       </w:r>
       <w:r>
         <w:rPr>
@@ -1192,7 +1164,7 @@
         <w:t>, delivering premium 60fps experiences while managing client deliverables to ensure pixel-perfect execution</w:t>
       </w:r>
     </w:p>
-    <w:p xmlns:wp14="http://schemas.microsoft.com/office/word/2010/wordml" wp14:textId="77777777">
+    <w:p>
       <w:pPr>
         <w:pStyle w:val="ListParagraph"/>
         <w:numPr>
@@ -1200,12 +1172,11 @@
           <w:numId w:val="1"/>
         </w:numPr>
         <w:tabs>
-          <w:tab w:val="left" w:leader="none" w:pos="417"/>
-          <w:tab w:val="left" w:leader="none" w:pos="9060"/>
+          <w:tab w:val="left" w:pos="417"/>
+          <w:tab w:val="left" w:pos="9060"/>
         </w:tabs>
-        <w:spacing w:before="59" w:after="0" w:line="326" w:lineRule="auto"/>
+        <w:spacing w:before="59" w:line="326" w:lineRule="auto"/>
         <w:ind w:left="28" w:right="46" w:firstLine="210"/>
-        <w:jc w:val="left"/>
         <w:rPr>
           <w:rFonts w:ascii="Arial" w:hAnsi="Arial"/>
           <w:b/>
@@ -1220,14 +1191,62 @@
           <w:color w:val="1B033C"/>
           <w:sz w:val="20"/>
         </w:rPr>
-        <w:t>Tech Stack: </w:t>
-      </w:r>
-      <w:r>
-        <w:rPr>
-          <w:color w:val="1B033C"/>
-          <w:sz w:val="20"/>
-        </w:rPr>
-        <w:t>NodeJS, ExpressJS, MySQL, NextJS, TypeScript, REST APIs, ReactJs, Tailwind CSS, MySQL, Git </w:t>
+        <w:t xml:space="preserve">Tech Stack: </w:t>
+      </w:r>
+      <w:r>
+        <w:rPr>
+          <w:color w:val="1B033C"/>
+          <w:sz w:val="20"/>
+        </w:rPr>
+        <w:t xml:space="preserve">NodeJS, </w:t>
+      </w:r>
+      <w:proofErr w:type="spellStart"/>
+      <w:r>
+        <w:rPr>
+          <w:color w:val="1B033C"/>
+          <w:sz w:val="20"/>
+        </w:rPr>
+        <w:t>ExpressJS</w:t>
+      </w:r>
+      <w:proofErr w:type="spellEnd"/>
+      <w:r>
+        <w:rPr>
+          <w:color w:val="1B033C"/>
+          <w:sz w:val="20"/>
+        </w:rPr>
+        <w:t xml:space="preserve">, MySQL, </w:t>
+      </w:r>
+      <w:proofErr w:type="spellStart"/>
+      <w:r>
+        <w:rPr>
+          <w:color w:val="1B033C"/>
+          <w:sz w:val="20"/>
+        </w:rPr>
+        <w:t>NextJS</w:t>
+      </w:r>
+      <w:proofErr w:type="spellEnd"/>
+      <w:r>
+        <w:rPr>
+          <w:color w:val="1B033C"/>
+          <w:sz w:val="20"/>
+        </w:rPr>
+        <w:t xml:space="preserve">, TypeScript, REST APIs, </w:t>
+      </w:r>
+      <w:proofErr w:type="spellStart"/>
+      <w:r>
+        <w:rPr>
+          <w:color w:val="1B033C"/>
+          <w:sz w:val="20"/>
+        </w:rPr>
+        <w:t>ReactJs</w:t>
+      </w:r>
+      <w:proofErr w:type="spellEnd"/>
+      <w:r>
+        <w:rPr>
+          <w:color w:val="1B033C"/>
+          <w:sz w:val="20"/>
+        </w:rPr>
+        <w:t xml:space="preserve">, Tailwind CSS, MySQL, Git </w:t>
       </w:r>
       <w:r>
         <w:rPr>
@@ -1260,7 +1279,7 @@
           <w:spacing w:val="-10"/>
           <w:sz w:val="20"/>
         </w:rPr>
-        <w:t> </w:t>
+        <w:t xml:space="preserve"> </w:t>
       </w:r>
       <w:r>
         <w:rPr>
@@ -1275,7 +1294,7 @@
           <w:spacing w:val="-10"/>
           <w:sz w:val="20"/>
         </w:rPr>
-        <w:t> </w:t>
+        <w:t xml:space="preserve"> </w:t>
       </w:r>
       <w:r>
         <w:rPr>
@@ -1290,7 +1309,7 @@
           <w:spacing w:val="-10"/>
           <w:sz w:val="20"/>
         </w:rPr>
-        <w:t> </w:t>
+        <w:t xml:space="preserve"> </w:t>
       </w:r>
       <w:r>
         <w:rPr>
@@ -1305,14 +1324,14 @@
           <w:spacing w:val="-10"/>
           <w:sz w:val="20"/>
         </w:rPr>
-        <w:t> </w:t>
-      </w:r>
-      <w:r>
-        <w:rPr>
-          <w:color w:val="006FBF"/>
-          <w:sz w:val="20"/>
-        </w:rPr>
-        <w:t>31 </w:t>
+        <w:t xml:space="preserve"> </w:t>
+      </w:r>
+      <w:r>
+        <w:rPr>
+          <w:color w:val="006FBF"/>
+          <w:sz w:val="20"/>
+        </w:rPr>
+        <w:t xml:space="preserve">31 </w:t>
       </w:r>
       <w:r>
         <w:rPr>
@@ -1325,7 +1344,7 @@
         <w:t>Website Development</w:t>
       </w:r>
     </w:p>
-    <w:p xmlns:wp14="http://schemas.microsoft.com/office/word/2010/wordml" wp14:textId="77777777">
+    <w:p>
       <w:pPr>
         <w:pStyle w:val="ListParagraph"/>
         <w:numPr>
@@ -1333,10 +1352,10 @@
           <w:numId w:val="1"/>
         </w:numPr>
         <w:tabs>
-          <w:tab w:val="left" w:leader="none" w:pos="419"/>
+          <w:tab w:val="left" w:pos="419"/>
         </w:tabs>
-        <w:spacing w:before="45" w:after="0" w:line="254" w:lineRule="auto"/>
-        <w:ind w:left="419" w:right="45" w:hanging="180"/>
+        <w:spacing w:line="254" w:lineRule="auto"/>
+        <w:ind w:right="45"/>
         <w:jc w:val="both"/>
         <w:rPr>
           <w:sz w:val="20"/>
@@ -1355,7 +1374,7 @@
           <w:spacing w:val="-3"/>
           <w:sz w:val="20"/>
         </w:rPr>
-        <w:t> </w:t>
+        <w:t xml:space="preserve"> </w:t>
       </w:r>
       <w:r>
         <w:rPr>
@@ -1374,7 +1393,7 @@
           <w:spacing w:val="-3"/>
           <w:sz w:val="20"/>
         </w:rPr>
-        <w:t> </w:t>
+        <w:t xml:space="preserve"> </w:t>
       </w:r>
       <w:r>
         <w:rPr>
@@ -1389,7 +1408,7 @@
           <w:spacing w:val="-3"/>
           <w:sz w:val="20"/>
         </w:rPr>
-        <w:t> </w:t>
+        <w:t xml:space="preserve"> </w:t>
       </w:r>
       <w:r>
         <w:rPr>
@@ -1405,10 +1424,26 @@
           <w:color w:val="1B033C"/>
           <w:sz w:val="20"/>
         </w:rPr>
-        <w:t>, replacing manual workflows. Acted as a technical mentor for interns,Engineered a robust API in Express and Node.js with a MySQL database to streamline the translation and validation of geographic data for the Apple Maps localization team. Leading to 50% reduction in processing time and improved the accuracy of data.</w:t>
+        <w:t xml:space="preserve">, replacing manual workflows. Acted as a technical mentor for </w:t>
+      </w:r>
+      <w:proofErr w:type="spellStart"/>
+      <w:r>
+        <w:rPr>
+          <w:color w:val="1B033C"/>
+          <w:sz w:val="20"/>
+        </w:rPr>
+        <w:t>interns,Engineered</w:t>
+      </w:r>
+      <w:proofErr w:type="spellEnd"/>
+      <w:r>
+        <w:rPr>
+          <w:color w:val="1B033C"/>
+          <w:sz w:val="20"/>
+        </w:rPr>
+        <w:t xml:space="preserve"> a robust API in Express and Node.js with a MySQL database to streamline the translation and validation of geographic data for the Apple Maps localization team. Leading to 50% reduction in processing time and improved the accuracy of data.</w:t>
       </w:r>
     </w:p>
-    <w:p xmlns:wp14="http://schemas.microsoft.com/office/word/2010/wordml" wp14:textId="77777777">
+    <w:p>
       <w:pPr>
         <w:pStyle w:val="ListParagraph"/>
         <w:numPr>
@@ -1416,11 +1451,10 @@
           <w:numId w:val="1"/>
         </w:numPr>
         <w:tabs>
-          <w:tab w:val="left" w:leader="none" w:pos="418"/>
+          <w:tab w:val="left" w:pos="418"/>
         </w:tabs>
-        <w:spacing w:before="58" w:after="0" w:line="240" w:lineRule="auto"/>
-        <w:ind w:left="418" w:right="0" w:hanging="179"/>
-        <w:jc w:val="left"/>
+        <w:spacing w:before="58"/>
+        <w:ind w:left="418" w:hanging="179"/>
         <w:rPr>
           <w:sz w:val="20"/>
         </w:rPr>
@@ -1442,7 +1476,7 @@
           <w:spacing w:val="-10"/>
           <w:sz w:val="20"/>
         </w:rPr>
-        <w:t> </w:t>
+        <w:t xml:space="preserve"> </w:t>
       </w:r>
       <w:r>
         <w:rPr>
@@ -1461,7 +1495,7 @@
           <w:spacing w:val="-7"/>
           <w:sz w:val="20"/>
         </w:rPr>
-        <w:t> </w:t>
+        <w:t xml:space="preserve"> </w:t>
       </w:r>
       <w:r>
         <w:rPr>
@@ -1476,7 +1510,7 @@
           <w:spacing w:val="-7"/>
           <w:sz w:val="20"/>
         </w:rPr>
-        <w:t> </w:t>
+        <w:t xml:space="preserve"> </w:t>
       </w:r>
       <w:r>
         <w:rPr>
@@ -1491,7 +1525,7 @@
           <w:spacing w:val="-8"/>
           <w:sz w:val="20"/>
         </w:rPr>
-        <w:t> </w:t>
+        <w:t xml:space="preserve"> </w:t>
       </w:r>
       <w:r>
         <w:rPr>
@@ -1506,7 +1540,7 @@
           <w:spacing w:val="-7"/>
           <w:sz w:val="20"/>
         </w:rPr>
-        <w:t> </w:t>
+        <w:t xml:space="preserve"> </w:t>
       </w:r>
       <w:r>
         <w:rPr>
@@ -1521,7 +1555,7 @@
           <w:spacing w:val="-7"/>
           <w:sz w:val="20"/>
         </w:rPr>
-        <w:t> </w:t>
+        <w:t xml:space="preserve"> </w:t>
       </w:r>
       <w:r>
         <w:rPr>
@@ -1536,7 +1570,7 @@
           <w:spacing w:val="-8"/>
           <w:sz w:val="20"/>
         </w:rPr>
-        <w:t> </w:t>
+        <w:t xml:space="preserve"> </w:t>
       </w:r>
       <w:r>
         <w:rPr>
@@ -1551,7 +1585,7 @@
           <w:spacing w:val="-7"/>
           <w:sz w:val="20"/>
         </w:rPr>
-        <w:t> </w:t>
+        <w:t xml:space="preserve"> </w:t>
       </w:r>
       <w:r>
         <w:rPr>
@@ -1566,7 +1600,7 @@
           <w:spacing w:val="-7"/>
           <w:sz w:val="20"/>
         </w:rPr>
-        <w:t> </w:t>
+        <w:t xml:space="preserve"> </w:t>
       </w:r>
       <w:r>
         <w:rPr>
@@ -1577,21 +1611,18 @@
         <w:t>Render</w:t>
       </w:r>
     </w:p>
-    <w:p xmlns:wp14="http://schemas.microsoft.com/office/word/2010/wordml" wp14:textId="77777777">
+    <w:p>
       <w:pPr>
         <w:pStyle w:val="BodyText"/>
         <w:spacing w:before="141"/>
       </w:pPr>
     </w:p>
-    <w:p xmlns:wp14="http://schemas.microsoft.com/office/word/2010/wordml" wp14:textId="77777777">
+    <w:p>
       <w:pPr>
         <w:pStyle w:val="Heading1"/>
       </w:pPr>
-      <w:bookmarkStart w:name="Education " w:id="2"/>
-      <w:bookmarkEnd w:id="2"/>
-      <w:r>
-        <w:rPr/>
-      </w:r>
+      <w:bookmarkStart w:id="1" w:name="Education_"/>
+      <w:bookmarkEnd w:id="1"/>
       <w:r>
         <w:rPr>
           <w:color w:val="1B033C"/>
@@ -1600,7 +1631,7 @@
         <w:t>Education</w:t>
       </w:r>
     </w:p>
-    <w:p xmlns:wp14="http://schemas.microsoft.com/office/word/2010/wordml" wp14:textId="77777777">
+    <w:p>
       <w:pPr>
         <w:pStyle w:val="BodyText"/>
         <w:rPr>
@@ -1609,10 +1640,11 @@
       </w:pPr>
       <w:r>
         <w:rPr>
+          <w:noProof/>
           <w:sz w:val="17"/>
         </w:rPr>
         <w:drawing>
-          <wp:anchor xmlns:wp14="http://schemas.microsoft.com/office/word/2010/wordprocessingDrawing" distT="0" distB="0" distL="0" distR="0" simplePos="0" relativeHeight="487588864" behindDoc="1" locked="0" layoutInCell="1" allowOverlap="1" wp14:anchorId="40010498" wp14:editId="7777777">
+          <wp:anchor distT="0" distB="0" distL="0" distR="0" simplePos="0" relativeHeight="487588864" behindDoc="1" locked="0" layoutInCell="1" allowOverlap="1" wp14:anchorId="40010498" wp14:editId="07777777">
             <wp:simplePos x="0" y="0"/>
             <wp:positionH relativeFrom="page">
               <wp:posOffset>406400</wp:posOffset>
@@ -1625,17 +1657,17 @@
             <wp:wrapTopAndBottom/>
             <wp:docPr id="3" name="Image 3"/>
             <wp:cNvGraphicFramePr>
-              <a:graphicFrameLocks/>
+              <a:graphicFrameLocks xmlns:a="http://schemas.openxmlformats.org/drawingml/2006/main"/>
             </wp:cNvGraphicFramePr>
-            <a:graphic>
+            <a:graphic xmlns:a="http://schemas.openxmlformats.org/drawingml/2006/main">
               <a:graphicData uri="http://schemas.openxmlformats.org/drawingml/2006/picture">
-                <pic:pic>
+                <pic:pic xmlns:pic="http://schemas.openxmlformats.org/drawingml/2006/picture">
                   <pic:nvPicPr>
                     <pic:cNvPr id="3" name="Image 3"/>
                     <pic:cNvPicPr/>
                   </pic:nvPicPr>
                   <pic:blipFill>
-                    <a:blip r:embed="rId10" cstate="print"/>
+                    <a:blip r:embed="rId9" cstate="print"/>
                     <a:stretch>
                       <a:fillRect/>
                     </a:stretch>
@@ -1656,14 +1688,13 @@
         </w:drawing>
       </w:r>
     </w:p>
-    <w:p xmlns:wp14="http://schemas.microsoft.com/office/word/2010/wordml" wp14:textId="77777777">
+    <w:p>
       <w:pPr>
         <w:tabs>
-          <w:tab w:val="left" w:leader="none" w:pos="8849"/>
+          <w:tab w:val="left" w:pos="8849"/>
         </w:tabs>
         <w:spacing w:before="142"/>
-        <w:ind w:left="13" w:right="0" w:firstLine="0"/>
-        <w:jc w:val="left"/>
+        <w:ind w:left="13"/>
         <w:rPr>
           <w:sz w:val="20"/>
         </w:rPr>
@@ -1685,7 +1716,7 @@
           <w:spacing w:val="-9"/>
           <w:sz w:val="20"/>
         </w:rPr>
-        <w:t> </w:t>
+        <w:t xml:space="preserve"> </w:t>
       </w:r>
       <w:r>
         <w:rPr>
@@ -1704,7 +1735,7 @@
           <w:spacing w:val="-9"/>
           <w:sz w:val="20"/>
         </w:rPr>
-        <w:t> </w:t>
+        <w:t xml:space="preserve"> </w:t>
       </w:r>
       <w:r>
         <w:rPr>
@@ -1723,7 +1754,7 @@
           <w:spacing w:val="-9"/>
           <w:sz w:val="20"/>
         </w:rPr>
-        <w:t> </w:t>
+        <w:t xml:space="preserve"> </w:t>
       </w:r>
       <w:r>
         <w:rPr>
@@ -1742,7 +1773,7 @@
           <w:spacing w:val="-9"/>
           <w:sz w:val="20"/>
         </w:rPr>
-        <w:t> </w:t>
+        <w:t xml:space="preserve"> </w:t>
       </w:r>
       <w:r>
         <w:rPr>
@@ -1761,7 +1792,7 @@
           <w:spacing w:val="-9"/>
           <w:sz w:val="20"/>
         </w:rPr>
-        <w:t> </w:t>
+        <w:t xml:space="preserve"> </w:t>
       </w:r>
       <w:r>
         <w:rPr>
@@ -1780,7 +1811,7 @@
           <w:spacing w:val="-9"/>
           <w:sz w:val="20"/>
         </w:rPr>
-        <w:t> </w:t>
+        <w:t xml:space="preserve"> </w:t>
       </w:r>
       <w:r>
         <w:rPr>
@@ -1799,7 +1830,7 @@
           <w:spacing w:val="-8"/>
           <w:sz w:val="20"/>
         </w:rPr>
-        <w:t> </w:t>
+        <w:t xml:space="preserve"> </w:t>
       </w:r>
       <w:r>
         <w:rPr>
@@ -1833,7 +1864,7 @@
           <w:spacing w:val="-3"/>
           <w:sz w:val="20"/>
         </w:rPr>
-        <w:t> </w:t>
+        <w:t xml:space="preserve"> </w:t>
       </w:r>
       <w:r>
         <w:rPr>
@@ -1848,7 +1879,7 @@
           <w:spacing w:val="-3"/>
           <w:sz w:val="20"/>
         </w:rPr>
-        <w:t> </w:t>
+        <w:t xml:space="preserve"> </w:t>
       </w:r>
       <w:r>
         <w:rPr>
@@ -1863,7 +1894,7 @@
           <w:spacing w:val="-3"/>
           <w:sz w:val="20"/>
         </w:rPr>
-        <w:t> </w:t>
+        <w:t xml:space="preserve"> </w:t>
       </w:r>
       <w:r>
         <w:rPr>
@@ -1878,7 +1909,7 @@
           <w:spacing w:val="-3"/>
           <w:sz w:val="20"/>
         </w:rPr>
-        <w:t> </w:t>
+        <w:t xml:space="preserve"> </w:t>
       </w:r>
       <w:r>
         <w:rPr>
@@ -1889,11 +1920,11 @@
         <w:t>2025</w:t>
       </w:r>
     </w:p>
-    <w:p xmlns:wp14="http://schemas.microsoft.com/office/word/2010/wordml" wp14:textId="77777777">
+    <w:p>
       <w:pPr>
         <w:pStyle w:val="BodyText"/>
         <w:tabs>
-          <w:tab w:val="left" w:leader="none" w:pos="9664"/>
+          <w:tab w:val="left" w:pos="9664"/>
         </w:tabs>
         <w:spacing w:before="113" w:line="252" w:lineRule="auto"/>
         <w:ind w:left="28" w:right="46" w:hanging="15"/>
@@ -1934,7 +1965,7 @@
           <w:color w:val="006FBF"/>
           <w:spacing w:val="-12"/>
         </w:rPr>
-        <w:t> </w:t>
+        <w:t xml:space="preserve"> </w:t>
       </w:r>
       <w:r>
         <w:rPr>
@@ -1944,7 +1975,7 @@
           <w:color w:val="006FBF"/>
           <w:spacing w:val="-2"/>
         </w:rPr>
-        <w:t>8/10 </w:t>
+        <w:t xml:space="preserve">8/10 </w:t>
       </w:r>
       <w:r>
         <w:rPr>
@@ -1953,21 +1984,18 @@
         <w:t>Relevant Coursework: Full Stack Development, Cloud Computing, Front-End Technologies (HTML, CSS, JavaScript, React), Back-End Development (Node.js, Express, Databases), Databases (SQL, NoSQL), Networking, Data Structures and Algorithms, Operating Systems, Software Engineering, Machine Learning, DevOps Practices</w:t>
       </w:r>
     </w:p>
-    <w:p xmlns:wp14="http://schemas.microsoft.com/office/word/2010/wordml" wp14:textId="77777777">
+    <w:p>
       <w:pPr>
         <w:pStyle w:val="BodyText"/>
         <w:spacing w:before="102"/>
       </w:pPr>
     </w:p>
-    <w:p xmlns:wp14="http://schemas.microsoft.com/office/word/2010/wordml" wp14:textId="77777777">
+    <w:p>
       <w:pPr>
         <w:pStyle w:val="Heading1"/>
       </w:pPr>
-      <w:bookmarkStart w:name="Project Work " w:id="3"/>
-      <w:bookmarkEnd w:id="3"/>
-      <w:r>
-        <w:rPr/>
-      </w:r>
+      <w:bookmarkStart w:id="2" w:name="Project_Work_"/>
+      <w:bookmarkEnd w:id="2"/>
       <w:r>
         <w:rPr>
           <w:color w:val="1B033C"/>
@@ -1979,7 +2007,7 @@
           <w:color w:val="1B033C"/>
           <w:spacing w:val="-7"/>
         </w:rPr>
-        <w:t> </w:t>
+        <w:t xml:space="preserve"> </w:t>
       </w:r>
       <w:r>
         <w:rPr>
@@ -1989,7 +2017,7 @@
         <w:t>Work</w:t>
       </w:r>
     </w:p>
-    <w:p xmlns:wp14="http://schemas.microsoft.com/office/word/2010/wordml" wp14:textId="77777777">
+    <w:p>
       <w:pPr>
         <w:pStyle w:val="BodyText"/>
         <w:rPr>
@@ -1998,10 +2026,11 @@
       </w:pPr>
       <w:r>
         <w:rPr>
+          <w:noProof/>
           <w:sz w:val="17"/>
         </w:rPr>
         <w:drawing>
-          <wp:anchor xmlns:wp14="http://schemas.microsoft.com/office/word/2010/wordprocessingDrawing" distT="0" distB="0" distL="0" distR="0" simplePos="0" relativeHeight="487589376" behindDoc="1" locked="0" layoutInCell="1" allowOverlap="1" wp14:anchorId="0C1BA109" wp14:editId="7777777">
+          <wp:anchor distT="0" distB="0" distL="0" distR="0" simplePos="0" relativeHeight="487589376" behindDoc="1" locked="0" layoutInCell="1" allowOverlap="1" wp14:anchorId="0C1BA109" wp14:editId="07777777">
             <wp:simplePos x="0" y="0"/>
             <wp:positionH relativeFrom="page">
               <wp:posOffset>406400</wp:posOffset>
@@ -2014,17 +2043,17 @@
             <wp:wrapTopAndBottom/>
             <wp:docPr id="4" name="Image 4"/>
             <wp:cNvGraphicFramePr>
-              <a:graphicFrameLocks/>
+              <a:graphicFrameLocks xmlns:a="http://schemas.openxmlformats.org/drawingml/2006/main"/>
             </wp:cNvGraphicFramePr>
-            <a:graphic>
+            <a:graphic xmlns:a="http://schemas.openxmlformats.org/drawingml/2006/main">
               <a:graphicData uri="http://schemas.openxmlformats.org/drawingml/2006/picture">
-                <pic:pic>
+                <pic:pic xmlns:pic="http://schemas.openxmlformats.org/drawingml/2006/picture">
                   <pic:nvPicPr>
                     <pic:cNvPr id="4" name="Image 4"/>
                     <pic:cNvPicPr/>
                   </pic:nvPicPr>
                   <pic:blipFill>
-                    <a:blip r:embed="rId10" cstate="print"/>
+                    <a:blip r:embed="rId9" cstate="print"/>
                     <a:stretch>
                       <a:fillRect/>
                     </a:stretch>
@@ -2045,7 +2074,7 @@
         </w:drawing>
       </w:r>
     </w:p>
-    <w:p xmlns:wp14="http://schemas.microsoft.com/office/word/2010/wordml" wp14:textId="77777777">
+    <w:p>
       <w:pPr>
         <w:pStyle w:val="ListParagraph"/>
         <w:numPr>
@@ -2053,18 +2082,18 @@
           <w:numId w:val="1"/>
         </w:numPr>
         <w:tabs>
-          <w:tab w:val="left" w:leader="none" w:pos="418"/>
-          <w:tab w:val="left" w:leader="none" w:pos="2188"/>
+          <w:tab w:val="left" w:pos="418"/>
+          <w:tab w:val="left" w:pos="2188"/>
         </w:tabs>
-        <w:spacing w:before="142" w:after="0" w:line="240" w:lineRule="auto"/>
-        <w:ind w:left="418" w:right="0" w:hanging="179"/>
-        <w:jc w:val="left"/>
+        <w:spacing w:before="142"/>
+        <w:ind w:left="418" w:hanging="179"/>
         <w:rPr>
           <w:rFonts w:ascii="Arial" w:hAnsi="Arial"/>
           <w:i/>
           <w:sz w:val="20"/>
         </w:rPr>
       </w:pPr>
+      <w:proofErr w:type="spellStart"/>
       <w:r>
         <w:rPr>
           <w:rFonts w:ascii="Arial" w:hAnsi="Arial"/>
@@ -2074,6 +2103,7 @@
         </w:rPr>
         <w:t>Plingo</w:t>
       </w:r>
+      <w:proofErr w:type="spellEnd"/>
       <w:r>
         <w:rPr>
           <w:rFonts w:ascii="Arial" w:hAnsi="Arial"/>
@@ -2082,7 +2112,7 @@
           <w:spacing w:val="-6"/>
           <w:sz w:val="20"/>
         </w:rPr>
-        <w:t> </w:t>
+        <w:t xml:space="preserve"> </w:t>
       </w:r>
       <w:r>
         <w:rPr>
@@ -2103,7 +2133,8 @@
         </w:rPr>
         <w:tab/>
       </w:r>
-      <w:hyperlink r:id="rId11">
+      <w:hyperlink r:id="rId10">
+        <w:proofErr w:type="spellStart"/>
         <w:r>
           <w:rPr>
             <w:rFonts w:ascii="Arial" w:hAnsi="Arial"/>
@@ -2113,6 +2144,7 @@
           </w:rPr>
           <w:t>OpenSource</w:t>
         </w:r>
+        <w:proofErr w:type="spellEnd"/>
       </w:hyperlink>
       <w:r>
         <w:rPr>
@@ -2122,7 +2154,7 @@
           <w:spacing w:val="-4"/>
           <w:sz w:val="20"/>
         </w:rPr>
-        <w:t> </w:t>
+        <w:t xml:space="preserve"> </w:t>
       </w:r>
       <w:r>
         <w:rPr>
@@ -2139,9 +2171,9 @@
           <w:spacing w:val="-3"/>
           <w:sz w:val="20"/>
         </w:rPr>
-        <w:t> </w:t>
-      </w:r>
-      <w:hyperlink r:id="rId12">
+        <w:t xml:space="preserve"> </w:t>
+      </w:r>
+      <w:hyperlink r:id="rId11">
         <w:r>
           <w:rPr>
             <w:rFonts w:ascii="Arial" w:hAnsi="Arial"/>
@@ -2159,8 +2191,9 @@
             <w:spacing w:val="-4"/>
             <w:sz w:val="20"/>
           </w:rPr>
-          <w:t> </w:t>
+          <w:t xml:space="preserve"> </w:t>
         </w:r>
+        <w:proofErr w:type="spellStart"/>
         <w:r>
           <w:rPr>
             <w:rFonts w:ascii="Arial" w:hAnsi="Arial"/>
@@ -2170,6 +2203,7 @@
           </w:rPr>
           <w:t>Url</w:t>
         </w:r>
+        <w:proofErr w:type="spellEnd"/>
       </w:hyperlink>
       <w:r>
         <w:rPr>
@@ -2179,7 +2213,7 @@
           <w:spacing w:val="-3"/>
           <w:sz w:val="20"/>
         </w:rPr>
-        <w:t> </w:t>
+        <w:t xml:space="preserve"> </w:t>
       </w:r>
       <w:r>
         <w:rPr>
@@ -2196,7 +2230,7 @@
           <w:spacing w:val="39"/>
           <w:sz w:val="20"/>
         </w:rPr>
-        <w:t> </w:t>
+        <w:t xml:space="preserve"> </w:t>
       </w:r>
       <w:r>
         <w:rPr>
@@ -2209,7 +2243,7 @@
         <w:t>Walkthrough</w:t>
       </w:r>
     </w:p>
-    <w:p xmlns:wp14="http://schemas.microsoft.com/office/word/2010/wordml" wp14:textId="77777777">
+    <w:p>
       <w:pPr>
         <w:pStyle w:val="BodyText"/>
         <w:spacing w:before="19" w:line="254" w:lineRule="auto"/>
@@ -2220,10 +2254,38 @@
         <w:rPr>
           <w:color w:val="1B033C"/>
         </w:rPr>
-        <w:t>Engineered a scalable social media orchestration platform for scheduling and content distribution across multiple channels (Twitter, LinkedIn, Threads). The application features a rich-text "Content Studio", a drag-and-drop bulk scheduler with timezone precision, and granular Admin/User RBAC. using Supabase Edge Functions for complex backend logic and secured via Row Level Security (RLS) with Trained Ai content writer bot</w:t>
+        <w:t xml:space="preserve">Engineered a scalable social media orchestration platform for scheduling and content distribution across multiple channels (Twitter, LinkedIn, Threads). The application features a rich-text "Content Studio", a drag-and-drop bulk scheduler with </w:t>
+      </w:r>
+      <w:proofErr w:type="spellStart"/>
+      <w:r>
+        <w:rPr>
+          <w:color w:val="1B033C"/>
+        </w:rPr>
+        <w:t>timezone</w:t>
+      </w:r>
+      <w:proofErr w:type="spellEnd"/>
+      <w:r>
+        <w:rPr>
+          <w:color w:val="1B033C"/>
+        </w:rPr>
+        <w:t xml:space="preserve"> precision, and granular Admin/User RBAC. using </w:t>
+      </w:r>
+      <w:proofErr w:type="spellStart"/>
+      <w:r>
+        <w:rPr>
+          <w:color w:val="1B033C"/>
+        </w:rPr>
+        <w:t>Supabase</w:t>
+      </w:r>
+      <w:proofErr w:type="spellEnd"/>
+      <w:r>
+        <w:rPr>
+          <w:color w:val="1B033C"/>
+        </w:rPr>
+        <w:t xml:space="preserve"> Edge Functions for complex backend logic and secured via Row Level Security (RLS) with Trained Ai content writer bot</w:t>
       </w:r>
     </w:p>
-    <w:p xmlns:wp14="http://schemas.microsoft.com/office/word/2010/wordml" wp14:textId="77777777">
+    <w:p>
       <w:pPr>
         <w:pStyle w:val="BodyText"/>
         <w:spacing w:before="58"/>
@@ -2247,7 +2309,7 @@
           <w:color w:val="1B033C"/>
           <w:spacing w:val="-11"/>
         </w:rPr>
-        <w:t> </w:t>
+        <w:t xml:space="preserve"> </w:t>
       </w:r>
       <w:r>
         <w:rPr>
@@ -2266,7 +2328,7 @@
           <w:color w:val="1B033C"/>
           <w:spacing w:val="-11"/>
         </w:rPr>
-        <w:t> </w:t>
+        <w:t xml:space="preserve"> </w:t>
       </w:r>
       <w:r>
         <w:rPr>
@@ -2279,7 +2341,7 @@
           <w:color w:val="1B033C"/>
           <w:spacing w:val="-11"/>
         </w:rPr>
-        <w:t> </w:t>
+        <w:t xml:space="preserve"> </w:t>
       </w:r>
       <w:r>
         <w:rPr>
@@ -2292,7 +2354,7 @@
           <w:color w:val="1B033C"/>
           <w:spacing w:val="-11"/>
         </w:rPr>
-        <w:t> </w:t>
+        <w:t xml:space="preserve"> </w:t>
       </w:r>
       <w:r>
         <w:rPr>
@@ -2305,7 +2367,7 @@
           <w:color w:val="1B033C"/>
           <w:spacing w:val="-11"/>
         </w:rPr>
-        <w:t> </w:t>
+        <w:t xml:space="preserve"> </w:t>
       </w:r>
       <w:r>
         <w:rPr>
@@ -2318,7 +2380,7 @@
           <w:color w:val="1B033C"/>
           <w:spacing w:val="-11"/>
         </w:rPr>
-        <w:t> </w:t>
+        <w:t xml:space="preserve"> </w:t>
       </w:r>
       <w:r>
         <w:rPr>
@@ -2331,20 +2393,28 @@
           <w:color w:val="1B033C"/>
           <w:spacing w:val="-11"/>
         </w:rPr>
-        <w:t> </w:t>
-      </w:r>
-      <w:r>
-        <w:rPr>
-          <w:color w:val="1B033C"/>
-        </w:rPr>
-        <w:t>Supabase,</w:t>
+        <w:t xml:space="preserve"> </w:t>
+      </w:r>
+      <w:proofErr w:type="spellStart"/>
+      <w:r>
+        <w:rPr>
+          <w:color w:val="1B033C"/>
+        </w:rPr>
+        <w:t>Supabase</w:t>
+      </w:r>
+      <w:proofErr w:type="spellEnd"/>
+      <w:r>
+        <w:rPr>
+          <w:color w:val="1B033C"/>
+        </w:rPr>
+        <w:t>,</w:t>
       </w:r>
       <w:r>
         <w:rPr>
           <w:color w:val="1B033C"/>
           <w:spacing w:val="-11"/>
         </w:rPr>
-        <w:t> </w:t>
+        <w:t xml:space="preserve"> </w:t>
       </w:r>
       <w:r>
         <w:rPr>
@@ -2357,7 +2427,7 @@
           <w:color w:val="1B033C"/>
           <w:spacing w:val="-11"/>
         </w:rPr>
-        <w:t> </w:t>
+        <w:t xml:space="preserve"> </w:t>
       </w:r>
       <w:r>
         <w:rPr>
@@ -2370,7 +2440,7 @@
           <w:color w:val="1B033C"/>
           <w:spacing w:val="-11"/>
         </w:rPr>
-        <w:t> </w:t>
+        <w:t xml:space="preserve"> </w:t>
       </w:r>
       <w:r>
         <w:rPr>
@@ -2383,21 +2453,30 @@
           <w:color w:val="1B033C"/>
           <w:spacing w:val="-11"/>
         </w:rPr>
-        <w:t> </w:t>
-      </w:r>
-      <w:r>
-        <w:rPr>
-          <w:color w:val="1B033C"/>
-        </w:rPr>
-        <w:t>Zustand,</w:t>
+        <w:t xml:space="preserve"> </w:t>
+      </w:r>
+      <w:proofErr w:type="spellStart"/>
+      <w:r>
+        <w:rPr>
+          <w:color w:val="1B033C"/>
+        </w:rPr>
+        <w:t>Zustand</w:t>
+      </w:r>
+      <w:proofErr w:type="spellEnd"/>
+      <w:r>
+        <w:rPr>
+          <w:color w:val="1B033C"/>
+        </w:rPr>
+        <w:t>,</w:t>
       </w:r>
       <w:r>
         <w:rPr>
           <w:color w:val="1B033C"/>
           <w:spacing w:val="-11"/>
         </w:rPr>
-        <w:t> </w:t>
-      </w:r>
+        <w:t xml:space="preserve"> </w:t>
+      </w:r>
+      <w:proofErr w:type="spellStart"/>
       <w:r>
         <w:rPr>
           <w:color w:val="1B033C"/>
@@ -2405,8 +2484,9 @@
         </w:rPr>
         <w:t>Vercel</w:t>
       </w:r>
+      <w:proofErr w:type="spellEnd"/>
     </w:p>
-    <w:p xmlns:wp14="http://schemas.microsoft.com/office/word/2010/wordml" wp14:textId="77777777">
+    <w:p>
       <w:pPr>
         <w:pStyle w:val="ListParagraph"/>
         <w:numPr>
@@ -2414,18 +2494,18 @@
           <w:numId w:val="1"/>
         </w:numPr>
         <w:tabs>
-          <w:tab w:val="left" w:leader="none" w:pos="418"/>
-          <w:tab w:val="left" w:leader="none" w:pos="2188"/>
+          <w:tab w:val="left" w:pos="418"/>
+          <w:tab w:val="left" w:pos="2188"/>
         </w:tabs>
-        <w:spacing w:before="70" w:after="0" w:line="240" w:lineRule="auto"/>
-        <w:ind w:left="418" w:right="0" w:hanging="179"/>
-        <w:jc w:val="left"/>
+        <w:spacing w:before="70"/>
+        <w:ind w:left="418" w:hanging="179"/>
         <w:rPr>
           <w:rFonts w:ascii="Arial" w:hAnsi="Arial"/>
           <w:i/>
           <w:sz w:val="20"/>
         </w:rPr>
       </w:pPr>
+      <w:proofErr w:type="spellStart"/>
       <w:r>
         <w:rPr>
           <w:rFonts w:ascii="Arial" w:hAnsi="Arial"/>
@@ -2435,6 +2515,7 @@
         </w:rPr>
         <w:t>Tingy</w:t>
       </w:r>
+      <w:proofErr w:type="spellEnd"/>
       <w:r>
         <w:rPr>
           <w:rFonts w:ascii="Arial" w:hAnsi="Arial"/>
@@ -2443,7 +2524,7 @@
           <w:spacing w:val="-8"/>
           <w:sz w:val="20"/>
         </w:rPr>
-        <w:t> </w:t>
+        <w:t xml:space="preserve"> </w:t>
       </w:r>
       <w:r>
         <w:rPr>
@@ -2464,7 +2545,8 @@
         </w:rPr>
         <w:tab/>
       </w:r>
-      <w:hyperlink r:id="rId13">
+      <w:hyperlink r:id="rId12">
+        <w:proofErr w:type="spellStart"/>
         <w:r>
           <w:rPr>
             <w:rFonts w:ascii="Arial" w:hAnsi="Arial"/>
@@ -2474,6 +2556,7 @@
           </w:rPr>
           <w:t>OpenSource</w:t>
         </w:r>
+        <w:proofErr w:type="spellEnd"/>
       </w:hyperlink>
       <w:r>
         <w:rPr>
@@ -2483,7 +2566,7 @@
           <w:spacing w:val="-7"/>
           <w:sz w:val="20"/>
         </w:rPr>
-        <w:t> </w:t>
+        <w:t xml:space="preserve"> </w:t>
       </w:r>
       <w:r>
         <w:rPr>
@@ -2500,9 +2583,9 @@
           <w:spacing w:val="-3"/>
           <w:sz w:val="20"/>
         </w:rPr>
-        <w:t> </w:t>
-      </w:r>
-      <w:hyperlink r:id="rId14">
+        <w:t xml:space="preserve"> </w:t>
+      </w:r>
+      <w:hyperlink r:id="rId13">
         <w:r>
           <w:rPr>
             <w:rFonts w:ascii="Arial" w:hAnsi="Arial"/>
@@ -2520,8 +2603,9 @@
             <w:spacing w:val="-4"/>
             <w:sz w:val="20"/>
           </w:rPr>
-          <w:t> </w:t>
+          <w:t xml:space="preserve"> </w:t>
         </w:r>
+        <w:proofErr w:type="spellStart"/>
         <w:r>
           <w:rPr>
             <w:rFonts w:ascii="Arial" w:hAnsi="Arial"/>
@@ -2531,6 +2615,7 @@
           </w:rPr>
           <w:t>Url</w:t>
         </w:r>
+        <w:proofErr w:type="spellEnd"/>
       </w:hyperlink>
       <w:r>
         <w:rPr>
@@ -2540,7 +2625,7 @@
           <w:spacing w:val="-4"/>
           <w:sz w:val="20"/>
         </w:rPr>
-        <w:t> </w:t>
+        <w:t xml:space="preserve"> </w:t>
       </w:r>
       <w:r>
         <w:rPr>
@@ -2557,7 +2642,7 @@
           <w:spacing w:val="-3"/>
           <w:sz w:val="20"/>
         </w:rPr>
-        <w:t> </w:t>
+        <w:t xml:space="preserve"> </w:t>
       </w:r>
       <w:r>
         <w:rPr>
@@ -2570,7 +2655,7 @@
         <w:t>Walkthrough</w:t>
       </w:r>
     </w:p>
-    <w:p xmlns:wp14="http://schemas.microsoft.com/office/word/2010/wordml" wp14:textId="77777777">
+    <w:p>
       <w:pPr>
         <w:pStyle w:val="BodyText"/>
         <w:spacing w:before="19" w:line="249" w:lineRule="auto"/>
@@ -2587,7 +2672,7 @@
           <w:color w:val="1B033C"/>
           <w:spacing w:val="-10"/>
         </w:rPr>
-        <w:t> </w:t>
+        <w:t xml:space="preserve"> </w:t>
       </w:r>
       <w:r>
         <w:rPr>
@@ -2600,7 +2685,7 @@
           <w:color w:val="1B033C"/>
           <w:spacing w:val="-10"/>
         </w:rPr>
-        <w:t> </w:t>
+        <w:t xml:space="preserve"> </w:t>
       </w:r>
       <w:r>
         <w:rPr>
@@ -2613,7 +2698,7 @@
           <w:color w:val="1B033C"/>
           <w:spacing w:val="-10"/>
         </w:rPr>
-        <w:t> </w:t>
+        <w:t xml:space="preserve"> </w:t>
       </w:r>
       <w:r>
         <w:rPr>
@@ -2626,7 +2711,7 @@
           <w:color w:val="1B033C"/>
           <w:spacing w:val="-10"/>
         </w:rPr>
-        <w:t> </w:t>
+        <w:t xml:space="preserve"> </w:t>
       </w:r>
       <w:r>
         <w:rPr>
@@ -2639,7 +2724,7 @@
           <w:color w:val="1B033C"/>
           <w:spacing w:val="-10"/>
         </w:rPr>
-        <w:t> </w:t>
+        <w:t xml:space="preserve"> </w:t>
       </w:r>
       <w:r>
         <w:rPr>
@@ -2652,7 +2737,7 @@
           <w:color w:val="1B033C"/>
           <w:spacing w:val="-10"/>
         </w:rPr>
-        <w:t> </w:t>
+        <w:t xml:space="preserve"> </w:t>
       </w:r>
       <w:r>
         <w:rPr>
@@ -2665,7 +2750,7 @@
           <w:color w:val="1B033C"/>
           <w:spacing w:val="-10"/>
         </w:rPr>
-        <w:t> </w:t>
+        <w:t xml:space="preserve"> </w:t>
       </w:r>
       <w:r>
         <w:rPr>
@@ -2678,7 +2763,7 @@
           <w:color w:val="1B033C"/>
           <w:spacing w:val="-10"/>
         </w:rPr>
-        <w:t> </w:t>
+        <w:t xml:space="preserve"> </w:t>
       </w:r>
       <w:r>
         <w:rPr>
@@ -2691,7 +2776,7 @@
           <w:color w:val="1B033C"/>
           <w:spacing w:val="-10"/>
         </w:rPr>
-        <w:t> </w:t>
+        <w:t xml:space="preserve"> </w:t>
       </w:r>
       <w:r>
         <w:rPr>
@@ -2704,7 +2789,7 @@
           <w:color w:val="1B033C"/>
           <w:spacing w:val="-10"/>
         </w:rPr>
-        <w:t> </w:t>
+        <w:t xml:space="preserve"> </w:t>
       </w:r>
       <w:r>
         <w:rPr>
@@ -2717,40 +2802,54 @@
           <w:color w:val="1B033C"/>
           <w:spacing w:val="-10"/>
         </w:rPr>
-        <w:t> </w:t>
-      </w:r>
-      <w:r>
-        <w:rPr>
-          <w:color w:val="1B033C"/>
-        </w:rPr>
-        <w:t>(WebP,</w:t>
+        <w:t xml:space="preserve"> </w:t>
+      </w:r>
+      <w:r>
+        <w:rPr>
+          <w:color w:val="1B033C"/>
+        </w:rPr>
+        <w:t>(</w:t>
+      </w:r>
+      <w:proofErr w:type="spellStart"/>
+      <w:r>
+        <w:rPr>
+          <w:color w:val="1B033C"/>
+        </w:rPr>
+        <w:t>WebP</w:t>
+      </w:r>
+      <w:proofErr w:type="spellEnd"/>
+      <w:r>
+        <w:rPr>
+          <w:color w:val="1B033C"/>
+        </w:rPr>
+        <w:t>,</w:t>
       </w:r>
       <w:r>
         <w:rPr>
           <w:color w:val="1B033C"/>
           <w:spacing w:val="-10"/>
         </w:rPr>
-        <w:t> </w:t>
-      </w:r>
-      <w:r>
-        <w:rPr>
-          <w:color w:val="1B033C"/>
-        </w:rPr>
-        <w:t>AVIF, JPG) by up to 90% without quality loss. Engineered a robust server-side compression system using </w:t>
-      </w:r>
-      <w:r>
-        <w:rPr>
-          <w:rFonts w:ascii="Arial"/>
-          <w:b/>
-          <w:color w:val="1B033C"/>
-        </w:rPr>
-        <w:t>Next.js API Routes </w:t>
-      </w:r>
-      <w:r>
-        <w:rPr>
-          <w:color w:val="1B033C"/>
-        </w:rPr>
-        <w:t>and </w:t>
+        <w:t xml:space="preserve"> </w:t>
+      </w:r>
+      <w:r>
+        <w:rPr>
+          <w:color w:val="1B033C"/>
+        </w:rPr>
+        <w:t xml:space="preserve">AVIF, JPG) by up to 90% without quality loss. Engineered a robust server-side compression system using </w:t>
+      </w:r>
+      <w:r>
+        <w:rPr>
+          <w:rFonts w:ascii="Arial"/>
+          <w:b/>
+          <w:color w:val="1B033C"/>
+        </w:rPr>
+        <w:t xml:space="preserve">Next.js API Routes </w:t>
+      </w:r>
+      <w:r>
+        <w:rPr>
+          <w:color w:val="1B033C"/>
+        </w:rPr>
+        <w:t xml:space="preserve">and </w:t>
       </w:r>
       <w:r>
         <w:rPr>
@@ -2764,15 +2863,15 @@
         <w:rPr>
           <w:color w:val="1B033C"/>
         </w:rPr>
-        <w:t>, utilizing binary search algorithms to hit precise target file sizes. </w:t>
-      </w:r>
-      <w:r>
-        <w:rPr>
-          <w:rFonts w:ascii="Arial"/>
-          <w:b/>
-          <w:color w:val="1B033C"/>
-        </w:rPr>
-        <w:t>UI/UX: </w:t>
+        <w:t xml:space="preserve">, utilizing binary search algorithms to hit precise target file sizes. </w:t>
+      </w:r>
+      <w:r>
+        <w:rPr>
+          <w:rFonts w:ascii="Arial"/>
+          <w:b/>
+          <w:color w:val="1B033C"/>
+        </w:rPr>
+        <w:t xml:space="preserve">UI/UX: </w:t>
       </w:r>
       <w:r>
         <w:rPr>
@@ -2781,7 +2880,7 @@
         <w:t>Built a responsive,</w:t>
       </w:r>
     </w:p>
-    <w:p xmlns:wp14="http://schemas.microsoft.com/office/word/2010/wordml" wp14:textId="77777777">
+    <w:p>
       <w:pPr>
         <w:pStyle w:val="BodyText"/>
         <w:spacing w:before="1"/>
@@ -2798,7 +2897,7 @@
           <w:color w:val="1B033C"/>
           <w:spacing w:val="-11"/>
         </w:rPr>
-        <w:t> </w:t>
+        <w:t xml:space="preserve"> </w:t>
       </w:r>
       <w:r>
         <w:rPr>
@@ -2811,7 +2910,7 @@
           <w:color w:val="1B033C"/>
           <w:spacing w:val="-11"/>
         </w:rPr>
-        <w:t> </w:t>
+        <w:t xml:space="preserve"> </w:t>
       </w:r>
       <w:r>
         <w:rPr>
@@ -2821,7 +2920,7 @@
         <w:t>.</w:t>
       </w:r>
     </w:p>
-    <w:p xmlns:wp14="http://schemas.microsoft.com/office/word/2010/wordml" wp14:textId="77777777">
+    <w:p>
       <w:pPr>
         <w:pStyle w:val="BodyText"/>
         <w:spacing w:before="106" w:line="254" w:lineRule="auto"/>
@@ -2844,7 +2943,7 @@
           <w:color w:val="1B033C"/>
           <w:spacing w:val="40"/>
         </w:rPr>
-        <w:t> </w:t>
+        <w:t xml:space="preserve"> </w:t>
       </w:r>
       <w:r>
         <w:rPr>
@@ -2863,7 +2962,7 @@
           <w:color w:val="1B033C"/>
           <w:spacing w:val="40"/>
         </w:rPr>
-        <w:t> </w:t>
+        <w:t xml:space="preserve"> </w:t>
       </w:r>
       <w:r>
         <w:rPr>
@@ -2876,7 +2975,7 @@
           <w:color w:val="1B033C"/>
           <w:spacing w:val="40"/>
         </w:rPr>
-        <w:t> </w:t>
+        <w:t xml:space="preserve"> </w:t>
       </w:r>
       <w:r>
         <w:rPr>
@@ -2889,7 +2988,7 @@
           <w:color w:val="1B033C"/>
           <w:spacing w:val="40"/>
         </w:rPr>
-        <w:t> </w:t>
+        <w:t xml:space="preserve"> </w:t>
       </w:r>
       <w:r>
         <w:rPr>
@@ -2902,7 +3001,7 @@
           <w:color w:val="1B033C"/>
           <w:spacing w:val="40"/>
         </w:rPr>
-        <w:t> </w:t>
+        <w:t xml:space="preserve"> </w:t>
       </w:r>
       <w:r>
         <w:rPr>
@@ -2915,7 +3014,7 @@
           <w:color w:val="1B033C"/>
           <w:spacing w:val="36"/>
         </w:rPr>
-        <w:t> </w:t>
+        <w:t xml:space="preserve"> </w:t>
       </w:r>
       <w:r>
         <w:rPr>
@@ -2928,7 +3027,7 @@
           <w:color w:val="1B033C"/>
           <w:spacing w:val="36"/>
         </w:rPr>
-        <w:t> </w:t>
+        <w:t xml:space="preserve"> </w:t>
       </w:r>
       <w:r>
         <w:rPr>
@@ -2941,7 +3040,7 @@
           <w:color w:val="1B033C"/>
           <w:spacing w:val="36"/>
         </w:rPr>
-        <w:t> </w:t>
+        <w:t xml:space="preserve"> </w:t>
       </w:r>
       <w:r>
         <w:rPr>
@@ -2954,7 +3053,7 @@
           <w:color w:val="1B033C"/>
           <w:spacing w:val="36"/>
         </w:rPr>
-        <w:t> </w:t>
+        <w:t xml:space="preserve"> </w:t>
       </w:r>
       <w:r>
         <w:rPr>
@@ -2967,7 +3066,7 @@
           <w:color w:val="1B033C"/>
           <w:spacing w:val="36"/>
         </w:rPr>
-        <w:t> </w:t>
+        <w:t xml:space="preserve"> </w:t>
       </w:r>
       <w:r>
         <w:rPr>
@@ -2980,7 +3079,7 @@
           <w:color w:val="1B033C"/>
           <w:spacing w:val="36"/>
         </w:rPr>
-        <w:t> </w:t>
+        <w:t xml:space="preserve"> </w:t>
       </w:r>
       <w:r>
         <w:rPr>
@@ -2993,7 +3092,7 @@
           <w:color w:val="1B033C"/>
           <w:spacing w:val="36"/>
         </w:rPr>
-        <w:t> </w:t>
+        <w:t xml:space="preserve"> </w:t>
       </w:r>
       <w:r>
         <w:rPr>
@@ -3006,7 +3105,7 @@
           <w:color w:val="1B033C"/>
           <w:spacing w:val="36"/>
         </w:rPr>
-        <w:t> </w:t>
+        <w:t xml:space="preserve"> </w:t>
       </w:r>
       <w:r>
         <w:rPr>
@@ -3019,13 +3118,21 @@
           <w:color w:val="1B033C"/>
           <w:spacing w:val="36"/>
         </w:rPr>
-        <w:t> </w:t>
-      </w:r>
-      <w:r>
-        <w:rPr>
-          <w:color w:val="1B033C"/>
-        </w:rPr>
-        <w:t>Vercel </w:t>
+        <w:t xml:space="preserve"> </w:t>
+      </w:r>
+      <w:proofErr w:type="spellStart"/>
+      <w:r>
+        <w:rPr>
+          <w:color w:val="1B033C"/>
+        </w:rPr>
+        <w:t>Vercel</w:t>
+      </w:r>
+      <w:proofErr w:type="spellEnd"/>
+      <w:r>
+        <w:rPr>
+          <w:color w:val="1B033C"/>
+        </w:rPr>
+        <w:t xml:space="preserve"> </w:t>
       </w:r>
       <w:r>
         <w:rPr>
@@ -3037,21 +3144,21 @@
     </w:p>
     <w:sectPr>
       <w:type w:val="continuous"/>
-      <w:pgSz w:w="11920" w:h="16840" w:orient="portrait"/>
-      <w:pgMar w:top="1380" w:right="566" w:bottom="280" w:left="566"/>
-      <w:cols w:num="1"/>
+      <w:pgSz w:w="11920" w:h="16840"/>
+      <w:pgMar w:top="1380" w:right="566" w:bottom="280" w:left="566" w:header="720" w:footer="720" w:gutter="0"/>
+      <w:cols w:space="720"/>
     </w:sectPr>
   </w:body>
 </w:document>
 </file>
 
 <file path=word/numbering.xml><?xml version="1.0" encoding="utf-8"?>
-<w:numbering xmlns:ve="http://schemas.openxmlformats.org/markup-compatibility/2006" xmlns:o="urn:schemas-microsoft-com:office:office" xmlns:r="http://schemas.openxmlformats.org/officeDocument/2006/relationships" xmlns:m="http://schemas.openxmlformats.org/officeDocument/2006/math" xmlns:v="urn:schemas-microsoft-com:vml" xmlns:wp="http://schemas.openxmlformats.org/drawingml/2006/wordprocessingDrawing" xmlns:w10="urn:schemas-microsoft-com:office:word" xmlns:w="http://schemas.openxmlformats.org/wordprocessingml/2006/main" xmlns:wne="http://schemas.microsoft.com/office/word/2006/wordml">
-  <w:abstractNum w:abstractNumId="0">
-    <w:nsid w:val="3aa5faa0"/>
+<w:numbering xmlns:wpc="http://schemas.microsoft.com/office/word/2010/wordprocessingCanvas" xmlns:cx="http://schemas.microsoft.com/office/drawing/2014/chartex" xmlns:cx1="http://schemas.microsoft.com/office/drawing/2015/9/8/chartex" xmlns:cx2="http://schemas.microsoft.com/office/drawing/2015/10/21/chartex" xmlns:cx3="http://schemas.microsoft.com/office/drawing/2016/5/9/chartex" xmlns:cx4="http://schemas.microsoft.com/office/drawing/2016/5/10/chartex" xmlns:cx5="http://schemas.microsoft.com/office/drawing/2016/5/11/chartex" xmlns:cx6="http://schemas.microsoft.com/office/drawing/2016/5/12/chartex" xmlns:cx7="http://schemas.microsoft.com/office/drawing/2016/5/13/chartex" xmlns:cx8="http://schemas.microsoft.com/office/drawing/2016/5/14/chartex" xmlns:mc="http://schemas.openxmlformats.org/markup-compatibility/2006" xmlns:aink="http://schemas.microsoft.com/office/drawing/2016/ink" xmlns:am3d="http://schemas.microsoft.com/office/drawing/2017/model3d" xmlns:o="urn:schemas-microsoft-com:office:office" xmlns:oel="http://schemas.microsoft.com/office/2019/extlst" xmlns:r="http://schemas.openxmlformats.org/officeDocument/2006/relationships" xmlns:m="http://schemas.openxmlformats.org/officeDocument/2006/math" xmlns:v="urn:schemas-microsoft-com:vml" xmlns:wp14="http://schemas.microsoft.com/office/word/2010/wordprocessingDrawing" xmlns:wp="http://schemas.openxmlformats.org/drawingml/2006/wordprocessingDrawing" xmlns:w10="urn:schemas-microsoft-com:office:word" xmlns:w="http://schemas.openxmlformats.org/wordprocessingml/2006/main" xmlns:w14="http://schemas.microsoft.com/office/word/2010/wordml" xmlns:w15="http://schemas.microsoft.com/office/word/2012/wordml" xmlns:w16cex="http://schemas.microsoft.com/office/word/2018/wordml/cex" xmlns:w16cid="http://schemas.microsoft.com/office/word/2016/wordml/cid" xmlns:w16="http://schemas.microsoft.com/office/word/2018/wordml" xmlns:w16du="http://schemas.microsoft.com/office/word/2023/wordml/word16du" xmlns:w16sdtdh="http://schemas.microsoft.com/office/word/2020/wordml/sdtdatahash" xmlns:w16sdtfl="http://schemas.microsoft.com/office/word/2024/wordml/sdtformatlock" xmlns:w16se="http://schemas.microsoft.com/office/word/2015/wordml/symex" xmlns:wpg="http://schemas.microsoft.com/office/word/2010/wordprocessingGroup" xmlns:wpi="http://schemas.microsoft.com/office/word/2010/wordprocessingInk" xmlns:wne="http://schemas.microsoft.com/office/word/2006/wordml" xmlns:wps="http://schemas.microsoft.com/office/word/2010/wordprocessingShape" mc:Ignorable="w14 w15 w16se w16cid w16 w16cex w16sdtdh w16sdtfl w16du wp14">
+  <w:abstractNum w:abstractNumId="0" w15:restartNumberingAfterBreak="0">
+    <w:nsid w:val="3AA5FAA0"/>
     <w:multiLevelType w:val="hybridMultilevel"/>
-    <w:lvl w:ilvl="0">
-      <w:start w:val="0"/>
+    <w:tmpl w:val="93849D5A"/>
+    <w:lvl w:ilvl="0" w:tplc="20525F82">
       <w:numFmt w:val="bullet"/>
       <w:lvlText w:val="•"/>
       <w:lvlJc w:val="left"/>
@@ -3059,7 +3166,7 @@
         <w:ind w:left="419" w:hanging="180"/>
       </w:pPr>
       <w:rPr>
-        <w:rFonts w:hint="default" w:ascii="Arial MT" w:hAnsi="Arial MT" w:eastAsia="Arial MT" w:cs="Arial MT"/>
+        <w:rFonts w:ascii="Arial MT" w:eastAsia="Arial MT" w:hAnsi="Arial MT" w:cs="Arial MT" w:hint="default"/>
         <w:b w:val="0"/>
         <w:bCs w:val="0"/>
         <w:i w:val="0"/>
@@ -3072,8 +3179,7 @@
         <w:lang w:val="en-US" w:eastAsia="en-US" w:bidi="ar-SA"/>
       </w:rPr>
     </w:lvl>
-    <w:lvl w:ilvl="1">
-      <w:start w:val="0"/>
+    <w:lvl w:ilvl="1" w:tplc="54EEA5BC">
       <w:numFmt w:val="bullet"/>
       <w:lvlText w:val="•"/>
       <w:lvlJc w:val="left"/>
@@ -3085,8 +3191,7 @@
         <w:lang w:val="en-US" w:eastAsia="en-US" w:bidi="ar-SA"/>
       </w:rPr>
     </w:lvl>
-    <w:lvl w:ilvl="2">
-      <w:start w:val="0"/>
+    <w:lvl w:ilvl="2" w:tplc="9BC2F618">
       <w:numFmt w:val="bullet"/>
       <w:lvlText w:val="•"/>
       <w:lvlJc w:val="left"/>
@@ -3098,8 +3203,7 @@
         <w:lang w:val="en-US" w:eastAsia="en-US" w:bidi="ar-SA"/>
       </w:rPr>
     </w:lvl>
-    <w:lvl w:ilvl="3">
-      <w:start w:val="0"/>
+    <w:lvl w:ilvl="3" w:tplc="9B84AF58">
       <w:numFmt w:val="bullet"/>
       <w:lvlText w:val="•"/>
       <w:lvlJc w:val="left"/>
@@ -3111,8 +3215,7 @@
         <w:lang w:val="en-US" w:eastAsia="en-US" w:bidi="ar-SA"/>
       </w:rPr>
     </w:lvl>
-    <w:lvl w:ilvl="4">
-      <w:start w:val="0"/>
+    <w:lvl w:ilvl="4" w:tplc="7794ED1A">
       <w:numFmt w:val="bullet"/>
       <w:lvlText w:val="•"/>
       <w:lvlJc w:val="left"/>
@@ -3124,8 +3227,7 @@
         <w:lang w:val="en-US" w:eastAsia="en-US" w:bidi="ar-SA"/>
       </w:rPr>
     </w:lvl>
-    <w:lvl w:ilvl="5">
-      <w:start w:val="0"/>
+    <w:lvl w:ilvl="5" w:tplc="A2B0AAF4">
       <w:numFmt w:val="bullet"/>
       <w:lvlText w:val="•"/>
       <w:lvlJc w:val="left"/>
@@ -3137,8 +3239,7 @@
         <w:lang w:val="en-US" w:eastAsia="en-US" w:bidi="ar-SA"/>
       </w:rPr>
     </w:lvl>
-    <w:lvl w:ilvl="6">
-      <w:start w:val="0"/>
+    <w:lvl w:ilvl="6" w:tplc="01FED596">
       <w:numFmt w:val="bullet"/>
       <w:lvlText w:val="•"/>
       <w:lvlJc w:val="left"/>
@@ -3150,8 +3251,7 @@
         <w:lang w:val="en-US" w:eastAsia="en-US" w:bidi="ar-SA"/>
       </w:rPr>
     </w:lvl>
-    <w:lvl w:ilvl="7">
-      <w:start w:val="0"/>
+    <w:lvl w:ilvl="7" w:tplc="6AA82936">
       <w:numFmt w:val="bullet"/>
       <w:lvlText w:val="•"/>
       <w:lvlJc w:val="left"/>
@@ -3163,8 +3263,7 @@
         <w:lang w:val="en-US" w:eastAsia="en-US" w:bidi="ar-SA"/>
       </w:rPr>
     </w:lvl>
-    <w:lvl w:ilvl="8">
-      <w:start w:val="0"/>
+    <w:lvl w:ilvl="8" w:tplc="64F46084">
       <w:numFmt w:val="bullet"/>
       <w:lvlText w:val="•"/>
       <w:lvlJc w:val="left"/>
@@ -3177,18 +3276,18 @@
       </w:rPr>
     </w:lvl>
   </w:abstractNum>
-  <w:num w:numId="1">
+  <w:num w:numId="1" w16cid:durableId="932130129">
     <w:abstractNumId w:val="0"/>
   </w:num>
 </w:numbering>
 </file>
 
 <file path=word/styles.xml><?xml version="1.0" encoding="utf-8"?>
-<w:styles xmlns:w14="http://schemas.microsoft.com/office/word/2010/wordml" xmlns:wp14="http://schemas.microsoft.com/office/word/2010/wordprocessingDrawing" xmlns:r="http://schemas.openxmlformats.org/officeDocument/2006/relationships" xmlns:w="http://schemas.openxmlformats.org/wordprocessingml/2006/main" xmlns:mc="http://schemas.openxmlformats.org/markup-compatibility/2006" mc:Ignorable="w14 wp14">
+<w:styles xmlns:mc="http://schemas.openxmlformats.org/markup-compatibility/2006" xmlns:r="http://schemas.openxmlformats.org/officeDocument/2006/relationships" xmlns:w="http://schemas.openxmlformats.org/wordprocessingml/2006/main" xmlns:w14="http://schemas.microsoft.com/office/word/2010/wordml" xmlns:w15="http://schemas.microsoft.com/office/word/2012/wordml" xmlns:w16cex="http://schemas.microsoft.com/office/word/2018/wordml/cex" xmlns:w16cid="http://schemas.microsoft.com/office/word/2016/wordml/cid" xmlns:w16="http://schemas.microsoft.com/office/word/2018/wordml" xmlns:w16du="http://schemas.microsoft.com/office/word/2023/wordml/word16du" xmlns:w16sdtdh="http://schemas.microsoft.com/office/word/2020/wordml/sdtdatahash" xmlns:w16sdtfl="http://schemas.microsoft.com/office/word/2024/wordml/sdtformatlock" xmlns:w16se="http://schemas.microsoft.com/office/word/2015/wordml/symex" mc:Ignorable="w14 w15 w16se w16cid w16 w16cex w16sdtdh w16sdtfl w16du">
   <w:docDefaults>
     <w:rPrDefault>
       <w:rPr>
-        <w:rFonts w:asciiTheme="minorHAnsi" w:hAnsiTheme="minorHAnsi" w:eastAsiaTheme="minorHAnsi" w:cstheme="minorBidi"/>
+        <w:rFonts w:asciiTheme="minorHAnsi" w:eastAsiaTheme="minorHAnsi" w:hAnsiTheme="minorHAnsi" w:cstheme="minorBidi"/>
         <w:sz w:val="22"/>
         <w:szCs w:val="22"/>
         <w:lang w:val="en-US" w:eastAsia="en-US" w:bidi="ar-SA"/>
@@ -3199,49 +3298,434 @@
         <w:widowControl w:val="0"/>
         <w:autoSpaceDE w:val="0"/>
         <w:autoSpaceDN w:val="0"/>
-        <w:spacing w:before="0" w:after="0" w:line="240" w:lineRule="auto"/>
-        <w:ind w:left="0" w:right="0"/>
-        <w:jc w:val="left"/>
       </w:pPr>
     </w:pPrDefault>
   </w:docDefaults>
-  <w:style w:type="character" w:styleId="DefaultParagraphFont" w:default="1">
+  <w:latentStyles w:defLockedState="0" w:defUIPriority="99" w:defSemiHidden="0" w:defUnhideWhenUsed="0" w:defQFormat="0" w:count="376">
+    <w:lsdException w:name="Normal" w:uiPriority="0" w:qFormat="1"/>
+    <w:lsdException w:name="heading 1" w:uiPriority="9" w:qFormat="1"/>
+    <w:lsdException w:name="heading 2" w:semiHidden="1" w:uiPriority="9" w:unhideWhenUsed="1" w:qFormat="1"/>
+    <w:lsdException w:name="heading 3" w:semiHidden="1" w:uiPriority="9" w:unhideWhenUsed="1" w:qFormat="1"/>
+    <w:lsdException w:name="heading 4" w:semiHidden="1" w:uiPriority="9" w:unhideWhenUsed="1" w:qFormat="1"/>
+    <w:lsdException w:name="heading 5" w:semiHidden="1" w:uiPriority="9" w:unhideWhenUsed="1" w:qFormat="1"/>
+    <w:lsdException w:name="heading 6" w:semiHidden="1" w:uiPriority="9" w:unhideWhenUsed="1" w:qFormat="1"/>
+    <w:lsdException w:name="heading 7" w:semiHidden="1" w:uiPriority="9" w:unhideWhenUsed="1" w:qFormat="1"/>
+    <w:lsdException w:name="heading 8" w:semiHidden="1" w:uiPriority="9" w:unhideWhenUsed="1" w:qFormat="1"/>
+    <w:lsdException w:name="heading 9" w:semiHidden="1" w:uiPriority="9" w:unhideWhenUsed="1" w:qFormat="1"/>
+    <w:lsdException w:name="index 1" w:semiHidden="1" w:unhideWhenUsed="1"/>
+    <w:lsdException w:name="index 2" w:semiHidden="1" w:unhideWhenUsed="1"/>
+    <w:lsdException w:name="index 3" w:semiHidden="1" w:unhideWhenUsed="1"/>
+    <w:lsdException w:name="index 4" w:semiHidden="1" w:unhideWhenUsed="1"/>
+    <w:lsdException w:name="index 5" w:semiHidden="1" w:unhideWhenUsed="1"/>
+    <w:lsdException w:name="index 6" w:semiHidden="1" w:unhideWhenUsed="1"/>
+    <w:lsdException w:name="index 7" w:semiHidden="1" w:unhideWhenUsed="1"/>
+    <w:lsdException w:name="index 8" w:semiHidden="1" w:unhideWhenUsed="1"/>
+    <w:lsdException w:name="index 9" w:semiHidden="1" w:unhideWhenUsed="1"/>
+    <w:lsdException w:name="toc 1" w:semiHidden="1" w:uiPriority="39" w:unhideWhenUsed="1"/>
+    <w:lsdException w:name="toc 2" w:semiHidden="1" w:uiPriority="39" w:unhideWhenUsed="1"/>
+    <w:lsdException w:name="toc 3" w:semiHidden="1" w:uiPriority="39" w:unhideWhenUsed="1"/>
+    <w:lsdException w:name="toc 4" w:semiHidden="1" w:uiPriority="39" w:unhideWhenUsed="1"/>
+    <w:lsdException w:name="toc 5" w:semiHidden="1" w:uiPriority="39" w:unhideWhenUsed="1"/>
+    <w:lsdException w:name="toc 6" w:semiHidden="1" w:uiPriority="39" w:unhideWhenUsed="1"/>
+    <w:lsdException w:name="toc 7" w:semiHidden="1" w:uiPriority="39" w:unhideWhenUsed="1"/>
+    <w:lsdException w:name="toc 8" w:semiHidden="1" w:uiPriority="39" w:unhideWhenUsed="1"/>
+    <w:lsdException w:name="toc 9" w:semiHidden="1" w:uiPriority="39" w:unhideWhenUsed="1"/>
+    <w:lsdException w:name="Normal Indent" w:semiHidden="1" w:unhideWhenUsed="1"/>
+    <w:lsdException w:name="footnote text" w:semiHidden="1" w:unhideWhenUsed="1"/>
+    <w:lsdException w:name="annotation text" w:semiHidden="1" w:unhideWhenUsed="1"/>
+    <w:lsdException w:name="header" w:semiHidden="1" w:unhideWhenUsed="1"/>
+    <w:lsdException w:name="footer" w:semiHidden="1" w:unhideWhenUsed="1"/>
+    <w:lsdException w:name="index heading" w:semiHidden="1" w:unhideWhenUsed="1"/>
+    <w:lsdException w:name="caption" w:semiHidden="1" w:uiPriority="35" w:unhideWhenUsed="1" w:qFormat="1"/>
+    <w:lsdException w:name="table of figures" w:semiHidden="1" w:unhideWhenUsed="1"/>
+    <w:lsdException w:name="envelope address" w:semiHidden="1" w:unhideWhenUsed="1"/>
+    <w:lsdException w:name="envelope return" w:semiHidden="1" w:unhideWhenUsed="1"/>
+    <w:lsdException w:name="footnote reference" w:semiHidden="1" w:unhideWhenUsed="1"/>
+    <w:lsdException w:name="annotation reference" w:semiHidden="1" w:unhideWhenUsed="1"/>
+    <w:lsdException w:name="line number" w:semiHidden="1" w:unhideWhenUsed="1"/>
+    <w:lsdException w:name="page number" w:semiHidden="1" w:unhideWhenUsed="1"/>
+    <w:lsdException w:name="endnote reference" w:semiHidden="1" w:unhideWhenUsed="1"/>
+    <w:lsdException w:name="endnote text" w:semiHidden="1" w:unhideWhenUsed="1"/>
+    <w:lsdException w:name="table of authorities" w:semiHidden="1" w:unhideWhenUsed="1"/>
+    <w:lsdException w:name="macro" w:semiHidden="1" w:unhideWhenUsed="1"/>
+    <w:lsdException w:name="toa heading" w:semiHidden="1" w:unhideWhenUsed="1"/>
+    <w:lsdException w:name="List" w:semiHidden="1" w:unhideWhenUsed="1"/>
+    <w:lsdException w:name="List Bullet" w:semiHidden="1" w:unhideWhenUsed="1"/>
+    <w:lsdException w:name="List Number" w:semiHidden="1" w:unhideWhenUsed="1"/>
+    <w:lsdException w:name="List 2" w:semiHidden="1" w:unhideWhenUsed="1"/>
+    <w:lsdException w:name="List 3" w:semiHidden="1" w:unhideWhenUsed="1"/>
+    <w:lsdException w:name="List 4" w:semiHidden="1" w:unhideWhenUsed="1"/>
+    <w:lsdException w:name="List 5" w:semiHidden="1" w:unhideWhenUsed="1"/>
+    <w:lsdException w:name="List Bullet 2" w:semiHidden="1" w:unhideWhenUsed="1"/>
+    <w:lsdException w:name="List Bullet 3" w:semiHidden="1" w:unhideWhenUsed="1"/>
+    <w:lsdException w:name="List Bullet 4" w:semiHidden="1" w:unhideWhenUsed="1"/>
+    <w:lsdException w:name="List Bullet 5" w:semiHidden="1" w:unhideWhenUsed="1"/>
+    <w:lsdException w:name="List Number 2" w:semiHidden="1" w:unhideWhenUsed="1"/>
+    <w:lsdException w:name="List Number 3" w:semiHidden="1" w:unhideWhenUsed="1"/>
+    <w:lsdException w:name="List Number 4" w:semiHidden="1" w:unhideWhenUsed="1"/>
+    <w:lsdException w:name="List Number 5" w:semiHidden="1" w:unhideWhenUsed="1"/>
+    <w:lsdException w:name="Title" w:uiPriority="10" w:qFormat="1"/>
+    <w:lsdException w:name="Closing" w:semiHidden="1" w:unhideWhenUsed="1"/>
+    <w:lsdException w:name="Signature" w:semiHidden="1" w:unhideWhenUsed="1"/>
+    <w:lsdException w:name="Default Paragraph Font" w:semiHidden="1" w:uiPriority="1" w:unhideWhenUsed="1"/>
+    <w:lsdException w:name="Body Text" w:semiHidden="1" w:unhideWhenUsed="1"/>
+    <w:lsdException w:name="Body Text Indent" w:semiHidden="1" w:unhideWhenUsed="1"/>
+    <w:lsdException w:name="List Continue" w:semiHidden="1" w:unhideWhenUsed="1"/>
+    <w:lsdException w:name="List Continue 2" w:semiHidden="1" w:unhideWhenUsed="1"/>
+    <w:lsdException w:name="List Continue 3" w:semiHidden="1" w:unhideWhenUsed="1"/>
+    <w:lsdException w:name="List Continue 4" w:semiHidden="1" w:unhideWhenUsed="1"/>
+    <w:lsdException w:name="List Continue 5" w:semiHidden="1" w:unhideWhenUsed="1"/>
+    <w:lsdException w:name="Message Header" w:semiHidden="1" w:unhideWhenUsed="1"/>
+    <w:lsdException w:name="Subtitle" w:uiPriority="11" w:qFormat="1"/>
+    <w:lsdException w:name="Salutation" w:semiHidden="1" w:unhideWhenUsed="1"/>
+    <w:lsdException w:name="Date" w:semiHidden="1" w:unhideWhenUsed="1"/>
+    <w:lsdException w:name="Body Text First Indent" w:semiHidden="1" w:unhideWhenUsed="1"/>
+    <w:lsdException w:name="Body Text First Indent 2" w:semiHidden="1" w:unhideWhenUsed="1"/>
+    <w:lsdException w:name="Note Heading" w:semiHidden="1" w:unhideWhenUsed="1"/>
+    <w:lsdException w:name="Body Text 2" w:semiHidden="1" w:unhideWhenUsed="1"/>
+    <w:lsdException w:name="Body Text 3" w:semiHidden="1" w:unhideWhenUsed="1"/>
+    <w:lsdException w:name="Body Text Indent 2" w:semiHidden="1" w:unhideWhenUsed="1"/>
+    <w:lsdException w:name="Body Text Indent 3" w:semiHidden="1" w:unhideWhenUsed="1"/>
+    <w:lsdException w:name="Block Text" w:semiHidden="1" w:unhideWhenUsed="1"/>
+    <w:lsdException w:name="Hyperlink" w:semiHidden="1" w:unhideWhenUsed="1"/>
+    <w:lsdException w:name="FollowedHyperlink" w:semiHidden="1" w:unhideWhenUsed="1"/>
+    <w:lsdException w:name="Strong" w:uiPriority="22" w:qFormat="1"/>
+    <w:lsdException w:name="Emphasis" w:uiPriority="20" w:qFormat="1"/>
+    <w:lsdException w:name="Document Map" w:semiHidden="1" w:unhideWhenUsed="1"/>
+    <w:lsdException w:name="Plain Text" w:semiHidden="1" w:unhideWhenUsed="1"/>
+    <w:lsdException w:name="E-mail Signature" w:semiHidden="1" w:unhideWhenUsed="1"/>
+    <w:lsdException w:name="HTML Top of Form" w:semiHidden="1" w:unhideWhenUsed="1"/>
+    <w:lsdException w:name="HTML Bottom of Form" w:semiHidden="1" w:unhideWhenUsed="1"/>
+    <w:lsdException w:name="Normal (Web)" w:semiHidden="1" w:unhideWhenUsed="1"/>
+    <w:lsdException w:name="HTML Acronym" w:semiHidden="1" w:unhideWhenUsed="1"/>
+    <w:lsdException w:name="HTML Address" w:semiHidden="1" w:unhideWhenUsed="1"/>
+    <w:lsdException w:name="HTML Cite" w:semiHidden="1" w:unhideWhenUsed="1"/>
+    <w:lsdException w:name="HTML Code" w:semiHidden="1" w:unhideWhenUsed="1"/>
+    <w:lsdException w:name="HTML Definition" w:semiHidden="1" w:unhideWhenUsed="1"/>
+    <w:lsdException w:name="HTML Keyboard" w:semiHidden="1" w:unhideWhenUsed="1"/>
+    <w:lsdException w:name="HTML Preformatted" w:semiHidden="1" w:unhideWhenUsed="1"/>
+    <w:lsdException w:name="HTML Sample" w:semiHidden="1" w:unhideWhenUsed="1"/>
+    <w:lsdException w:name="HTML Typewriter" w:semiHidden="1" w:unhideWhenUsed="1"/>
+    <w:lsdException w:name="HTML Variable" w:semiHidden="1" w:unhideWhenUsed="1"/>
+    <w:lsdException w:name="Normal Table" w:semiHidden="1" w:unhideWhenUsed="1"/>
+    <w:lsdException w:name="annotation subject" w:semiHidden="1" w:unhideWhenUsed="1"/>
+    <w:lsdException w:name="No List" w:semiHidden="1" w:unhideWhenUsed="1"/>
+    <w:lsdException w:name="Outline List 1" w:semiHidden="1" w:unhideWhenUsed="1"/>
+    <w:lsdException w:name="Outline List 2" w:semiHidden="1" w:unhideWhenUsed="1"/>
+    <w:lsdException w:name="Outline List 3" w:semiHidden="1" w:unhideWhenUsed="1"/>
+    <w:lsdException w:name="Table Simple 1" w:semiHidden="1" w:unhideWhenUsed="1"/>
+    <w:lsdException w:name="Table Simple 2" w:semiHidden="1" w:unhideWhenUsed="1"/>
+    <w:lsdException w:name="Table Simple 3" w:semiHidden="1" w:unhideWhenUsed="1"/>
+    <w:lsdException w:name="Table Classic 1" w:semiHidden="1" w:unhideWhenUsed="1"/>
+    <w:lsdException w:name="Table Classic 2" w:semiHidden="1" w:unhideWhenUsed="1"/>
+    <w:lsdException w:name="Table Classic 3" w:semiHidden="1" w:unhideWhenUsed="1"/>
+    <w:lsdException w:name="Table Classic 4" w:semiHidden="1" w:unhideWhenUsed="1"/>
+    <w:lsdException w:name="Table Colorful 1" w:semiHidden="1" w:unhideWhenUsed="1"/>
+    <w:lsdException w:name="Table Colorful 2" w:semiHidden="1" w:unhideWhenUsed="1"/>
+    <w:lsdException w:name="Table Colorful 3" w:semiHidden="1" w:unhideWhenUsed="1"/>
+    <w:lsdException w:name="Table Columns 1" w:semiHidden="1" w:unhideWhenUsed="1"/>
+    <w:lsdException w:name="Table Columns 2" w:semiHidden="1" w:unhideWhenUsed="1"/>
+    <w:lsdException w:name="Table Columns 3" w:semiHidden="1" w:unhideWhenUsed="1"/>
+    <w:lsdException w:name="Table Columns 4" w:semiHidden="1" w:unhideWhenUsed="1"/>
+    <w:lsdException w:name="Table Columns 5" w:semiHidden="1" w:unhideWhenUsed="1"/>
+    <w:lsdException w:name="Table Grid 1" w:semiHidden="1" w:unhideWhenUsed="1"/>
+    <w:lsdException w:name="Table Grid 2" w:semiHidden="1" w:unhideWhenUsed="1"/>
+    <w:lsdException w:name="Table Grid 3" w:semiHidden="1" w:unhideWhenUsed="1"/>
+    <w:lsdException w:name="Table Grid 4" w:semiHidden="1" w:unhideWhenUsed="1"/>
+    <w:lsdException w:name="Table Grid 5" w:semiHidden="1" w:unhideWhenUsed="1"/>
+    <w:lsdException w:name="Table Grid 6" w:semiHidden="1" w:unhideWhenUsed="1"/>
+    <w:lsdException w:name="Table Grid 7" w:semiHidden="1" w:unhideWhenUsed="1"/>
+    <w:lsdException w:name="Table Grid 8" w:semiHidden="1" w:unhideWhenUsed="1"/>
+    <w:lsdException w:name="Table List 1" w:semiHidden="1" w:unhideWhenUsed="1"/>
+    <w:lsdException w:name="Table List 2" w:semiHidden="1" w:unhideWhenUsed="1"/>
+    <w:lsdException w:name="Table List 3" w:semiHidden="1" w:unhideWhenUsed="1"/>
+    <w:lsdException w:name="Table List 4" w:semiHidden="1" w:unhideWhenUsed="1"/>
+    <w:lsdException w:name="Table List 5" w:semiHidden="1" w:unhideWhenUsed="1"/>
+    <w:lsdException w:name="Table List 6" w:semiHidden="1" w:unhideWhenUsed="1"/>
+    <w:lsdException w:name="Table List 7" w:semiHidden="1" w:unhideWhenUsed="1"/>
+    <w:lsdException w:name="Table List 8" w:semiHidden="1" w:unhideWhenUsed="1"/>
+    <w:lsdException w:name="Table 3D effects 1" w:semiHidden="1" w:unhideWhenUsed="1"/>
+    <w:lsdException w:name="Table 3D effects 2" w:semiHidden="1" w:unhideWhenUsed="1"/>
+    <w:lsdException w:name="Table 3D effects 3" w:semiHidden="1" w:unhideWhenUsed="1"/>
+    <w:lsdException w:name="Table Contemporary" w:semiHidden="1" w:unhideWhenUsed="1"/>
+    <w:lsdException w:name="Table Elegant" w:semiHidden="1" w:unhideWhenUsed="1"/>
+    <w:lsdException w:name="Table Professional" w:semiHidden="1" w:unhideWhenUsed="1"/>
+    <w:lsdException w:name="Table Subtle 1" w:semiHidden="1" w:unhideWhenUsed="1"/>
+    <w:lsdException w:name="Table Subtle 2" w:semiHidden="1" w:unhideWhenUsed="1"/>
+    <w:lsdException w:name="Table Web 1" w:semiHidden="1" w:unhideWhenUsed="1"/>
+    <w:lsdException w:name="Table Web 2" w:semiHidden="1" w:unhideWhenUsed="1"/>
+    <w:lsdException w:name="Table Web 3" w:semiHidden="1" w:unhideWhenUsed="1"/>
+    <w:lsdException w:name="Balloon Text" w:semiHidden="1" w:unhideWhenUsed="1"/>
+    <w:lsdException w:name="Table Grid" w:uiPriority="39"/>
+    <w:lsdException w:name="Table Theme" w:semiHidden="1" w:unhideWhenUsed="1"/>
+    <w:lsdException w:name="Placeholder Text" w:semiHidden="1"/>
+    <w:lsdException w:name="No Spacing" w:uiPriority="1" w:qFormat="1"/>
+    <w:lsdException w:name="Light Shading" w:uiPriority="60"/>
+    <w:lsdException w:name="Light List" w:uiPriority="61"/>
+    <w:lsdException w:name="Light Grid" w:uiPriority="62"/>
+    <w:lsdException w:name="Medium Shading 1" w:uiPriority="63"/>
+    <w:lsdException w:name="Medium Shading 2" w:uiPriority="64"/>
+    <w:lsdException w:name="Medium List 1" w:uiPriority="65"/>
+    <w:lsdException w:name="Medium List 2" w:uiPriority="66"/>
+    <w:lsdException w:name="Medium Grid 1" w:uiPriority="67"/>
+    <w:lsdException w:name="Medium Grid 2" w:uiPriority="68"/>
+    <w:lsdException w:name="Medium Grid 3" w:uiPriority="69"/>
+    <w:lsdException w:name="Dark List" w:uiPriority="70"/>
+    <w:lsdException w:name="Colorful Shading" w:uiPriority="71"/>
+    <w:lsdException w:name="Colorful List" w:uiPriority="72"/>
+    <w:lsdException w:name="Colorful Grid" w:uiPriority="73"/>
+    <w:lsdException w:name="Light Shading Accent 1" w:uiPriority="60"/>
+    <w:lsdException w:name="Light List Accent 1" w:uiPriority="61"/>
+    <w:lsdException w:name="Light Grid Accent 1" w:uiPriority="62"/>
+    <w:lsdException w:name="Medium Shading 1 Accent 1" w:uiPriority="63"/>
+    <w:lsdException w:name="Medium Shading 2 Accent 1" w:uiPriority="64"/>
+    <w:lsdException w:name="Medium List 1 Accent 1" w:uiPriority="65"/>
+    <w:lsdException w:name="Revision" w:semiHidden="1"/>
+    <w:lsdException w:name="List Paragraph" w:uiPriority="34" w:qFormat="1"/>
+    <w:lsdException w:name="Quote" w:uiPriority="29" w:qFormat="1"/>
+    <w:lsdException w:name="Intense Quote" w:uiPriority="30" w:qFormat="1"/>
+    <w:lsdException w:name="Medium List 2 Accent 1" w:uiPriority="66"/>
+    <w:lsdException w:name="Medium Grid 1 Accent 1" w:uiPriority="67"/>
+    <w:lsdException w:name="Medium Grid 2 Accent 1" w:uiPriority="68"/>
+    <w:lsdException w:name="Medium Grid 3 Accent 1" w:uiPriority="69"/>
+    <w:lsdException w:name="Dark List Accent 1" w:uiPriority="70"/>
+    <w:lsdException w:name="Colorful Shading Accent 1" w:uiPriority="71"/>
+    <w:lsdException w:name="Colorful List Accent 1" w:uiPriority="72"/>
+    <w:lsdException w:name="Colorful Grid Accent 1" w:uiPriority="73"/>
+    <w:lsdException w:name="Light Shading Accent 2" w:uiPriority="60"/>
+    <w:lsdException w:name="Light List Accent 2" w:uiPriority="61"/>
+    <w:lsdException w:name="Light Grid Accent 2" w:uiPriority="62"/>
+    <w:lsdException w:name="Medium Shading 1 Accent 2" w:uiPriority="63"/>
+    <w:lsdException w:name="Medium Shading 2 Accent 2" w:uiPriority="64"/>
+    <w:lsdException w:name="Medium List 1 Accent 2" w:uiPriority="65"/>
+    <w:lsdException w:name="Medium List 2 Accent 2" w:uiPriority="66"/>
+    <w:lsdException w:name="Medium Grid 1 Accent 2" w:uiPriority="67"/>
+    <w:lsdException w:name="Medium Grid 2 Accent 2" w:uiPriority="68"/>
+    <w:lsdException w:name="Medium Grid 3 Accent 2" w:uiPriority="69"/>
+    <w:lsdException w:name="Dark List Accent 2" w:uiPriority="70"/>
+    <w:lsdException w:name="Colorful Shading Accent 2" w:uiPriority="71"/>
+    <w:lsdException w:name="Colorful List Accent 2" w:uiPriority="72"/>
+    <w:lsdException w:name="Colorful Grid Accent 2" w:uiPriority="73"/>
+    <w:lsdException w:name="Light Shading Accent 3" w:uiPriority="60"/>
+    <w:lsdException w:name="Light List Accent 3" w:uiPriority="61"/>
+    <w:lsdException w:name="Light Grid Accent 3" w:uiPriority="62"/>
+    <w:lsdException w:name="Medium Shading 1 Accent 3" w:uiPriority="63"/>
+    <w:lsdException w:name="Medium Shading 2 Accent 3" w:uiPriority="64"/>
+    <w:lsdException w:name="Medium List 1 Accent 3" w:uiPriority="65"/>
+    <w:lsdException w:name="Medium List 2 Accent 3" w:uiPriority="66"/>
+    <w:lsdException w:name="Medium Grid 1 Accent 3" w:uiPriority="67"/>
+    <w:lsdException w:name="Medium Grid 2 Accent 3" w:uiPriority="68"/>
+    <w:lsdException w:name="Medium Grid 3 Accent 3" w:uiPriority="69"/>
+    <w:lsdException w:name="Dark List Accent 3" w:uiPriority="70"/>
+    <w:lsdException w:name="Colorful Shading Accent 3" w:uiPriority="71"/>
+    <w:lsdException w:name="Colorful List Accent 3" w:uiPriority="72"/>
+    <w:lsdException w:name="Colorful Grid Accent 3" w:uiPriority="73"/>
+    <w:lsdException w:name="Light Shading Accent 4" w:uiPriority="60"/>
+    <w:lsdException w:name="Light List Accent 4" w:uiPriority="61"/>
+    <w:lsdException w:name="Light Grid Accent 4" w:uiPriority="62"/>
+    <w:lsdException w:name="Medium Shading 1 Accent 4" w:uiPriority="63"/>
+    <w:lsdException w:name="Medium Shading 2 Accent 4" w:uiPriority="64"/>
+    <w:lsdException w:name="Medium List 1 Accent 4" w:uiPriority="65"/>
+    <w:lsdException w:name="Medium List 2 Accent 4" w:uiPriority="66"/>
+    <w:lsdException w:name="Medium Grid 1 Accent 4" w:uiPriority="67"/>
+    <w:lsdException w:name="Medium Grid 2 Accent 4" w:uiPriority="68"/>
+    <w:lsdException w:name="Medium Grid 3 Accent 4" w:uiPriority="69"/>
+    <w:lsdException w:name="Dark List Accent 4" w:uiPriority="70"/>
+    <w:lsdException w:name="Colorful Shading Accent 4" w:uiPriority="71"/>
+    <w:lsdException w:name="Colorful List Accent 4" w:uiPriority="72"/>
+    <w:lsdException w:name="Colorful Grid Accent 4" w:uiPriority="73"/>
+    <w:lsdException w:name="Light Shading Accent 5" w:uiPriority="60"/>
+    <w:lsdException w:name="Light List Accent 5" w:uiPriority="61"/>
+    <w:lsdException w:name="Light Grid Accent 5" w:uiPriority="62"/>
+    <w:lsdException w:name="Medium Shading 1 Accent 5" w:uiPriority="63"/>
+    <w:lsdException w:name="Medium Shading 2 Accent 5" w:uiPriority="64"/>
+    <w:lsdException w:name="Medium List 1 Accent 5" w:uiPriority="65"/>
+    <w:lsdException w:name="Medium List 2 Accent 5" w:uiPriority="66"/>
+    <w:lsdException w:name="Medium Grid 1 Accent 5" w:uiPriority="67"/>
+    <w:lsdException w:name="Medium Grid 2 Accent 5" w:uiPriority="68"/>
+    <w:lsdException w:name="Medium Grid 3 Accent 5" w:uiPriority="69"/>
+    <w:lsdException w:name="Dark List Accent 5" w:uiPriority="70"/>
+    <w:lsdException w:name="Colorful Shading Accent 5" w:uiPriority="71"/>
+    <w:lsdException w:name="Colorful List Accent 5" w:uiPriority="72"/>
+    <w:lsdException w:name="Colorful Grid Accent 5" w:uiPriority="73"/>
+    <w:lsdException w:name="Light Shading Accent 6" w:uiPriority="60"/>
+    <w:lsdException w:name="Light List Accent 6" w:uiPriority="61"/>
+    <w:lsdException w:name="Light Grid Accent 6" w:uiPriority="62"/>
+    <w:lsdException w:name="Medium Shading 1 Accent 6" w:uiPriority="63"/>
+    <w:lsdException w:name="Medium Shading 2 Accent 6" w:uiPriority="64"/>
+    <w:lsdException w:name="Medium List 1 Accent 6" w:uiPriority="65"/>
+    <w:lsdException w:name="Medium List 2 Accent 6" w:uiPriority="66"/>
+    <w:lsdException w:name="Medium Grid 1 Accent 6" w:uiPriority="67"/>
+    <w:lsdException w:name="Medium Grid 2 Accent 6" w:uiPriority="68"/>
+    <w:lsdException w:name="Medium Grid 3 Accent 6" w:uiPriority="69"/>
+    <w:lsdException w:name="Dark List Accent 6" w:uiPriority="70"/>
+    <w:lsdException w:name="Colorful Shading Accent 6" w:uiPriority="71"/>
+    <w:lsdException w:name="Colorful List Accent 6" w:uiPriority="72"/>
+    <w:lsdException w:name="Colorful Grid Accent 6" w:uiPriority="73"/>
+    <w:lsdException w:name="Subtle Emphasis" w:uiPriority="19" w:qFormat="1"/>
+    <w:lsdException w:name="Intense Emphasis" w:uiPriority="21" w:qFormat="1"/>
+    <w:lsdException w:name="Subtle Reference" w:uiPriority="31" w:qFormat="1"/>
+    <w:lsdException w:name="Intense Reference" w:uiPriority="32" w:qFormat="1"/>
+    <w:lsdException w:name="Book Title" w:uiPriority="33" w:qFormat="1"/>
+    <w:lsdException w:name="Bibliography" w:semiHidden="1" w:uiPriority="37" w:unhideWhenUsed="1"/>
+    <w:lsdException w:name="TOC Heading" w:semiHidden="1" w:uiPriority="39" w:unhideWhenUsed="1" w:qFormat="1"/>
+    <w:lsdException w:name="Plain Table 1" w:uiPriority="41"/>
+    <w:lsdException w:name="Plain Table 2" w:uiPriority="42"/>
+    <w:lsdException w:name="Plain Table 3" w:uiPriority="43"/>
+    <w:lsdException w:name="Plain Table 4" w:uiPriority="44"/>
+    <w:lsdException w:name="Plain Table 5" w:uiPriority="45"/>
+    <w:lsdException w:name="Grid Table Light" w:uiPriority="40"/>
+    <w:lsdException w:name="Grid Table 1 Light" w:uiPriority="46"/>
+    <w:lsdException w:name="Grid Table 2" w:uiPriority="47"/>
+    <w:lsdException w:name="Grid Table 3" w:uiPriority="48"/>
+    <w:lsdException w:name="Grid Table 4" w:uiPriority="49"/>
+    <w:lsdException w:name="Grid Table 5 Dark" w:uiPriority="50"/>
+    <w:lsdException w:name="Grid Table 6 Colorful" w:uiPriority="51"/>
+    <w:lsdException w:name="Grid Table 7 Colorful" w:uiPriority="52"/>
+    <w:lsdException w:name="Grid Table 1 Light Accent 1" w:uiPriority="46"/>
+    <w:lsdException w:name="Grid Table 2 Accent 1" w:uiPriority="47"/>
+    <w:lsdException w:name="Grid Table 3 Accent 1" w:uiPriority="48"/>
+    <w:lsdException w:name="Grid Table 4 Accent 1" w:uiPriority="49"/>
+    <w:lsdException w:name="Grid Table 5 Dark Accent 1" w:uiPriority="50"/>
+    <w:lsdException w:name="Grid Table 6 Colorful Accent 1" w:uiPriority="51"/>
+    <w:lsdException w:name="Grid Table 7 Colorful Accent 1" w:uiPriority="52"/>
+    <w:lsdException w:name="Grid Table 1 Light Accent 2" w:uiPriority="46"/>
+    <w:lsdException w:name="Grid Table 2 Accent 2" w:uiPriority="47"/>
+    <w:lsdException w:name="Grid Table 3 Accent 2" w:uiPriority="48"/>
+    <w:lsdException w:name="Grid Table 4 Accent 2" w:uiPriority="49"/>
+    <w:lsdException w:name="Grid Table 5 Dark Accent 2" w:uiPriority="50"/>
+    <w:lsdException w:name="Grid Table 6 Colorful Accent 2" w:uiPriority="51"/>
+    <w:lsdException w:name="Grid Table 7 Colorful Accent 2" w:uiPriority="52"/>
+    <w:lsdException w:name="Grid Table 1 Light Accent 3" w:uiPriority="46"/>
+    <w:lsdException w:name="Grid Table 2 Accent 3" w:uiPriority="47"/>
+    <w:lsdException w:name="Grid Table 3 Accent 3" w:uiPriority="48"/>
+    <w:lsdException w:name="Grid Table 4 Accent 3" w:uiPriority="49"/>
+    <w:lsdException w:name="Grid Table 5 Dark Accent 3" w:uiPriority="50"/>
+    <w:lsdException w:name="Grid Table 6 Colorful Accent 3" w:uiPriority="51"/>
+    <w:lsdException w:name="Grid Table 7 Colorful Accent 3" w:uiPriority="52"/>
+    <w:lsdException w:name="Grid Table 1 Light Accent 4" w:uiPriority="46"/>
+    <w:lsdException w:name="Grid Table 2 Accent 4" w:uiPriority="47"/>
+    <w:lsdException w:name="Grid Table 3 Accent 4" w:uiPriority="48"/>
+    <w:lsdException w:name="Grid Table 4 Accent 4" w:uiPriority="49"/>
+    <w:lsdException w:name="Grid Table 5 Dark Accent 4" w:uiPriority="50"/>
+    <w:lsdException w:name="Grid Table 6 Colorful Accent 4" w:uiPriority="51"/>
+    <w:lsdException w:name="Grid Table 7 Colorful Accent 4" w:uiPriority="52"/>
+    <w:lsdException w:name="Grid Table 1 Light Accent 5" w:uiPriority="46"/>
+    <w:lsdException w:name="Grid Table 2 Accent 5" w:uiPriority="47"/>
+    <w:lsdException w:name="Grid Table 3 Accent 5" w:uiPriority="48"/>
+    <w:lsdException w:name="Grid Table 4 Accent 5" w:uiPriority="49"/>
+    <w:lsdException w:name="Grid Table 5 Dark Accent 5" w:uiPriority="50"/>
+    <w:lsdException w:name="Grid Table 6 Colorful Accent 5" w:uiPriority="51"/>
+    <w:lsdException w:name="Grid Table 7 Colorful Accent 5" w:uiPriority="52"/>
+    <w:lsdException w:name="Grid Table 1 Light Accent 6" w:uiPriority="46"/>
+    <w:lsdException w:name="Grid Table 2 Accent 6" w:uiPriority="47"/>
+    <w:lsdException w:name="Grid Table 3 Accent 6" w:uiPriority="48"/>
+    <w:lsdException w:name="Grid Table 4 Accent 6" w:uiPriority="49"/>
+    <w:lsdException w:name="Grid Table 5 Dark Accent 6" w:uiPriority="50"/>
+    <w:lsdException w:name="Grid Table 6 Colorful Accent 6" w:uiPriority="51"/>
+    <w:lsdException w:name="Grid Table 7 Colorful Accent 6" w:uiPriority="52"/>
+    <w:lsdException w:name="List Table 1 Light" w:uiPriority="46"/>
+    <w:lsdException w:name="List Table 2" w:uiPriority="47"/>
+    <w:lsdException w:name="List Table 3" w:uiPriority="48"/>
+    <w:lsdException w:name="List Table 4" w:uiPriority="49"/>
+    <w:lsdException w:name="List Table 5 Dark" w:uiPriority="50"/>
+    <w:lsdException w:name="List Table 6 Colorful" w:uiPriority="51"/>
+    <w:lsdException w:name="List Table 7 Colorful" w:uiPriority="52"/>
+    <w:lsdException w:name="List Table 1 Light Accent 1" w:uiPriority="46"/>
+    <w:lsdException w:name="List Table 2 Accent 1" w:uiPriority="47"/>
+    <w:lsdException w:name="List Table 3 Accent 1" w:uiPriority="48"/>
+    <w:lsdException w:name="List Table 4 Accent 1" w:uiPriority="49"/>
+    <w:lsdException w:name="List Table 5 Dark Accent 1" w:uiPriority="50"/>
+    <w:lsdException w:name="List Table 6 Colorful Accent 1" w:uiPriority="51"/>
+    <w:lsdException w:name="List Table 7 Colorful Accent 1" w:uiPriority="52"/>
+    <w:lsdException w:name="List Table 1 Light Accent 2" w:uiPriority="46"/>
+    <w:lsdException w:name="List Table 2 Accent 2" w:uiPriority="47"/>
+    <w:lsdException w:name="List Table 3 Accent 2" w:uiPriority="48"/>
+    <w:lsdException w:name="List Table 4 Accent 2" w:uiPriority="49"/>
+    <w:lsdException w:name="List Table 5 Dark Accent 2" w:uiPriority="50"/>
+    <w:lsdException w:name="List Table 6 Colorful Accent 2" w:uiPriority="51"/>
+    <w:lsdException w:name="List Table 7 Colorful Accent 2" w:uiPriority="52"/>
+    <w:lsdException w:name="List Table 1 Light Accent 3" w:uiPriority="46"/>
+    <w:lsdException w:name="List Table 2 Accent 3" w:uiPriority="47"/>
+    <w:lsdException w:name="List Table 3 Accent 3" w:uiPriority="48"/>
+    <w:lsdException w:name="List Table 4 Accent 3" w:uiPriority="49"/>
+    <w:lsdException w:name="List Table 5 Dark Accent 3" w:uiPriority="50"/>
+    <w:lsdException w:name="List Table 6 Colorful Accent 3" w:uiPriority="51"/>
+    <w:lsdException w:name="List Table 7 Colorful Accent 3" w:uiPriority="52"/>
+    <w:lsdException w:name="List Table 1 Light Accent 4" w:uiPriority="46"/>
+    <w:lsdException w:name="List Table 2 Accent 4" w:uiPriority="47"/>
+    <w:lsdException w:name="List Table 3 Accent 4" w:uiPriority="48"/>
+    <w:lsdException w:name="List Table 4 Accent 4" w:uiPriority="49"/>
+    <w:lsdException w:name="List Table 5 Dark Accent 4" w:uiPriority="50"/>
+    <w:lsdException w:name="List Table 6 Colorful Accent 4" w:uiPriority="51"/>
+    <w:lsdException w:name="List Table 7 Colorful Accent 4" w:uiPriority="52"/>
+    <w:lsdException w:name="List Table 1 Light Accent 5" w:uiPriority="46"/>
+    <w:lsdException w:name="List Table 2 Accent 5" w:uiPriority="47"/>
+    <w:lsdException w:name="List Table 3 Accent 5" w:uiPriority="48"/>
+    <w:lsdException w:name="List Table 4 Accent 5" w:uiPriority="49"/>
+    <w:lsdException w:name="List Table 5 Dark Accent 5" w:uiPriority="50"/>
+    <w:lsdException w:name="List Table 6 Colorful Accent 5" w:uiPriority="51"/>
+    <w:lsdException w:name="List Table 7 Colorful Accent 5" w:uiPriority="52"/>
+    <w:lsdException w:name="List Table 1 Light Accent 6" w:uiPriority="46"/>
+    <w:lsdException w:name="List Table 2 Accent 6" w:uiPriority="47"/>
+    <w:lsdException w:name="List Table 3 Accent 6" w:uiPriority="48"/>
+    <w:lsdException w:name="List Table 4 Accent 6" w:uiPriority="49"/>
+    <w:lsdException w:name="List Table 5 Dark Accent 6" w:uiPriority="50"/>
+    <w:lsdException w:name="List Table 6 Colorful Accent 6" w:uiPriority="51"/>
+    <w:lsdException w:name="List Table 7 Colorful Accent 6" w:uiPriority="52"/>
+    <w:lsdException w:name="Mention" w:semiHidden="1" w:unhideWhenUsed="1"/>
+    <w:lsdException w:name="Smart Hyperlink" w:semiHidden="1" w:unhideWhenUsed="1"/>
+    <w:lsdException w:name="Hashtag" w:semiHidden="1" w:unhideWhenUsed="1"/>
+    <w:lsdException w:name="Unresolved Mention" w:semiHidden="1" w:unhideWhenUsed="1"/>
+    <w:lsdException w:name="Smart Link" w:semiHidden="1" w:unhideWhenUsed="1"/>
+  </w:latentStyles>
+  <w:style w:type="paragraph" w:default="1" w:styleId="Normal">
+    <w:name w:val="Normal"/>
+    <w:qFormat/>
+    <w:rPr>
+      <w:rFonts w:ascii="Arial MT" w:eastAsia="Arial MT" w:hAnsi="Arial MT" w:cs="Arial MT"/>
+    </w:rPr>
+  </w:style>
+  <w:style w:type="paragraph" w:styleId="Heading1">
+    <w:name w:val="heading 1"/>
+    <w:basedOn w:val="Normal"/>
+    <w:uiPriority w:val="9"/>
+    <w:qFormat/>
+    <w:pPr>
+      <w:ind w:left="28"/>
+      <w:outlineLvl w:val="0"/>
+    </w:pPr>
+    <w:rPr>
+      <w:sz w:val="29"/>
+      <w:szCs w:val="29"/>
+    </w:rPr>
+  </w:style>
+  <w:style w:type="character" w:default="1" w:styleId="DefaultParagraphFont">
     <w:name w:val="Default Paragraph Font"/>
     <w:uiPriority w:val="1"/>
     <w:semiHidden/>
     <w:unhideWhenUsed/>
   </w:style>
-  <w:style w:type="table" w:styleId="TableNormal" w:default="1">
+  <w:style w:type="table" w:default="1" w:styleId="TableNormal">
     <w:name w:val="Normal Table"/>
-    <w:uiPriority w:val="2"/>
+    <w:uiPriority w:val="99"/>
     <w:semiHidden/>
     <w:unhideWhenUsed/>
-    <w:qFormat/>
     <w:tblPr>
       <w:tblInd w:w="0" w:type="dxa"/>
       <w:tblCellMar>
         <w:top w:w="0" w:type="dxa"/>
-        <w:left w:w="0" w:type="dxa"/>
+        <w:left w:w="108" w:type="dxa"/>
         <w:bottom w:w="0" w:type="dxa"/>
-        <w:right w:w="0" w:type="dxa"/>
+        <w:right w:w="108" w:type="dxa"/>
       </w:tblCellMar>
     </w:tblPr>
   </w:style>
-  <w:style w:type="numbering" w:styleId="NoList" w:default="1">
+  <w:style w:type="numbering" w:default="1" w:styleId="NoList">
     <w:name w:val="No List"/>
     <w:uiPriority w:val="99"/>
     <w:semiHidden/>
     <w:unhideWhenUsed/>
-  </w:style>
-  <w:style w:type="paragraph" w:styleId="Normal" w:default="1">
-    <w:name w:val="Normal"/>
-    <w:uiPriority w:val="1"/>
-    <w:qFormat/>
-    <w:pPr/>
-    <w:rPr>
-      <w:rFonts w:ascii="Arial MT" w:hAnsi="Arial MT" w:eastAsia="Arial MT" w:cs="Arial MT"/>
-      <w:lang w:val="en-US" w:eastAsia="en-US" w:bidi="ar-SA"/>
-    </w:rPr>
   </w:style>
   <w:style w:type="paragraph" w:styleId="BodyText">
     <w:name w:val="Body Text"/>
@@ -3252,32 +3736,14 @@
       <w:spacing w:before="5"/>
     </w:pPr>
     <w:rPr>
-      <w:rFonts w:ascii="Arial MT" w:hAnsi="Arial MT" w:eastAsia="Arial MT" w:cs="Arial MT"/>
       <w:sz w:val="20"/>
       <w:szCs w:val="20"/>
-      <w:lang w:val="en-US" w:eastAsia="en-US" w:bidi="ar-SA"/>
-    </w:rPr>
-  </w:style>
-  <w:style w:type="paragraph" w:styleId="Heading1">
-    <w:name w:val="heading 1"/>
-    <w:basedOn w:val="Normal"/>
-    <w:uiPriority w:val="1"/>
-    <w:qFormat/>
-    <w:pPr>
-      <w:ind w:left="28"/>
-      <w:outlineLvl w:val="1"/>
-    </w:pPr>
-    <w:rPr>
-      <w:rFonts w:ascii="Arial MT" w:hAnsi="Arial MT" w:eastAsia="Arial MT" w:cs="Arial MT"/>
-      <w:sz w:val="29"/>
-      <w:szCs w:val="29"/>
-      <w:lang w:val="en-US" w:eastAsia="en-US" w:bidi="ar-SA"/>
     </w:rPr>
   </w:style>
   <w:style w:type="paragraph" w:styleId="Title">
     <w:name w:val="Title"/>
     <w:basedOn w:val="Normal"/>
-    <w:uiPriority w:val="1"/>
+    <w:uiPriority w:val="10"/>
     <w:qFormat/>
     <w:pPr>
       <w:spacing w:before="60"/>
@@ -3285,10 +3751,8 @@
       <w:jc w:val="center"/>
     </w:pPr>
     <w:rPr>
-      <w:rFonts w:ascii="Arial MT" w:hAnsi="Arial MT" w:eastAsia="Arial MT" w:cs="Arial MT"/>
       <w:sz w:val="50"/>
       <w:szCs w:val="50"/>
-      <w:lang w:val="en-US" w:eastAsia="en-US" w:bidi="ar-SA"/>
     </w:rPr>
   </w:style>
   <w:style w:type="paragraph" w:styleId="ListParagraph">
@@ -3300,29 +3764,33 @@
       <w:spacing w:before="45"/>
       <w:ind w:left="418" w:hanging="179"/>
     </w:pPr>
-    <w:rPr>
-      <w:rFonts w:ascii="Arial MT" w:hAnsi="Arial MT" w:eastAsia="Arial MT" w:cs="Arial MT"/>
-      <w:lang w:val="en-US" w:eastAsia="en-US" w:bidi="ar-SA"/>
-    </w:rPr>
   </w:style>
-  <w:style w:type="paragraph" w:styleId="TableParagraph">
+  <w:style w:type="paragraph" w:customStyle="1" w:styleId="TableParagraph">
     <w:name w:val="Table Paragraph"/>
     <w:basedOn w:val="Normal"/>
     <w:uiPriority w:val="1"/>
     <w:qFormat/>
-    <w:pPr/>
+  </w:style>
+  <w:style w:type="character" w:styleId="Hyperlink">
+    <w:name w:val="Hyperlink"/>
+    <w:basedOn w:val="DefaultParagraphFont"/>
+    <w:uiPriority w:val="99"/>
+    <w:unhideWhenUsed/>
     <w:rPr>
-      <w:lang w:val="en-US" w:eastAsia="en-US" w:bidi="ar-SA"/>
+      <w:color w:val="0000FF" w:themeColor="hyperlink"/>
+      <w:u w:val="single"/>
     </w:rPr>
   </w:style>
-  <w:style xmlns:w14="http://schemas.microsoft.com/office/word/2010/wordml" xmlns:mc="http://schemas.openxmlformats.org/markup-compatibility/2006" xmlns:w="http://schemas.openxmlformats.org/wordprocessingml/2006/main" w:type="character" w:styleId="Hyperlink" mc:Ignorable="w14">
-    <w:name xmlns:w="http://schemas.openxmlformats.org/wordprocessingml/2006/main" w:val="Hyperlink"/>
-    <w:basedOn xmlns:w="http://schemas.openxmlformats.org/wordprocessingml/2006/main" w:val="DefaultParagraphFont"/>
-    <w:uiPriority xmlns:w="http://schemas.openxmlformats.org/wordprocessingml/2006/main" w:val="99"/>
-    <w:unhideWhenUsed xmlns:w="http://schemas.openxmlformats.org/wordprocessingml/2006/main"/>
-    <w:rPr xmlns:w="http://schemas.openxmlformats.org/wordprocessingml/2006/main">
-      <w:color w:val="0563C1" w:themeColor="hyperlink"/>
-      <w:u w:val="single"/>
+  <w:style w:type="character" w:styleId="UnresolvedMention">
+    <w:name w:val="Unresolved Mention"/>
+    <w:basedOn w:val="DefaultParagraphFont"/>
+    <w:uiPriority w:val="99"/>
+    <w:semiHidden/>
+    <w:unhideWhenUsed/>
+    <w:rsid w:val="00624A21"/>
+    <w:rPr>
+      <w:color w:val="605E5C"/>
+      <w:shd w:val="clear" w:color="auto" w:fill="E1DFDD"/>
     </w:rPr>
   </w:style>
 </w:styles>

</xml_diff>

<commit_message>
updated resume, project detials, and bio in about
</commit_message>
<xml_diff>
--- a/public/aviResume.docx
+++ b/public/aviResume.docx
@@ -239,18 +239,6 @@
       <w:r>
         <w:fldChar w:fldCharType="end"/>
       </w:r>
-    </w:p>
-    <w:p>
-      <w:pPr>
-        <w:pStyle w:val="BodyText"/>
-        <w:spacing w:before="22"/>
-        <w:ind w:right="73"/>
-        <w:jc w:val="center"/>
-        <w:rPr>
-          <w:rFonts w:ascii="Calibri"/>
-          <w:color w:val="006FBF"/>
-        </w:rPr>
-      </w:pPr>
       <w:r>
         <w:rPr>
           <w:noProof/>
@@ -308,15 +296,35 @@
           <w:sz w:val="20"/>
         </w:rPr>
       </w:pPr>
-      <w:r>
-        <w:rPr>
-          <w:rFonts w:ascii="Arial"/>
-          <w:b/>
-          <w:color w:val="1B033C"/>
-          <w:sz w:val="20"/>
-        </w:rPr>
-        <w:t>Languages:</w:t>
-      </w:r>
+      <w:proofErr w:type="gramStart"/>
+      <w:r>
+        <w:rPr>
+          <w:rFonts w:ascii="Arial"/>
+          <w:b/>
+          <w:color w:val="1B033C"/>
+          <w:sz w:val="20"/>
+        </w:rPr>
+        <w:t>Languages</w:t>
+      </w:r>
+      <w:r>
+        <w:rPr>
+          <w:rFonts w:ascii="Arial"/>
+          <w:b/>
+          <w:color w:val="1B033C"/>
+          <w:sz w:val="20"/>
+        </w:rPr>
+        <w:t xml:space="preserve"> </w:t>
+      </w:r>
+      <w:r>
+        <w:rPr>
+          <w:rFonts w:ascii="Arial"/>
+          <w:b/>
+          <w:color w:val="1B033C"/>
+          <w:sz w:val="20"/>
+        </w:rPr>
+        <w:t>:</w:t>
+      </w:r>
+      <w:proofErr w:type="gramEnd"/>
       <w:r>
         <w:rPr>
           <w:rFonts w:ascii="Arial"/>
@@ -347,22 +355,7 @@
           <w:color w:val="1B033C"/>
           <w:sz w:val="20"/>
         </w:rPr>
-        <w:t>JavaScript,</w:t>
-      </w:r>
-      <w:r>
-        <w:rPr>
-          <w:color w:val="1B033C"/>
-          <w:spacing w:val="-9"/>
-          <w:sz w:val="20"/>
-        </w:rPr>
-        <w:t xml:space="preserve"> </w:t>
-      </w:r>
-      <w:r>
-        <w:rPr>
-          <w:color w:val="1B033C"/>
-          <w:sz w:val="20"/>
-        </w:rPr>
-        <w:t>NodeJS,</w:t>
+        <w:t>JavaScript</w:t>
       </w:r>
       <w:r>
         <w:rPr>
@@ -410,8 +403,9 @@
           <w:sz w:val="20"/>
           <w:szCs w:val="20"/>
         </w:rPr>
-        <w:t xml:space="preserve"> &amp; Stacks </w:t>
-      </w:r>
+        <w:t xml:space="preserve"> &amp; </w:t>
+      </w:r>
+      <w:proofErr w:type="gramStart"/>
       <w:r>
         <w:rPr>
           <w:rFonts w:ascii="Arial"/>
@@ -421,8 +415,20 @@
           <w:sz w:val="20"/>
           <w:szCs w:val="20"/>
         </w:rPr>
+        <w:t xml:space="preserve">Stacks </w:t>
+      </w:r>
+      <w:r>
+        <w:rPr>
+          <w:rFonts w:ascii="Arial"/>
+          <w:b/>
+          <w:bCs/>
+          <w:color w:val="1B033C"/>
+          <w:sz w:val="20"/>
+          <w:szCs w:val="20"/>
+        </w:rPr>
         <w:t>:</w:t>
       </w:r>
+      <w:proofErr w:type="gramEnd"/>
       <w:r>
         <w:rPr>
           <w:rFonts w:ascii="Arial"/>
@@ -452,6 +458,7 @@
         </w:rPr>
         <w:t xml:space="preserve"> </w:t>
       </w:r>
+      <w:proofErr w:type="gramStart"/>
       <w:r>
         <w:rPr>
           <w:color w:val="1B033C"/>
@@ -475,7 +482,16 @@
           <w:sz w:val="20"/>
           <w:szCs w:val="20"/>
         </w:rPr>
-        <w:t>,Redux,</w:t>
+        <w:t>,Redux</w:t>
+      </w:r>
+      <w:proofErr w:type="gramEnd"/>
+      <w:r>
+        <w:rPr>
+          <w:color w:val="1B033C"/>
+          <w:sz w:val="20"/>
+          <w:szCs w:val="20"/>
+        </w:rPr>
+        <w:t>,</w:t>
       </w:r>
       <w:r>
         <w:rPr>
@@ -510,7 +526,54 @@
           <w:sz w:val="20"/>
           <w:szCs w:val="20"/>
         </w:rPr>
-        <w:t>Express, Radish</w:t>
+        <w:t>Express, Radis</w:t>
+      </w:r>
+      <w:r>
+        <w:rPr>
+          <w:color w:val="1B033C"/>
+          <w:spacing w:val="-2"/>
+          <w:sz w:val="20"/>
+          <w:szCs w:val="20"/>
+        </w:rPr>
+        <w:t xml:space="preserve">, </w:t>
+      </w:r>
+      <w:r>
+        <w:rPr>
+          <w:color w:val="1B033C"/>
+          <w:spacing w:val="-2"/>
+          <w:sz w:val="20"/>
+          <w:szCs w:val="20"/>
+        </w:rPr>
+        <w:t xml:space="preserve">Three </w:t>
+      </w:r>
+      <w:proofErr w:type="spellStart"/>
+      <w:r>
+        <w:rPr>
+          <w:color w:val="1B033C"/>
+          <w:spacing w:val="-2"/>
+          <w:sz w:val="20"/>
+          <w:szCs w:val="20"/>
+        </w:rPr>
+        <w:t>js</w:t>
+      </w:r>
+      <w:proofErr w:type="spellEnd"/>
+      <w:r>
+        <w:rPr>
+          <w:color w:val="1B033C"/>
+          <w:spacing w:val="-2"/>
+          <w:sz w:val="20"/>
+          <w:szCs w:val="20"/>
+        </w:rPr>
+        <w:t xml:space="preserve">, </w:t>
+      </w:r>
+      <w:r>
+        <w:rPr>
+          <w:color w:val="1B033C"/>
+          <w:spacing w:val="-2"/>
+          <w:sz w:val="20"/>
+          <w:szCs w:val="20"/>
+        </w:rPr>
+        <w:t>GSAP</w:t>
       </w:r>
     </w:p>
     <w:p>
@@ -535,10 +598,20 @@
       </w:r>
       <w:r>
         <w:rPr>
+          <w:b/>
+          <w:bCs/>
           <w:color w:val="1B033C"/>
           <w:sz w:val="20"/>
           <w:szCs w:val="20"/>
         </w:rPr>
+        <w:t xml:space="preserve"> &amp; Library</w:t>
+      </w:r>
+      <w:r>
+        <w:rPr>
+          <w:color w:val="1B033C"/>
+          <w:sz w:val="20"/>
+          <w:szCs w:val="20"/>
+        </w:rPr>
         <w:t xml:space="preserve">: </w:t>
       </w:r>
       <w:proofErr w:type="spellStart"/>
@@ -576,6 +649,14 @@
           <w:szCs w:val="20"/>
         </w:rPr>
         <w:t>, Express, React Native</w:t>
+      </w:r>
+      <w:r>
+        <w:rPr>
+          <w:color w:val="1B033C"/>
+          <w:sz w:val="20"/>
+          <w:szCs w:val="20"/>
+        </w:rPr>
+        <w:t>, Nodejs</w:t>
       </w:r>
     </w:p>
     <w:p>
@@ -693,6 +774,7 @@
         </w:rPr>
         <w:t xml:space="preserve"> </w:t>
       </w:r>
+      <w:proofErr w:type="gramStart"/>
       <w:r>
         <w:rPr>
           <w:rFonts w:ascii="Arial" w:hAnsi="Arial"/>
@@ -721,6 +803,7 @@
         </w:rPr>
         <w:t>Branding</w:t>
       </w:r>
+      <w:proofErr w:type="gramEnd"/>
       <w:r>
         <w:rPr>
           <w:rFonts w:ascii="Arial" w:hAnsi="Arial"/>
@@ -731,6 +814,7 @@
         </w:rPr>
         <w:t xml:space="preserve"> </w:t>
       </w:r>
+      <w:proofErr w:type="gramStart"/>
       <w:r>
         <w:rPr>
           <w:rFonts w:ascii="Arial" w:hAnsi="Arial"/>
@@ -759,6 +843,7 @@
         </w:rPr>
         <w:t>)</w:t>
       </w:r>
+      <w:proofErr w:type="gramEnd"/>
       <w:r>
         <w:rPr>
           <w:rFonts w:ascii="Arial" w:hAnsi="Arial"/>
@@ -1088,7 +1173,23 @@
           <w:color w:val="1B033C"/>
           <w:sz w:val="20"/>
         </w:rPr>
-        <w:t>into high-performance, interactive with clients and providing</w:t>
+        <w:t xml:space="preserve">into high-performance, </w:t>
+      </w:r>
+      <w:proofErr w:type="gramStart"/>
+      <w:r>
+        <w:rPr>
+          <w:color w:val="1B033C"/>
+          <w:sz w:val="20"/>
+        </w:rPr>
+        <w:t>interactive</w:t>
+      </w:r>
+      <w:proofErr w:type="gramEnd"/>
+      <w:r>
+        <w:rPr>
+          <w:color w:val="1B033C"/>
+          <w:sz w:val="20"/>
+        </w:rPr>
+        <w:t xml:space="preserve"> with clients and providing</w:t>
       </w:r>
       <w:r>
         <w:rPr>
@@ -1427,6 +1528,7 @@
         <w:t xml:space="preserve">, replacing manual workflows. Acted as a technical mentor for </w:t>
       </w:r>
       <w:proofErr w:type="spellStart"/>
+      <w:proofErr w:type="gramStart"/>
       <w:r>
         <w:rPr>
           <w:color w:val="1B033C"/>
@@ -1435,6 +1537,7 @@
         <w:t>interns,Engineered</w:t>
       </w:r>
       <w:proofErr w:type="spellEnd"/>
+      <w:proofErr w:type="gramEnd"/>
       <w:r>
         <w:rPr>
           <w:color w:val="1B033C"/>
@@ -1929,6 +2032,7 @@
         <w:spacing w:before="113" w:line="252" w:lineRule="auto"/>
         <w:ind w:left="28" w:right="46" w:hanging="15"/>
       </w:pPr>
+      <w:proofErr w:type="gramStart"/>
       <w:r>
         <w:rPr>
           <w:rFonts w:ascii="Arial"/>
@@ -1938,6 +2042,7 @@
         </w:rPr>
         <w:t>Bachelors in Computer Science and Engineering</w:t>
       </w:r>
+      <w:proofErr w:type="gramEnd"/>
       <w:r>
         <w:rPr>
           <w:rFonts w:ascii="Arial"/>
@@ -2093,15 +2198,441 @@
           <w:sz w:val="20"/>
         </w:rPr>
       </w:pPr>
+      <w:r>
+        <w:rPr>
+          <w:b/>
+          <w:bCs/>
+          <w:color w:val="1B033C"/>
+        </w:rPr>
+        <w:t>C</w:t>
+      </w:r>
+      <w:r>
+        <w:rPr>
+          <w:b/>
+          <w:bCs/>
+          <w:color w:val="1B033C"/>
+        </w:rPr>
+        <w:t>razyUl.com</w:t>
+      </w:r>
+      <w:r>
+        <w:rPr>
+          <w:color w:val="1B033C"/>
+        </w:rPr>
+        <w:t>- Figma &amp; Framer Component Library</w:t>
+      </w:r>
+      <w:r>
+        <w:rPr>
+          <w:color w:val="1B033C"/>
+        </w:rPr>
+        <w:t xml:space="preserve"> (2026)</w:t>
+      </w:r>
+      <w:r>
+        <w:rPr>
+          <w:rFonts w:ascii="Arial" w:hAnsi="Arial"/>
+          <w:b/>
+          <w:color w:val="1B033C"/>
+          <w:sz w:val="20"/>
+        </w:rPr>
+        <w:tab/>
+      </w:r>
+      <w:hyperlink r:id="rId10" w:history="1">
+        <w:r>
+          <w:rPr>
+            <w:rStyle w:val="Hyperlink"/>
+            <w:rFonts w:ascii="Arial" w:hAnsi="Arial"/>
+            <w:i/>
+            <w:sz w:val="20"/>
+          </w:rPr>
+          <w:t>Live</w:t>
+        </w:r>
+        <w:r>
+          <w:rPr>
+            <w:rStyle w:val="Hyperlink"/>
+            <w:rFonts w:ascii="Arial" w:hAnsi="Arial"/>
+            <w:i/>
+            <w:spacing w:val="-4"/>
+            <w:sz w:val="20"/>
+          </w:rPr>
+          <w:t xml:space="preserve"> </w:t>
+        </w:r>
+        <w:proofErr w:type="spellStart"/>
+        <w:r>
+          <w:rPr>
+            <w:rStyle w:val="Hyperlink"/>
+            <w:rFonts w:ascii="Arial" w:hAnsi="Arial"/>
+            <w:i/>
+            <w:sz w:val="20"/>
+          </w:rPr>
+          <w:t>Url</w:t>
+        </w:r>
+        <w:proofErr w:type="spellEnd"/>
+      </w:hyperlink>
+      <w:r>
+        <w:rPr>
+          <w:rFonts w:ascii="Arial" w:hAnsi="Arial"/>
+          <w:i/>
+          <w:color w:val="006FBF"/>
+          <w:spacing w:val="-3"/>
+          <w:sz w:val="20"/>
+        </w:rPr>
+        <w:t xml:space="preserve"> </w:t>
+      </w:r>
+    </w:p>
+    <w:p>
+      <w:pPr>
+        <w:pStyle w:val="BodyText"/>
+        <w:spacing w:before="19" w:line="254" w:lineRule="auto"/>
+        <w:ind w:left="434" w:right="43"/>
+        <w:jc w:val="both"/>
+        <w:rPr>
+          <w:color w:val="1B033C"/>
+        </w:rPr>
+      </w:pPr>
+      <w:r>
+        <w:rPr>
+          <w:color w:val="1B033C"/>
+        </w:rPr>
+        <w:t>Reverse-engineered Figma's hidden APIs to enable direct copy-paste of premium UI</w:t>
+      </w:r>
+      <w:r>
+        <w:rPr>
+          <w:color w:val="1B033C"/>
+        </w:rPr>
+        <w:t xml:space="preserve"> </w:t>
+      </w:r>
+      <w:r>
+        <w:rPr>
+          <w:color w:val="1B033C"/>
+        </w:rPr>
+        <w:t>components into Figma-components paste as native</w:t>
+      </w:r>
+      <w:r>
+        <w:rPr>
+          <w:color w:val="1B033C"/>
+        </w:rPr>
+        <w:t xml:space="preserve">. Build </w:t>
+      </w:r>
+      <w:r>
+        <w:rPr>
+          <w:color w:val="1B033C"/>
+        </w:rPr>
+        <w:t>system for payment processing (Dodo Payments) &amp; authentication to replace expensive Framer built-in</w:t>
+      </w:r>
+      <w:r>
+        <w:rPr>
+          <w:color w:val="1B033C"/>
+        </w:rPr>
+        <w:t xml:space="preserve"> </w:t>
+      </w:r>
+      <w:r>
+        <w:rPr>
+          <w:color w:val="1B033C"/>
+        </w:rPr>
+        <w:t>features, reducing hosting/licensing costs significantly.</w:t>
+      </w:r>
+      <w:r>
+        <w:rPr>
+          <w:color w:val="1B033C"/>
+        </w:rPr>
+        <w:t xml:space="preserve"> </w:t>
+      </w:r>
+      <w:r>
+        <w:rPr>
+          <w:color w:val="1B033C"/>
+        </w:rPr>
+        <w:t>10,000+ users on launch day. Sustains daily</w:t>
+      </w:r>
+      <w:r>
+        <w:rPr>
+          <w:color w:val="1B033C"/>
+        </w:rPr>
+        <w:t xml:space="preserve">. </w:t>
+      </w:r>
+      <w:r>
+        <w:rPr>
+          <w:color w:val="1B033C"/>
+        </w:rPr>
+        <w:t>active users &amp; recurring sales.</w:t>
+      </w:r>
+    </w:p>
+    <w:p>
+      <w:pPr>
+        <w:pStyle w:val="BodyText"/>
+        <w:spacing w:before="19" w:line="254" w:lineRule="auto"/>
+        <w:ind w:left="434" w:right="43"/>
+        <w:jc w:val="both"/>
+        <w:rPr>
+          <w:color w:val="1B033C"/>
+        </w:rPr>
+      </w:pPr>
+      <w:r>
+        <w:rPr>
+          <w:b/>
+          <w:bCs/>
+          <w:color w:val="1B033C"/>
+        </w:rPr>
+        <w:t>Tech</w:t>
+      </w:r>
+      <w:r>
+        <w:rPr>
+          <w:b/>
+          <w:bCs/>
+          <w:color w:val="1B033C"/>
+        </w:rPr>
+        <w:t xml:space="preserve"> Stack</w:t>
+      </w:r>
+      <w:r>
+        <w:rPr>
+          <w:color w:val="1B033C"/>
+        </w:rPr>
+        <w:t>: Next.js (payment/auth backend), Figma API, Dodo Payments</w:t>
+      </w:r>
+    </w:p>
+    <w:p>
+      <w:pPr>
+        <w:pStyle w:val="BodyText"/>
+        <w:spacing w:before="19" w:line="254" w:lineRule="auto"/>
+        <w:ind w:left="434" w:right="43"/>
+        <w:jc w:val="both"/>
+      </w:pPr>
+      <w:r>
+        <w:rPr>
+          <w:color w:val="1B033C"/>
+        </w:rPr>
+        <w:t>integration, PostgreSQL, Framer frontend integration.</w:t>
+      </w:r>
+    </w:p>
+    <w:p>
+      <w:pPr>
+        <w:pStyle w:val="BodyText"/>
+        <w:spacing w:before="58"/>
+        <w:ind w:left="434"/>
+        <w:jc w:val="both"/>
+      </w:pPr>
+      <w:r>
+        <w:rPr>
+          <w:rFonts w:ascii="Arial"/>
+          <w:b/>
+          <w:i/>
+          <w:color w:val="1B033C"/>
+        </w:rPr>
+        <w:t>Tech</w:t>
+      </w:r>
+      <w:r>
+        <w:rPr>
+          <w:rFonts w:ascii="Arial"/>
+          <w:b/>
+          <w:i/>
+          <w:color w:val="1B033C"/>
+          <w:spacing w:val="-11"/>
+        </w:rPr>
+        <w:t xml:space="preserve"> </w:t>
+      </w:r>
+      <w:proofErr w:type="gramStart"/>
+      <w:r>
+        <w:rPr>
+          <w:rFonts w:ascii="Arial"/>
+          <w:b/>
+          <w:i/>
+          <w:color w:val="1B033C"/>
+        </w:rPr>
+        <w:t>Stack</w:t>
+      </w:r>
+      <w:r>
+        <w:rPr>
+          <w:rFonts w:ascii="Arial"/>
+          <w:b/>
+          <w:i/>
+          <w:color w:val="1B033C"/>
+          <w:spacing w:val="-11"/>
+        </w:rPr>
+        <w:t xml:space="preserve"> </w:t>
+      </w:r>
+      <w:r>
+        <w:rPr>
+          <w:color w:val="1B033C"/>
+        </w:rPr>
+        <w:t>:</w:t>
+      </w:r>
+      <w:proofErr w:type="gramEnd"/>
+      <w:r>
+        <w:rPr>
+          <w:color w:val="1B033C"/>
+          <w:spacing w:val="-11"/>
+        </w:rPr>
+        <w:t xml:space="preserve"> </w:t>
+      </w:r>
+      <w:r>
+        <w:rPr>
+          <w:color w:val="1B033C"/>
+        </w:rPr>
+        <w:t>React,</w:t>
+      </w:r>
+      <w:r>
+        <w:rPr>
+          <w:color w:val="1B033C"/>
+          <w:spacing w:val="-11"/>
+        </w:rPr>
+        <w:t xml:space="preserve"> </w:t>
+      </w:r>
+      <w:r>
+        <w:rPr>
+          <w:color w:val="1B033C"/>
+        </w:rPr>
+        <w:t>TypeScript,</w:t>
+      </w:r>
+      <w:r>
+        <w:rPr>
+          <w:color w:val="1B033C"/>
+          <w:spacing w:val="-11"/>
+        </w:rPr>
+        <w:t xml:space="preserve"> </w:t>
+      </w:r>
+      <w:r>
+        <w:rPr>
+          <w:color w:val="1B033C"/>
+        </w:rPr>
+        <w:t>Tailwind</w:t>
+      </w:r>
+      <w:r>
+        <w:rPr>
+          <w:color w:val="1B033C"/>
+          <w:spacing w:val="-11"/>
+        </w:rPr>
+        <w:t xml:space="preserve"> </w:t>
+      </w:r>
+      <w:r>
+        <w:rPr>
+          <w:color w:val="1B033C"/>
+        </w:rPr>
+        <w:t>CSS,</w:t>
+      </w:r>
+      <w:r>
+        <w:rPr>
+          <w:color w:val="1B033C"/>
+          <w:spacing w:val="-11"/>
+        </w:rPr>
+        <w:t xml:space="preserve"> </w:t>
+      </w:r>
       <w:proofErr w:type="spellStart"/>
       <w:r>
         <w:rPr>
+          <w:color w:val="1B033C"/>
+        </w:rPr>
+        <w:t>Supabase</w:t>
+      </w:r>
+      <w:proofErr w:type="spellEnd"/>
+      <w:r>
+        <w:rPr>
+          <w:color w:val="1B033C"/>
+        </w:rPr>
+        <w:t>,</w:t>
+      </w:r>
+      <w:r>
+        <w:rPr>
+          <w:color w:val="1B033C"/>
+          <w:spacing w:val="-11"/>
+        </w:rPr>
+        <w:t xml:space="preserve"> </w:t>
+      </w:r>
+      <w:r>
+        <w:rPr>
+          <w:color w:val="1B033C"/>
+        </w:rPr>
+        <w:t>PostgreSQL,</w:t>
+      </w:r>
+      <w:r>
+        <w:rPr>
+          <w:color w:val="1B033C"/>
+          <w:spacing w:val="-11"/>
+        </w:rPr>
+        <w:t xml:space="preserve"> </w:t>
+      </w:r>
+      <w:r>
+        <w:rPr>
+          <w:color w:val="1B033C"/>
+        </w:rPr>
+        <w:t>React</w:t>
+      </w:r>
+      <w:r>
+        <w:rPr>
+          <w:color w:val="1B033C"/>
+          <w:spacing w:val="-11"/>
+        </w:rPr>
+        <w:t xml:space="preserve"> </w:t>
+      </w:r>
+      <w:r>
+        <w:rPr>
+          <w:color w:val="1B033C"/>
+        </w:rPr>
+        <w:t>Query,</w:t>
+      </w:r>
+      <w:r>
+        <w:rPr>
+          <w:color w:val="1B033C"/>
+          <w:spacing w:val="-11"/>
+        </w:rPr>
+        <w:t xml:space="preserve"> </w:t>
+      </w:r>
+      <w:proofErr w:type="spellStart"/>
+      <w:r>
+        <w:rPr>
+          <w:color w:val="1B033C"/>
+        </w:rPr>
+        <w:t>Zustand</w:t>
+      </w:r>
+      <w:proofErr w:type="spellEnd"/>
+      <w:r>
+        <w:rPr>
+          <w:color w:val="1B033C"/>
+        </w:rPr>
+        <w:t>,</w:t>
+      </w:r>
+      <w:r>
+        <w:rPr>
+          <w:color w:val="1B033C"/>
+          <w:spacing w:val="-11"/>
+        </w:rPr>
+        <w:t xml:space="preserve"> </w:t>
+      </w:r>
+      <w:proofErr w:type="spellStart"/>
+      <w:r>
+        <w:rPr>
+          <w:color w:val="1B033C"/>
+          <w:spacing w:val="-2"/>
+        </w:rPr>
+        <w:t>Vercel</w:t>
+      </w:r>
+      <w:proofErr w:type="spellEnd"/>
+    </w:p>
+    <w:p>
+      <w:pPr>
+        <w:pStyle w:val="ListParagraph"/>
+        <w:numPr>
+          <w:ilvl w:val="0"/>
+          <w:numId w:val="1"/>
+        </w:numPr>
+        <w:tabs>
+          <w:tab w:val="left" w:pos="418"/>
+          <w:tab w:val="left" w:pos="2188"/>
+        </w:tabs>
+        <w:spacing w:before="70"/>
+        <w:ind w:left="418" w:hanging="179"/>
+        <w:rPr>
           <w:rFonts w:ascii="Arial" w:hAnsi="Arial"/>
-          <w:b/>
-          <w:color w:val="1B033C"/>
-          <w:sz w:val="20"/>
-        </w:rPr>
-        <w:t>Plingo</w:t>
+          <w:i/>
+          <w:sz w:val="20"/>
+        </w:rPr>
+      </w:pPr>
+      <w:proofErr w:type="spellStart"/>
+      <w:r>
+        <w:rPr>
+          <w:rFonts w:ascii="Arial" w:hAnsi="Arial"/>
+          <w:b/>
+          <w:color w:val="1B033C"/>
+          <w:sz w:val="20"/>
+        </w:rPr>
+        <w:t>Tingy</w:t>
       </w:r>
       <w:proofErr w:type="spellEnd"/>
       <w:r>
@@ -2109,10 +2640,10 @@
           <w:rFonts w:ascii="Arial" w:hAnsi="Arial"/>
           <w:b/>
           <w:color w:val="1B033C"/>
-          <w:spacing w:val="-6"/>
-          <w:sz w:val="20"/>
-        </w:rPr>
-        <w:t xml:space="preserve"> </w:t>
+          <w:spacing w:val="-8"/>
+          <w:sz w:val="20"/>
+        </w:rPr>
+        <w:t xml:space="preserve">- Advanced Image compression </w:t>
       </w:r>
       <w:r>
         <w:rPr>
@@ -2122,7 +2653,7 @@
           <w:spacing w:val="-2"/>
           <w:sz w:val="20"/>
         </w:rPr>
-        <w:t>(2026)</w:t>
+        <w:t>(2025)</w:t>
       </w:r>
       <w:r>
         <w:rPr>
@@ -2131,9 +2662,9 @@
           <w:color w:val="1B033C"/>
           <w:sz w:val="20"/>
         </w:rPr>
-        <w:tab/>
-      </w:r>
-      <w:hyperlink r:id="rId10">
+        <w:t xml:space="preserve">    </w:t>
+      </w:r>
+      <w:hyperlink r:id="rId11">
         <w:proofErr w:type="spellStart"/>
         <w:r>
           <w:rPr>
@@ -2151,7 +2682,7 @@
           <w:rFonts w:ascii="Arial" w:hAnsi="Arial"/>
           <w:i/>
           <w:color w:val="006FBF"/>
-          <w:spacing w:val="-4"/>
+          <w:spacing w:val="-7"/>
           <w:sz w:val="20"/>
         </w:rPr>
         <w:t xml:space="preserve"> </w:t>
@@ -2173,7 +2704,7 @@
         </w:rPr>
         <w:t xml:space="preserve"> </w:t>
       </w:r>
-      <w:hyperlink r:id="rId11">
+      <w:hyperlink r:id="rId12">
         <w:r>
           <w:rPr>
             <w:rFonts w:ascii="Arial" w:hAnsi="Arial"/>
@@ -2210,674 +2741,10 @@
           <w:rFonts w:ascii="Arial" w:hAnsi="Arial"/>
           <w:i/>
           <w:color w:val="006FBF"/>
-          <w:spacing w:val="-3"/>
-          <w:sz w:val="20"/>
-        </w:rPr>
-        <w:t xml:space="preserve"> </w:t>
-      </w:r>
-      <w:r>
-        <w:rPr>
-          <w:rFonts w:ascii="Cambria" w:hAnsi="Cambria"/>
-          <w:color w:val="006FBF"/>
-          <w:sz w:val="20"/>
-        </w:rPr>
-        <w:t>|</w:t>
-      </w:r>
-      <w:r>
-        <w:rPr>
-          <w:rFonts w:ascii="Cambria" w:hAnsi="Cambria"/>
-          <w:color w:val="006FBF"/>
-          <w:spacing w:val="39"/>
-          <w:sz w:val="20"/>
-        </w:rPr>
-        <w:t xml:space="preserve"> </w:t>
-      </w:r>
-      <w:r>
-        <w:rPr>
-          <w:rFonts w:ascii="Arial" w:hAnsi="Arial"/>
-          <w:i/>
-          <w:color w:val="006FBF"/>
-          <w:spacing w:val="-2"/>
-          <w:sz w:val="20"/>
-        </w:rPr>
-        <w:t>Walkthrough</w:t>
-      </w:r>
-    </w:p>
-    <w:p>
-      <w:pPr>
-        <w:pStyle w:val="BodyText"/>
-        <w:spacing w:before="19" w:line="254" w:lineRule="auto"/>
-        <w:ind w:left="434" w:right="43"/>
-        <w:jc w:val="both"/>
-      </w:pPr>
-      <w:r>
-        <w:rPr>
-          <w:color w:val="1B033C"/>
-        </w:rPr>
-        <w:t xml:space="preserve">Engineered a scalable social media orchestration platform for scheduling and content distribution across multiple channels (Twitter, LinkedIn, Threads). The application features a rich-text "Content Studio", a drag-and-drop bulk scheduler with </w:t>
-      </w:r>
-      <w:proofErr w:type="spellStart"/>
-      <w:r>
-        <w:rPr>
-          <w:color w:val="1B033C"/>
-        </w:rPr>
-        <w:t>timezone</w:t>
-      </w:r>
-      <w:proofErr w:type="spellEnd"/>
-      <w:r>
-        <w:rPr>
-          <w:color w:val="1B033C"/>
-        </w:rPr>
-        <w:t xml:space="preserve"> precision, and granular Admin/User RBAC. using </w:t>
-      </w:r>
-      <w:proofErr w:type="spellStart"/>
-      <w:r>
-        <w:rPr>
-          <w:color w:val="1B033C"/>
-        </w:rPr>
-        <w:t>Supabase</w:t>
-      </w:r>
-      <w:proofErr w:type="spellEnd"/>
-      <w:r>
-        <w:rPr>
-          <w:color w:val="1B033C"/>
-        </w:rPr>
-        <w:t xml:space="preserve"> Edge Functions for complex backend logic and secured via Row Level Security (RLS) with Trained Ai content writer bot</w:t>
-      </w:r>
-    </w:p>
-    <w:p>
-      <w:pPr>
-        <w:pStyle w:val="BodyText"/>
-        <w:spacing w:before="58"/>
-        <w:ind w:left="434"/>
-        <w:jc w:val="both"/>
-      </w:pPr>
-      <w:r>
-        <w:rPr>
-          <w:rFonts w:ascii="Arial"/>
-          <w:b/>
-          <w:i/>
-          <w:color w:val="1B033C"/>
-        </w:rPr>
-        <w:t>Tech</w:t>
-      </w:r>
-      <w:r>
-        <w:rPr>
-          <w:rFonts w:ascii="Arial"/>
-          <w:b/>
-          <w:i/>
-          <w:color w:val="1B033C"/>
-          <w:spacing w:val="-11"/>
-        </w:rPr>
-        <w:t xml:space="preserve"> </w:t>
-      </w:r>
-      <w:r>
-        <w:rPr>
-          <w:rFonts w:ascii="Arial"/>
-          <w:b/>
-          <w:i/>
-          <w:color w:val="1B033C"/>
-        </w:rPr>
-        <w:t>Stack</w:t>
-      </w:r>
-      <w:r>
-        <w:rPr>
-          <w:rFonts w:ascii="Arial"/>
-          <w:b/>
-          <w:i/>
-          <w:color w:val="1B033C"/>
-          <w:spacing w:val="-11"/>
-        </w:rPr>
-        <w:t xml:space="preserve"> </w:t>
-      </w:r>
-      <w:r>
-        <w:rPr>
-          <w:color w:val="1B033C"/>
-        </w:rPr>
-        <w:t>:</w:t>
-      </w:r>
-      <w:r>
-        <w:rPr>
-          <w:color w:val="1B033C"/>
-          <w:spacing w:val="-11"/>
-        </w:rPr>
-        <w:t xml:space="preserve"> </w:t>
-      </w:r>
-      <w:r>
-        <w:rPr>
-          <w:color w:val="1B033C"/>
-        </w:rPr>
-        <w:t>React,</w:t>
-      </w:r>
-      <w:r>
-        <w:rPr>
-          <w:color w:val="1B033C"/>
-          <w:spacing w:val="-11"/>
-        </w:rPr>
-        <w:t xml:space="preserve"> </w:t>
-      </w:r>
-      <w:r>
-        <w:rPr>
-          <w:color w:val="1B033C"/>
-        </w:rPr>
-        <w:t>TypeScript,</w:t>
-      </w:r>
-      <w:r>
-        <w:rPr>
-          <w:color w:val="1B033C"/>
-          <w:spacing w:val="-11"/>
-        </w:rPr>
-        <w:t xml:space="preserve"> </w:t>
-      </w:r>
-      <w:r>
-        <w:rPr>
-          <w:color w:val="1B033C"/>
-        </w:rPr>
-        <w:t>Tailwind</w:t>
-      </w:r>
-      <w:r>
-        <w:rPr>
-          <w:color w:val="1B033C"/>
-          <w:spacing w:val="-11"/>
-        </w:rPr>
-        <w:t xml:space="preserve"> </w:t>
-      </w:r>
-      <w:r>
-        <w:rPr>
-          <w:color w:val="1B033C"/>
-        </w:rPr>
-        <w:t>CSS,</w:t>
-      </w:r>
-      <w:r>
-        <w:rPr>
-          <w:color w:val="1B033C"/>
-          <w:spacing w:val="-11"/>
-        </w:rPr>
-        <w:t xml:space="preserve"> </w:t>
-      </w:r>
-      <w:proofErr w:type="spellStart"/>
-      <w:r>
-        <w:rPr>
-          <w:color w:val="1B033C"/>
-        </w:rPr>
-        <w:t>Supabase</w:t>
-      </w:r>
-      <w:proofErr w:type="spellEnd"/>
-      <w:r>
-        <w:rPr>
-          <w:color w:val="1B033C"/>
-        </w:rPr>
-        <w:t>,</w:t>
-      </w:r>
-      <w:r>
-        <w:rPr>
-          <w:color w:val="1B033C"/>
-          <w:spacing w:val="-11"/>
-        </w:rPr>
-        <w:t xml:space="preserve"> </w:t>
-      </w:r>
-      <w:r>
-        <w:rPr>
-          <w:color w:val="1B033C"/>
-        </w:rPr>
-        <w:t>PostgreSQL,</w:t>
-      </w:r>
-      <w:r>
-        <w:rPr>
-          <w:color w:val="1B033C"/>
-          <w:spacing w:val="-11"/>
-        </w:rPr>
-        <w:t xml:space="preserve"> </w:t>
-      </w:r>
-      <w:r>
-        <w:rPr>
-          <w:color w:val="1B033C"/>
-        </w:rPr>
-        <w:t>React</w:t>
-      </w:r>
-      <w:r>
-        <w:rPr>
-          <w:color w:val="1B033C"/>
-          <w:spacing w:val="-11"/>
-        </w:rPr>
-        <w:t xml:space="preserve"> </w:t>
-      </w:r>
-      <w:r>
-        <w:rPr>
-          <w:color w:val="1B033C"/>
-        </w:rPr>
-        <w:t>Query,</w:t>
-      </w:r>
-      <w:r>
-        <w:rPr>
-          <w:color w:val="1B033C"/>
-          <w:spacing w:val="-11"/>
-        </w:rPr>
-        <w:t xml:space="preserve"> </w:t>
-      </w:r>
-      <w:proofErr w:type="spellStart"/>
-      <w:r>
-        <w:rPr>
-          <w:color w:val="1B033C"/>
-        </w:rPr>
-        <w:t>Zustand</w:t>
-      </w:r>
-      <w:proofErr w:type="spellEnd"/>
-      <w:r>
-        <w:rPr>
-          <w:color w:val="1B033C"/>
-        </w:rPr>
-        <w:t>,</w:t>
-      </w:r>
-      <w:r>
-        <w:rPr>
-          <w:color w:val="1B033C"/>
-          <w:spacing w:val="-11"/>
-        </w:rPr>
-        <w:t xml:space="preserve"> </w:t>
-      </w:r>
-      <w:proofErr w:type="spellStart"/>
-      <w:r>
-        <w:rPr>
-          <w:color w:val="1B033C"/>
-          <w:spacing w:val="-2"/>
-        </w:rPr>
-        <w:t>Vercel</w:t>
-      </w:r>
-      <w:proofErr w:type="spellEnd"/>
-    </w:p>
-    <w:p>
-      <w:pPr>
-        <w:pStyle w:val="ListParagraph"/>
-        <w:numPr>
-          <w:ilvl w:val="0"/>
-          <w:numId w:val="1"/>
-        </w:numPr>
-        <w:tabs>
-          <w:tab w:val="left" w:pos="418"/>
-          <w:tab w:val="left" w:pos="2188"/>
-        </w:tabs>
-        <w:spacing w:before="70"/>
-        <w:ind w:left="418" w:hanging="179"/>
-        <w:rPr>
-          <w:rFonts w:ascii="Arial" w:hAnsi="Arial"/>
-          <w:i/>
-          <w:sz w:val="20"/>
-        </w:rPr>
-      </w:pPr>
-      <w:proofErr w:type="spellStart"/>
-      <w:r>
-        <w:rPr>
-          <w:rFonts w:ascii="Arial" w:hAnsi="Arial"/>
-          <w:b/>
-          <w:color w:val="1B033C"/>
-          <w:sz w:val="20"/>
-        </w:rPr>
-        <w:t>Tingy</w:t>
-      </w:r>
-      <w:proofErr w:type="spellEnd"/>
-      <w:r>
-        <w:rPr>
-          <w:rFonts w:ascii="Arial" w:hAnsi="Arial"/>
-          <w:b/>
-          <w:color w:val="1B033C"/>
-          <w:spacing w:val="-8"/>
-          <w:sz w:val="20"/>
-        </w:rPr>
-        <w:t xml:space="preserve"> </w:t>
-      </w:r>
-      <w:r>
-        <w:rPr>
-          <w:rFonts w:ascii="Arial" w:hAnsi="Arial"/>
-          <w:b/>
-          <w:color w:val="1B033C"/>
-          <w:spacing w:val="-2"/>
-          <w:sz w:val="20"/>
-        </w:rPr>
-        <w:t>(2025)</w:t>
-      </w:r>
-      <w:r>
-        <w:rPr>
-          <w:rFonts w:ascii="Arial" w:hAnsi="Arial"/>
-          <w:b/>
-          <w:color w:val="1B033C"/>
-          <w:sz w:val="20"/>
-        </w:rPr>
-        <w:tab/>
-      </w:r>
-      <w:hyperlink r:id="rId12">
-        <w:proofErr w:type="spellStart"/>
-        <w:r>
-          <w:rPr>
-            <w:rFonts w:ascii="Arial" w:hAnsi="Arial"/>
-            <w:i/>
-            <w:color w:val="006FBF"/>
-            <w:sz w:val="20"/>
-          </w:rPr>
-          <w:t>OpenSource</w:t>
-        </w:r>
-        <w:proofErr w:type="spellEnd"/>
-      </w:hyperlink>
-      <w:r>
-        <w:rPr>
-          <w:rFonts w:ascii="Arial" w:hAnsi="Arial"/>
-          <w:i/>
-          <w:color w:val="006FBF"/>
-          <w:spacing w:val="-7"/>
-          <w:sz w:val="20"/>
-        </w:rPr>
-        <w:t xml:space="preserve"> </w:t>
-      </w:r>
-      <w:r>
-        <w:rPr>
-          <w:rFonts w:ascii="Cambria" w:hAnsi="Cambria"/>
-          <w:color w:val="006FBF"/>
-          <w:sz w:val="20"/>
-        </w:rPr>
-        <w:t>|</w:t>
-      </w:r>
-      <w:r>
-        <w:rPr>
-          <w:rFonts w:ascii="Cambria" w:hAnsi="Cambria"/>
-          <w:color w:val="006FBF"/>
-          <w:spacing w:val="-3"/>
-          <w:sz w:val="20"/>
-        </w:rPr>
-        <w:t xml:space="preserve"> </w:t>
-      </w:r>
-      <w:hyperlink r:id="rId13">
-        <w:r>
-          <w:rPr>
-            <w:rFonts w:ascii="Arial" w:hAnsi="Arial"/>
-            <w:i/>
-            <w:color w:val="006FBF"/>
-            <w:sz w:val="20"/>
-          </w:rPr>
-          <w:t>Live</w:t>
-        </w:r>
-        <w:r>
-          <w:rPr>
-            <w:rFonts w:ascii="Arial" w:hAnsi="Arial"/>
-            <w:i/>
-            <w:color w:val="006FBF"/>
-            <w:spacing w:val="-4"/>
-            <w:sz w:val="20"/>
-          </w:rPr>
-          <w:t xml:space="preserve"> </w:t>
-        </w:r>
-        <w:proofErr w:type="spellStart"/>
-        <w:r>
-          <w:rPr>
-            <w:rFonts w:ascii="Arial" w:hAnsi="Arial"/>
-            <w:i/>
-            <w:color w:val="006FBF"/>
-            <w:sz w:val="20"/>
-          </w:rPr>
-          <w:t>Url</w:t>
-        </w:r>
-        <w:proofErr w:type="spellEnd"/>
-      </w:hyperlink>
-      <w:r>
-        <w:rPr>
-          <w:rFonts w:ascii="Arial" w:hAnsi="Arial"/>
-          <w:i/>
-          <w:color w:val="006FBF"/>
           <w:spacing w:val="-4"/>
           <w:sz w:val="20"/>
         </w:rPr>
         <w:t xml:space="preserve"> </w:t>
-      </w:r>
-      <w:r>
-        <w:rPr>
-          <w:rFonts w:ascii="Cambria" w:hAnsi="Cambria"/>
-          <w:color w:val="006FBF"/>
-          <w:sz w:val="20"/>
-        </w:rPr>
-        <w:t>|</w:t>
-      </w:r>
-      <w:r>
-        <w:rPr>
-          <w:rFonts w:ascii="Cambria" w:hAnsi="Cambria"/>
-          <w:color w:val="006FBF"/>
-          <w:spacing w:val="-3"/>
-          <w:sz w:val="20"/>
-        </w:rPr>
-        <w:t xml:space="preserve"> </w:t>
-      </w:r>
-      <w:r>
-        <w:rPr>
-          <w:rFonts w:ascii="Arial" w:hAnsi="Arial"/>
-          <w:i/>
-          <w:color w:val="006FBF"/>
-          <w:spacing w:val="-2"/>
-          <w:sz w:val="20"/>
-        </w:rPr>
-        <w:t>Walkthrough</w:t>
-      </w:r>
-    </w:p>
-    <w:p>
-      <w:pPr>
-        <w:pStyle w:val="BodyText"/>
-        <w:spacing w:before="19" w:line="249" w:lineRule="auto"/>
-        <w:ind w:left="434"/>
-      </w:pPr>
-      <w:r>
-        <w:rPr>
-          <w:color w:val="1B033C"/>
-        </w:rPr>
-        <w:t>Developed</w:t>
-      </w:r>
-      <w:r>
-        <w:rPr>
-          <w:color w:val="1B033C"/>
-          <w:spacing w:val="-10"/>
-        </w:rPr>
-        <w:t xml:space="preserve"> </w:t>
-      </w:r>
-      <w:r>
-        <w:rPr>
-          <w:color w:val="1B033C"/>
-        </w:rPr>
-        <w:t>a</w:t>
-      </w:r>
-      <w:r>
-        <w:rPr>
-          <w:color w:val="1B033C"/>
-          <w:spacing w:val="-10"/>
-        </w:rPr>
-        <w:t xml:space="preserve"> </w:t>
-      </w:r>
-      <w:r>
-        <w:rPr>
-          <w:color w:val="1B033C"/>
-        </w:rPr>
-        <w:t>high-performance,</w:t>
-      </w:r>
-      <w:r>
-        <w:rPr>
-          <w:color w:val="1B033C"/>
-          <w:spacing w:val="-10"/>
-        </w:rPr>
-        <w:t xml:space="preserve"> </w:t>
-      </w:r>
-      <w:r>
-        <w:rPr>
-          <w:color w:val="1B033C"/>
-        </w:rPr>
-        <w:t>privacy-focused</w:t>
-      </w:r>
-      <w:r>
-        <w:rPr>
-          <w:color w:val="1B033C"/>
-          <w:spacing w:val="-10"/>
-        </w:rPr>
-        <w:t xml:space="preserve"> </w:t>
-      </w:r>
-      <w:r>
-        <w:rPr>
-          <w:color w:val="1B033C"/>
-        </w:rPr>
-        <w:t>image</w:t>
-      </w:r>
-      <w:r>
-        <w:rPr>
-          <w:color w:val="1B033C"/>
-          <w:spacing w:val="-10"/>
-        </w:rPr>
-        <w:t xml:space="preserve"> </w:t>
-      </w:r>
-      <w:r>
-        <w:rPr>
-          <w:color w:val="1B033C"/>
-        </w:rPr>
-        <w:t>compression</w:t>
-      </w:r>
-      <w:r>
-        <w:rPr>
-          <w:color w:val="1B033C"/>
-          <w:spacing w:val="-10"/>
-        </w:rPr>
-        <w:t xml:space="preserve"> </w:t>
-      </w:r>
-      <w:r>
-        <w:rPr>
-          <w:color w:val="1B033C"/>
-        </w:rPr>
-        <w:t>tool</w:t>
-      </w:r>
-      <w:r>
-        <w:rPr>
-          <w:color w:val="1B033C"/>
-          <w:spacing w:val="-10"/>
-        </w:rPr>
-        <w:t xml:space="preserve"> </w:t>
-      </w:r>
-      <w:r>
-        <w:rPr>
-          <w:color w:val="1B033C"/>
-        </w:rPr>
-        <w:t>capable</w:t>
-      </w:r>
-      <w:r>
-        <w:rPr>
-          <w:color w:val="1B033C"/>
-          <w:spacing w:val="-10"/>
-        </w:rPr>
-        <w:t xml:space="preserve"> </w:t>
-      </w:r>
-      <w:r>
-        <w:rPr>
-          <w:color w:val="1B033C"/>
-        </w:rPr>
-        <w:t>of</w:t>
-      </w:r>
-      <w:r>
-        <w:rPr>
-          <w:color w:val="1B033C"/>
-          <w:spacing w:val="-10"/>
-        </w:rPr>
-        <w:t xml:space="preserve"> </w:t>
-      </w:r>
-      <w:r>
-        <w:rPr>
-          <w:color w:val="1B033C"/>
-        </w:rPr>
-        <w:t>optimizing</w:t>
-      </w:r>
-      <w:r>
-        <w:rPr>
-          <w:color w:val="1B033C"/>
-          <w:spacing w:val="-10"/>
-        </w:rPr>
-        <w:t xml:space="preserve"> </w:t>
-      </w:r>
-      <w:r>
-        <w:rPr>
-          <w:color w:val="1B033C"/>
-        </w:rPr>
-        <w:t>images</w:t>
-      </w:r>
-      <w:r>
-        <w:rPr>
-          <w:color w:val="1B033C"/>
-          <w:spacing w:val="-10"/>
-        </w:rPr>
-        <w:t xml:space="preserve"> </w:t>
-      </w:r>
-      <w:r>
-        <w:rPr>
-          <w:color w:val="1B033C"/>
-        </w:rPr>
-        <w:t>(</w:t>
-      </w:r>
-      <w:proofErr w:type="spellStart"/>
-      <w:r>
-        <w:rPr>
-          <w:color w:val="1B033C"/>
-        </w:rPr>
-        <w:t>WebP</w:t>
-      </w:r>
-      <w:proofErr w:type="spellEnd"/>
-      <w:r>
-        <w:rPr>
-          <w:color w:val="1B033C"/>
-        </w:rPr>
-        <w:t>,</w:t>
-      </w:r>
-      <w:r>
-        <w:rPr>
-          <w:color w:val="1B033C"/>
-          <w:spacing w:val="-10"/>
-        </w:rPr>
-        <w:t xml:space="preserve"> </w:t>
-      </w:r>
-      <w:r>
-        <w:rPr>
-          <w:color w:val="1B033C"/>
-        </w:rPr>
-        <w:t xml:space="preserve">AVIF, JPG) by up to 90% without quality loss. Engineered a robust server-side compression system using </w:t>
-      </w:r>
-      <w:r>
-        <w:rPr>
-          <w:rFonts w:ascii="Arial"/>
-          <w:b/>
-          <w:color w:val="1B033C"/>
-        </w:rPr>
-        <w:t xml:space="preserve">Next.js API Routes </w:t>
-      </w:r>
-      <w:r>
-        <w:rPr>
-          <w:color w:val="1B033C"/>
-        </w:rPr>
-        <w:t xml:space="preserve">and </w:t>
-      </w:r>
-      <w:r>
-        <w:rPr>
-          <w:rFonts w:ascii="Arial"/>
-          <w:b/>
-          <w:color w:val="1B033C"/>
-        </w:rPr>
-        <w:t>Sharp</w:t>
-      </w:r>
-      <w:r>
-        <w:rPr>
-          <w:color w:val="1B033C"/>
-        </w:rPr>
-        <w:t xml:space="preserve">, utilizing binary search algorithms to hit precise target file sizes. </w:t>
-      </w:r>
-      <w:r>
-        <w:rPr>
-          <w:rFonts w:ascii="Arial"/>
-          <w:b/>
-          <w:color w:val="1B033C"/>
-        </w:rPr>
-        <w:t xml:space="preserve">UI/UX: </w:t>
-      </w:r>
-      <w:r>
-        <w:rPr>
-          <w:color w:val="1B033C"/>
-        </w:rPr>
-        <w:t>Built a responsive,</w:t>
       </w:r>
     </w:p>
     <w:p>
@@ -2890,34 +2757,7 @@
         <w:rPr>
           <w:color w:val="1B033C"/>
         </w:rPr>
-        <w:t>drag-and-drop</w:t>
-      </w:r>
-      <w:r>
-        <w:rPr>
-          <w:color w:val="1B033C"/>
-          <w:spacing w:val="-11"/>
-        </w:rPr>
-        <w:t xml:space="preserve"> </w:t>
-      </w:r>
-      <w:r>
-        <w:rPr>
-          <w:color w:val="1B033C"/>
-        </w:rPr>
-        <w:t>interface</w:t>
-      </w:r>
-      <w:r>
-        <w:rPr>
-          <w:color w:val="1B033C"/>
-          <w:spacing w:val="-11"/>
-        </w:rPr>
-        <w:t xml:space="preserve"> </w:t>
-      </w:r>
-      <w:r>
-        <w:rPr>
-          <w:color w:val="1B033C"/>
-          <w:spacing w:val="-10"/>
-        </w:rPr>
-        <w:t>.</w:t>
+        <w:t>Built a privacy-first image compression tool that reduces image size by up to 99% (e.g. 9MB → 90KB) with near-zero visible quality loss. Solved manual optimization by letting users upload, set target KB size, and download instantly. Engineered a precise server-side compression engine using Next.js API Routes, Sharp, and binary search algorithms. Designed a responsive drag-and-drop UI to improve speed and usability.</w:t>
       </w:r>
     </w:p>
     <w:p>
@@ -2945,6 +2785,7 @@
         </w:rPr>
         <w:t xml:space="preserve"> </w:t>
       </w:r>
+      <w:proofErr w:type="gramStart"/>
       <w:r>
         <w:rPr>
           <w:rFonts w:ascii="Arial"/>
@@ -2970,6 +2811,7 @@
         </w:rPr>
         <w:t>:</w:t>
       </w:r>
+      <w:proofErr w:type="gramEnd"/>
       <w:r>
         <w:rPr>
           <w:color w:val="1B033C"/>
@@ -3703,7 +3545,6 @@
   <w:style w:type="character" w:default="1" w:styleId="DefaultParagraphFont">
     <w:name w:val="Default Paragraph Font"/>
     <w:uiPriority w:val="1"/>
-    <w:semiHidden/>
     <w:unhideWhenUsed/>
   </w:style>
   <w:style w:type="table" w:default="1" w:styleId="TableNormal">

</xml_diff>